<commit_message>
AI-Agent: 修改 vscode-extension/src/claudeMd.ts 之前
</commit_message>
<xml_diff>
--- a/ai-code-agent_code_export.docx
+++ b/ai-code-agent_code_export.docx
@@ -32,7 +32,7 @@
           <w:color w:val="646464"/>
           <w:sz w:val="20"/>
         </w:rPr>
-        <w:t>Exported: 2026-03-26 13:22:35</w:t>
+        <w:t>Exported: 2026-03-26 16:22:27</w:t>
       </w:r>
     </w:p>
     <w:p>
@@ -121,7 +121,7 @@
           <w:color w:val="828282"/>
           <w:sz w:val="16"/>
         </w:rPr>
-        <w:t xml:space="preserve">  (6,671 bytes)</w:t>
+        <w:t xml:space="preserve">  (8,933 bytes)</w:t>
       </w:r>
     </w:p>
     <w:p>
@@ -240,7 +240,7 @@
           <w:color w:val="828282"/>
           <w:sz w:val="16"/>
         </w:rPr>
-        <w:t xml:space="preserve">  (28,997 bytes)</w:t>
+        <w:t xml:space="preserve">  (29,780 bytes)</w:t>
       </w:r>
     </w:p>
     <w:p>
@@ -291,7 +291,7 @@
           <w:color w:val="828282"/>
           <w:sz w:val="16"/>
         </w:rPr>
-        <w:t xml:space="preserve">  (13,386 bytes)</w:t>
+        <w:t xml:space="preserve">  (11,326 bytes)</w:t>
       </w:r>
     </w:p>
     <w:p>
@@ -308,7 +308,7 @@
           <w:color w:val="828282"/>
           <w:sz w:val="16"/>
         </w:rPr>
-        <w:t xml:space="preserve">  (27,466 bytes)</w:t>
+        <w:t xml:space="preserve">  (20,435 bytes)</w:t>
       </w:r>
     </w:p>
     <w:p>
@@ -851,7 +851,7 @@
           <w:color w:val="828282"/>
           <w:sz w:val="16"/>
         </w:rPr>
-        <w:t>Markdown  |  173 lines  |  6,671 bytes</w:t>
+        <w:t>Markdown  |  279 lines  |  8,933 bytes</w:t>
       </w:r>
     </w:p>
     <w:p>
@@ -867,55 +867,53 @@
         <w:t># ⚡ AI Code Agent</w:t>
         <w:br/>
         <w:br/>
-        <w:t>**将任意网页端 AI（ChatGPT、Claude、Gemini、DeepSeek、Kimi...）的代码回答一键应用到本地 VS Code**</w:t>
-        <w:br/>
-        <w:br/>
-        <w:t>不需要 API Key，不绑定任何 AI 服务，完全免费开源。</w:t>
-        <w:br/>
-        <w:br/>
-        <w:t>![status](https://img.shields.io/badge/状态-可用-brightgreen) ![version](https://img.shields.io/badge/版本-1.2.0-blue) ![license](https://img.shields.io/badge/协议-MIT-green)</w:t>
-        <w:br/>
-        <w:br/>
-        <w:t>## ✨ 核心功能</w:t>
-        <w:br/>
-        <w:br/>
-        <w:t>| 功能 | 说明 |</w:t>
-        <w:br/>
-        <w:t>|------|------|</w:t>
-        <w:br/>
-        <w:t>| 🔍 自动检测 | 自动识别 AI 回答中的代码操作指令，显示「应用」按钮 |</w:t>
-        <w:br/>
-        <w:t>| ⚡ 一键应用 | 点击按钮直接创建/修改/删除本地文件 |</w:t>
-        <w:br/>
-        <w:t>| 🔄 Diff 预览 | 修改前在 VS Code 中预览差异，支持「全部接受/全部拒绝」 |</w:t>
-        <w:br/>
-        <w:t>| 🩹 Patch 模式 | 大文件只修改需要的部分，不用替换整个文件 |</w:t>
-        <w:br/>
-        <w:t>| 🛡 安全防护 | 敏感文件拦截 + AI 偷懒检测 + Git 自动快照 |</w:t>
-        <w:br/>
-        <w:t>| ↩️ 一键撤销 | 通过 Git 回退上一次 AI 修改 |</w:t>
-        <w:br/>
-        <w:t>| 🔗 双向通信 | 从 VS Code 发送文件/选中代码/错误信息到浏览器 AI |</w:t>
-        <w:br/>
-        <w:t>| 🔌 总开关 | 一键开关插件，关闭后清除所有页面注入 |</w:t>
-        <w:br/>
-        <w:t>| 📋 一键提示词 | 新用户一键复制 AI 提示词，开箱即用 |</w:t>
-        <w:br/>
-        <w:t>| 🚀 自动跳转 | 发送代码后自动切换到 VS Code 窗口 |</w:t>
-        <w:br/>
-        <w:t>| 🪟 多窗口支持 | 自动寻找可用端口，同时开多个项目不冲突 |</w:t>
-        <w:br/>
-        <w:t>| 🧹 智能过滤 | 终端命令、步骤说明等非代码内容不显示发送按钮 |</w:t>
-        <w:br/>
-        <w:br/>
-        <w:t>## 🆕 v1.2.0 更新内容</w:t>
-        <w:br/>
-        <w:br/>
-        <w:t>### 性能优化</w:t>
-        <w:br/>
-        <w:t>- **MutationObserver 智能过滤**：仅在页面新增 `&lt;pre&gt;`/`&lt;code&gt;` 节点时触发扫描，减少 90%+ 无效扫描</w:t>
-        <w:br/>
-        <w:t>- **端口扫描缓存**：30 秒内复用已发现的服务器地址，避免每次操作都扫描 10 个端口</w:t>
+        <w:t>**一句话介绍：** 在任意 AI 网页聊天中生成的代码，一键应用到你的本地项目。</w:t>
+        <w:br/>
+        <w:br/>
+        <w:t>&gt; 不需要 API Key，不绑定任何 AI 服务商，完全免费开源。</w:t>
+        <w:br/>
+        <w:t>&gt; 支持 ChatGPT、Claude、Gemini、DeepSeek、Kimi、通义千问等所有网页端 AI。</w:t>
+        <w:br/>
+        <w:br/>
+        <w:t>![version](https://img.shields.io/badge/版本-1.3.0-blue)</w:t>
+        <w:br/>
+        <w:t>![license](https://img.shields.io/badge/协议-MIT-green)</w:t>
+        <w:br/>
+        <w:br/>
+        <w:t>---</w:t>
+        <w:br/>
+        <w:br/>
+        <w:t>## 🎬 30 秒了解它能做什么</w:t>
+        <w:br/>
+        <w:br/>
+        <w:t>```</w:t>
+        <w:br/>
+        <w:t>你在浏览器里问 AI："帮我写一个登录页面"</w:t>
+        <w:br/>
+        <w:t xml:space="preserve">          ↓</w:t>
+        <w:br/>
+        <w:t>AI 回复了代码</w:t>
+        <w:br/>
+        <w:t xml:space="preserve">          ↓</w:t>
+        <w:br/>
+        <w:t>代码旁边自动出现 ⚡ 按钮</w:t>
+        <w:br/>
+        <w:t xml:space="preserve">          ↓</w:t>
+        <w:br/>
+        <w:t>点一下 → VS Code 弹出 Diff 预览</w:t>
+        <w:br/>
+        <w:t xml:space="preserve">          ↓</w:t>
+        <w:br/>
+        <w:t>确认 → 文件自动创建/修改完成</w:t>
+        <w:br/>
+        <w:t>```</w:t>
+        <w:br/>
+        <w:br/>
+        <w:t>**不用手动复制粘贴，不用手动创建文件，不用手动找到该改哪一行。**</w:t>
+        <w:br/>
+        <w:br/>
+        <w:t>---</w:t>
+        <w:br/>
       </w:r>
     </w:p>
     <w:p>
@@ -928,37 +926,10 @@
           <w:color w:val="282828"/>
           <w:sz w:val="15"/>
         </w:rPr>
-        <w:t>- **fuzzyFind 行偏移预计算**：大文件 patch 匹配从 O(n²) 降到 O(n)</w:t>
-        <w:br/>
-        <w:t>- **HTTP body Buffer 拼接**：用 Buffer 数组替代字符串拼接，减少内存碎片</w:t>
-        <w:br/>
-        <w:br/>
-        <w:t>### 稳定性提升</w:t>
-        <w:br/>
-        <w:t>- **WebSocket continuation frame 支持**：正确处理浏览器分帧发送的大消息</w:t>
-        <w:br/>
-        <w:t>- **历史文件原子写入**：先写 `.tmp` 再 `rename`，防止崩溃导致文件损坏</w:t>
-        <w:br/>
-        <w:t>- **临时文件自动清理**：启动时清理超过 1 小时的旧 Diff 临时文件</w:t>
-        <w:br/>
-        <w:t>- **AI 偷懒检测修复**：改为逐行+行首锚定检测，不再误报源码中的字符串常量</w:t>
-        <w:br/>
-        <w:br/>
-        <w:t>### 体验改进</w:t>
-        <w:br/>
-        <w:t>- **浮动按钮边界修复**：防止选中文本按钮超出视口底部</w:t>
-        <w:br/>
-        <w:t>- **状态栏实时刷新**：每 5 秒同步 WebSocket 客户端数到 VS Code 状态栏</w:t>
-        <w:br/>
-        <w:t>- **提示词外置管理**：提示词从 `prompt-template.txt` 加载，便于独立维护</w:t>
-        <w:br/>
-        <w:t>- **连接失败自动清缓存**：VS Code 断开后自动清除端口缓存，下次重新扫描</w:t>
-        <w:br/>
-        <w:br/>
-        <w:t>## 🚀 快速开始</w:t>
-        <w:br/>
-        <w:br/>
-        <w:t>### 1. 安装 VS Code 扩展</w:t>
+        <w:t>## 🚀 3 分钟安装</w:t>
+        <w:br/>
+        <w:br/>
+        <w:t>### 第 1 步：安装 VS Code 扩展</w:t>
         <w:br/>
         <w:br/>
         <w:t>```bash</w:t>
@@ -969,16 +940,43 @@
         <w:br/>
         <w:t>npm run compile</w:t>
         <w:br/>
-        <w:t>npx vsce package</w:t>
-        <w:br/>
         <w:t>```</w:t>
         <w:br/>
         <w:br/>
-        <w:t>在 VS Code 中：`Ctrl+Shift+P` → `Install from VSIX` → 选择生成的 `.vsix` 文件</w:t>
-        <w:br/>
-        <w:br/>
-        <w:t>### 2. 安装浏览器扩展</w:t>
-        <w:br/>
+        <w:t>然后双击项目根目录的 `dev.bat`（Windows）即可自动打包安装。</w:t>
+        <w:br/>
+        <w:br/>
+        <w:t>或者手动安装：</w:t>
+        <w:br/>
+        <w:t>```bash</w:t>
+        <w:br/>
+        <w:t>npx vsce package --no-dependencies --allow-missing-repository</w:t>
+        <w:br/>
+        <w:t>```</w:t>
+        <w:br/>
+        <w:t>在 VS Code 中 `Ctrl+Shift+P` → `Install from VSIX` → 选择生成的 `.vsix` 文件。</w:t>
+        <w:br/>
+        <w:br/>
+        <w:t>### 第 2 步：安装浏览器扩展</w:t>
+        <w:br/>
+        <w:br/>
+        <w:t>1. 打开 Edge `edge://extensions/` 或 Chrome `chrome://extensions/`</w:t>
+        <w:br/>
+        <w:t>2. 开启「开发人员模式」</w:t>
+        <w:br/>
+        <w:t>3. 点击「加载解压缩的扩展」</w:t>
+        <w:br/>
+        <w:t>4. 选择项目中的 `edge-extension` 文件夹</w:t>
+        <w:br/>
+        <w:br/>
+        <w:t>### 第 3 步：告诉 AI 用什么格式回复</w:t>
+        <w:br/>
+        <w:br/>
+        <w:t>1. 点击浏览器右上角的 ⚡ 插件图标</w:t>
+        <w:br/>
+        <w:t>2. 点击 **📋 一键复制 AI 提示词**</w:t>
+        <w:br/>
+        <w:t>3. 把提示词粘贴到你和 AI 对话的**第一条消息**中发送</w:t>
       </w:r>
     </w:p>
     <w:p>
@@ -991,56 +989,52 @@
           <w:color w:val="282828"/>
           <w:sz w:val="15"/>
         </w:rPr>
-        <w:t>1. 打开 Edge → `edge://extensions/`（或 Chrome → `chrome://extensions/`）</w:t>
-        <w:br/>
-        <w:t>2. 开启「开发人员模式」</w:t>
-        <w:br/>
-        <w:t>3. 点击「加载解压缩的扩展」</w:t>
-        <w:br/>
-        <w:t>4. 选择 `edge-extension` 文件夹</w:t>
-        <w:br/>
-        <w:br/>
-        <w:t>### 3. 开始使用</w:t>
-        <w:br/>
-        <w:br/>
-        <w:t>1. 打开插件弹窗 → 点击 **📋 一键复制 AI 提示词**</w:t>
-        <w:br/>
-        <w:t>2. 将提示词粘贴到 AI 对话的第一条消息中</w:t>
-        <w:br/>
-        <w:t>3. AI 回复的代码旁会自动出现「⚡ 应用到 VS Code」按钮</w:t>
-        <w:br/>
-        <w:t>4. 点击按钮 → 在 VS Code 中预览 Diff → 确认应用</w:t>
-        <w:br/>
-        <w:br/>
-        <w:t>## 📖 使用场景</w:t>
-        <w:br/>
-        <w:br/>
-        <w:t>### 场景 1：AI 生成新文件</w:t>
-        <w:br/>
-        <w:t>AI 回复包含 `agent-action` 代码块 → 点击「应用」→ 文件自动创建</w:t>
-        <w:br/>
-        <w:br/>
-        <w:t>### 场景 2：AI 修改现有文件</w:t>
-        <w:br/>
-        <w:t>AI 用 `patch` 模式 → 只修改需要的部分 → Diff 预览确认</w:t>
-        <w:br/>
-        <w:br/>
-        <w:t>### 场景 3：发送代码给 AI</w:t>
-        <w:br/>
-        <w:t>在 VS Code 中选中代码 → `Ctrl+Shift+Alt+S` → 代码自动注入浏览器 AI 输入框</w:t>
-        <w:br/>
-        <w:br/>
-        <w:t>### 场景 4：发送错误信息</w:t>
-        <w:br/>
-        <w:t>`Ctrl+Shift+Alt+E` → 粘贴错误信息 → AI 收到后帮你修复</w:t>
-        <w:br/>
-        <w:br/>
-        <w:t>## ⌨️ 快捷键</w:t>
-        <w:br/>
-        <w:br/>
-        <w:t>| 快捷键 | 功能 |</w:t>
-        <w:br/>
-        <w:t>|--------|------|</w:t>
+        <w:t>4. 之后 AI 回复的代码旁边会自动出现 ⚡ 按钮</w:t>
+        <w:br/>
+        <w:br/>
+        <w:t>**就这么简单，可以开始用了。**</w:t>
+        <w:br/>
+        <w:br/>
+        <w:t>---</w:t>
+        <w:br/>
+        <w:br/>
+        <w:t>## 📖 日常使用</w:t>
+        <w:br/>
+        <w:br/>
+        <w:t>### 场景 1：让 AI 帮你写代码</w:t>
+        <w:br/>
+        <w:br/>
+        <w:t>你对 AI 说：*"帮我在 src/utils/ 下创建一个日期格式化工具"*</w:t>
+        <w:br/>
+        <w:br/>
+        <w:t>AI 回复代码 → 代码块右上角出现 **⚡ 应用** 按钮 → 点击 → VS Code 弹出 Diff 预览 → 点「接受」→ 文件自动创建好了。</w:t>
+        <w:br/>
+        <w:br/>
+        <w:t>### 场景 2：让 AI 帮你改 bug</w:t>
+        <w:br/>
+        <w:br/>
+        <w:t>1. 在 VS Code 中选中报错的代码</w:t>
+        <w:br/>
+        <w:t>2. 按 `Ctrl+Shift+Alt+S` → 代码自动发送到浏览器 AI 的输入框</w:t>
+        <w:br/>
+        <w:t>3. AI 给出修复方案 → 点 ⚡ 按钮 → 自动应用</w:t>
+        <w:br/>
+        <w:br/>
+        <w:t>### 场景 3：发送错误信息</w:t>
+        <w:br/>
+        <w:br/>
+        <w:t>按 `Ctrl+Shift+Alt+E` → 粘贴终端错误信息 → AI 输入框自动收到 → AI 帮你修复。</w:t>
+        <w:br/>
+        <w:br/>
+        <w:t>### 场景 4：批量修改多个文件</w:t>
+        <w:br/>
+        <w:br/>
+        <w:t>AI 一次回复中可以包含多个文件的修改，每个代码块旁边都有独立的 ⚡ 按钮。</w:t>
+        <w:br/>
+        <w:t>也可以点「全部接受」一次性应用所有修改。</w:t>
+        <w:br/>
+        <w:br/>
+        <w:t>---</w:t>
       </w:r>
     </w:p>
     <w:p>
@@ -1053,60 +1047,57 @@
           <w:color w:val="282828"/>
           <w:sz w:val="15"/>
         </w:rPr>
-        <w:t>| `Ctrl+Shift+Alt+F` | 发送当前文件到浏览器 AI |</w:t>
-        <w:br/>
-        <w:t>| `Ctrl+Shift+Alt+S` | 发送选中代码到浏览器 AI |</w:t>
-        <w:br/>
-        <w:t>| `Ctrl+Shift+Alt+E` | 发送错误信息到浏览器 AI |</w:t>
-        <w:br/>
-        <w:t>| `Esc` | 关闭浮动发送按钮 |</w:t>
-        <w:br/>
-        <w:br/>
-        <w:t>## 🏗 架构</w:t>
-        <w:br/>
-        <w:br/>
-        <w:t>```</w:t>
-        <w:br/>
-        <w:t>浏览器 AI 网页</w:t>
-        <w:br/>
-        <w:t xml:space="preserve"> │</w:t>
-        <w:br/>
-        <w:t xml:space="preserve"> ├── content.js（自动检测代码块 + 智能过滤 + MutationObserver 优化）</w:t>
-        <w:br/>
-        <w:t xml:space="preserve"> │       │</w:t>
-        <w:br/>
-        <w:t xml:space="preserve"> │       ▼</w:t>
-        <w:br/>
-        <w:t xml:space="preserve"> ├── background.js（消息路由 + 端口探测缓存）</w:t>
-        <w:br/>
-        <w:t xml:space="preserve"> │       │</w:t>
-        <w:br/>
-        <w:t xml:space="preserve"> │       ▼  HTTP + WebSocket</w:t>
-        <w:br/>
-        <w:t xml:space="preserve"> └── VS Code Extension</w:t>
-        <w:br/>
-        <w:t xml:space="preserve">        ├── server.ts（HTTP/WS 服务器 + 自动端口 + continuation frame）</w:t>
-        <w:br/>
-        <w:t xml:space="preserve">        ├── codeApplier.ts（JSON 解析 + Patch 引擎 + 行偏移优化）</w:t>
-        <w:br/>
-        <w:t xml:space="preserve">        ├── diffManager.ts（Diff 预览 + 批量确认 + Git 快照 + 临时文件清理）</w:t>
-        <w:br/>
-        <w:t xml:space="preserve">        └── historyManager.ts（操作历史 + 原子写入）</w:t>
-        <w:br/>
-        <w:t>```</w:t>
-        <w:br/>
-        <w:br/>
-        <w:t>## ⚙️ 配置</w:t>
-        <w:br/>
-        <w:br/>
-        <w:t>在 VS Code 设置中搜索 `AI Code Agent`：</w:t>
-        <w:br/>
-        <w:br/>
-        <w:t>| 设置项 | 默认值 | 说明 |</w:t>
-        <w:br/>
-        <w:t>|--------|--------|------|</w:t>
-        <w:br/>
-        <w:t>| `aiCodeAgent.port` | `9960` | 本地服务器端口 |</w:t>
+        <w:br/>
+        <w:t>## ⌨️ 快捷键</w:t>
+        <w:br/>
+        <w:br/>
+        <w:t>| 快捷键 | 功能 |</w:t>
+        <w:br/>
+        <w:t>|--------|------|</w:t>
+        <w:br/>
+        <w:t>| `Ctrl+Shift+Alt+F` | 发送当前文件给 AI |</w:t>
+        <w:br/>
+        <w:t>| `Ctrl+Shift+Alt+S` | 发送选中代码给 AI |</w:t>
+        <w:br/>
+        <w:t>| `Ctrl+Shift+Alt+E` | 发送错误信息给 AI |</w:t>
+        <w:br/>
+        <w:t>| `Esc` | 关闭浮动按钮 |</w:t>
+        <w:br/>
+        <w:br/>
+        <w:t>---</w:t>
+        <w:br/>
+        <w:br/>
+        <w:t>## 🔌 插件弹窗功能</w:t>
+        <w:br/>
+        <w:br/>
+        <w:t>点击浏览器右上角 ⚡ 图标打开弹窗：</w:t>
+        <w:br/>
+        <w:br/>
+        <w:t>| 区域 | 功能 |</w:t>
+        <w:br/>
+        <w:t>|------|------|</w:t>
+        <w:br/>
+        <w:t>| **顶部状态栏** | 连接状态、端口号、复制提示词、插件开关 |</w:t>
+        <w:br/>
+        <w:t>| **工作区选择器** | 开了多个 VS Code？点击芯片切换目标窗口 |</w:t>
+        <w:br/>
+        <w:t>| **核心按钮** | 扫描页面 / 复制AI回复 / 撤销修改 |</w:t>
+        <w:br/>
+        <w:t>| **最近操作** | 最近 5 条操作结果一目了然 |</w:t>
+        <w:br/>
+        <w:t>| **快捷发送** | 粘贴代码直接发送到 VS Code |</w:t>
+        <w:br/>
+        <w:t>| **导出项目** | 一键将项目代码导出为 Word 文档（可排除文件） |</w:t>
+        <w:br/>
+        <w:t>| **设置** | 自动跳转、自动扫描开关 |</w:t>
+        <w:br/>
+        <w:t>| **项目快捷方式** | 保存常用项目路径，点击在新窗口打开 |</w:t>
+        <w:br/>
+        <w:t>| **工具** | 重启服务器、查看日志、调试信息 |</w:t>
+        <w:br/>
+        <w:br/>
+        <w:t>---</w:t>
+        <w:br/>
       </w:r>
     </w:p>
     <w:p>
@@ -1119,58 +1110,56 @@
           <w:color w:val="282828"/>
           <w:sz w:val="15"/>
         </w:rPr>
-        <w:t>| `aiCodeAgent.autoStart` | `true` | VS Code 启动时自动启动服务器 |</w:t>
-        <w:br/>
-        <w:t>| `aiCodeAgent.requireConfirmation` | `true` | 修改前显示 Diff 预览 |</w:t>
-        <w:br/>
-        <w:t>| `aiCodeAgent.autoGitSnapshot` | `true` | 修改前自动 Git 快照 |</w:t>
-        <w:br/>
-        <w:br/>
         <w:t>## 🛡 安全机制</w:t>
         <w:br/>
         <w:br/>
-        <w:t>- ✅ 所有通信仅限 `127.0.0.1`，不经过外网</w:t>
-        <w:br/>
-        <w:t>- ✅ 修改前 Diff 预览，用户确认后才写入</w:t>
-        <w:br/>
-        <w:t>- ✅ 拦截 `.env`、`.git/`、`.ssh/`、`node_modules/` 等敏感路径</w:t>
-        <w:br/>
-        <w:t>- ✅ 检测 AI 偷懒输出（省略注释行）并警告，逐行锚定不误报</w:t>
-        <w:br/>
-        <w:t>- ✅ 每次修改前自动 Git commit，可一键回退</w:t>
-        <w:br/>
-        <w:t>- ✅ 路径越界检测，防止写入工作区外的文件</w:t>
-        <w:br/>
-        <w:t>- ✅ HTTP body 限制 10MB，WebSocket 缓冲区溢出自动断开</w:t>
-        <w:br/>
-        <w:br/>
-        <w:t>## 🌐 支持的 AI 平台</w:t>
-        <w:br/>
-        <w:br/>
-        <w:t>理论上支持所有网页端 AI，已测试：</w:t>
-        <w:br/>
-        <w:br/>
-        <w:t>- ✅ ChatGPT（chat.openai.com）</w:t>
-        <w:br/>
-        <w:t>- ✅ Claude（claude.ai）</w:t>
-        <w:br/>
-        <w:t>- ✅ Google Gemini</w:t>
-        <w:br/>
-        <w:t>- ✅ DeepSeek</w:t>
-        <w:br/>
-        <w:t>- ✅ Kimi</w:t>
-        <w:br/>
-        <w:t>- ✅ 通义千问</w:t>
-        <w:br/>
-        <w:t>- ✅ 任何能输出 JSON 代码块的 AI</w:t>
-        <w:br/>
-        <w:br/>
-        <w:t>## 📝 更新日志</w:t>
-        <w:br/>
-        <w:br/>
-        <w:t>### v1.2.0</w:t>
-        <w:br/>
-        <w:t>- 性能：MutationObserver 智能过滤、端口缓存、fuzzyFind O(n) 优化</w:t>
+        <w:t>不用担心 AI 乱改你的代码：</w:t>
+        <w:br/>
+        <w:br/>
+        <w:t>- **Diff 预览**：每次修改前都弹出对比，你确认才写入</w:t>
+        <w:br/>
+        <w:t>- **Git 快照**：每次修改前自动 `git commit`，随时可以回退</w:t>
+        <w:br/>
+        <w:t>- **敏感文件拦截**：自动拦截 `.env`、`.git/`、`.ssh/`、`node_modules/` 等</w:t>
+        <w:br/>
+        <w:t>- **AI 偷懒检测**：如果 AI 输出了 `// ... existing code ...` 这种省略写法，会警告你</w:t>
+        <w:br/>
+        <w:t>- **路径越界检测**：防止写入工作区之外的文件</w:t>
+        <w:br/>
+        <w:t>- **纯本地通信**：所有数据只在 `127.0.0.1` 传输，不经过任何外部服务器</w:t>
+        <w:br/>
+        <w:br/>
+        <w:t>---</w:t>
+        <w:br/>
+        <w:br/>
+        <w:t>## 🪟 多窗口支持</w:t>
+        <w:br/>
+        <w:br/>
+        <w:t>同时开了多个 VS Code 项目？没问题：</w:t>
+        <w:br/>
+        <w:br/>
+        <w:t>- 每个 VS Code 窗口自动分配不同端口（9960、9961、9962...）</w:t>
+        <w:br/>
+        <w:t>- 插件弹窗自动发现所有窗口，显示为可点击的芯片</w:t>
+        <w:br/>
+        <w:t>- 点击芯片切换目标窗口，代码发送到正确的项目</w:t>
+        <w:br/>
+        <w:t>- WebSocket 自动重连，切换后立即生效</w:t>
+        <w:br/>
+        <w:br/>
+        <w:t>---</w:t>
+        <w:br/>
+        <w:br/>
+        <w:t>## 🏗 工作原理</w:t>
+        <w:br/>
+        <w:br/>
+        <w:t>```</w:t>
+        <w:br/>
+        <w:t xml:space="preserve">  浏览器（任意 AI 网页）              VS Code</w:t>
+        <w:br/>
+        <w:t xml:space="preserve">  ┌─────────────────────┐          ┌──────────────────────┐</w:t>
+        <w:br/>
+        <w:t xml:space="preserve">  │                     │          │                      │</w:t>
       </w:r>
     </w:p>
     <w:p>
@@ -1183,37 +1172,262 @@
           <w:color w:val="282828"/>
           <w:sz w:val="15"/>
         </w:rPr>
-        <w:t>- 稳定性：WS continuation frame、原子写入、临时文件清理</w:t>
-        <w:br/>
-        <w:t>- 修复：AI 偷懒检测误报、浮动按钮越界</w:t>
-        <w:br/>
-        <w:t>- 体验：状态栏实时刷新、提示词外置</w:t>
+        <w:t xml:space="preserve">  │  content.js         │  HTTP    │  server.ts           │</w:t>
+        <w:br/>
+        <w:t xml:space="preserve">  │  检测代码块          │────────→│  接收代码             │</w:t>
+        <w:br/>
+        <w:t xml:space="preserve">  │  显示 ⚡ 按钮        │          │                      │</w:t>
+        <w:br/>
+        <w:t xml:space="preserve">  │                     │          │  codeApplier.ts      │</w:t>
+        <w:br/>
+        <w:t xml:space="preserve">  │  background.js      │  WS     │  解析 JSON + Patch    │</w:t>
+        <w:br/>
+        <w:t xml:space="preserve">  │  消息路由            │←───────→│                      │</w:t>
+        <w:br/>
+        <w:t xml:space="preserve">  │                     │          │  diffManager.ts      │</w:t>
+        <w:br/>
+        <w:t xml:space="preserve">  │  popup.js           │          │  Diff 预览 + Git 快照 │</w:t>
+        <w:br/>
+        <w:t xml:space="preserve">  │  控制面板            │          │                      │</w:t>
+        <w:br/>
+        <w:t xml:space="preserve">  └─────────────────────┘          └──────────────────────┘</w:t>
+        <w:br/>
+        <w:t>```</w:t>
+        <w:br/>
+        <w:br/>
+        <w:t>---</w:t>
+        <w:br/>
+        <w:br/>
+        <w:t>## ⚙️ VS Code 设置</w:t>
+        <w:br/>
+        <w:br/>
+        <w:t>在 VS Code 设置中搜索 `AI Code Agent`：</w:t>
+        <w:br/>
+        <w:br/>
+        <w:t>| 设置项 | 默认值 | 说明 |</w:t>
+        <w:br/>
+        <w:t>|--------|--------|------|</w:t>
+        <w:br/>
+        <w:t>| `aiCodeAgent.port` | `9960` | 起始端口（被占用会自动 +1） |</w:t>
+        <w:br/>
+        <w:t>| `aiCodeAgent.autoStart` | `true` | VS Code 启动时自动启动 |</w:t>
+        <w:br/>
+        <w:t>| `aiCodeAgent.requireConfirmation` | `true` | 修改前显示 Diff 预览 |</w:t>
+        <w:br/>
+        <w:t>| `aiCodeAgent.autoGitSnapshot` | `true` | 修改前自动 Git 快照 |</w:t>
+        <w:br/>
+        <w:br/>
+        <w:t>---</w:t>
+        <w:br/>
+        <w:br/>
+        <w:t>## 📦 导出项目代码</w:t>
+        <w:br/>
+        <w:br/>
+        <w:t>需要把项目代码发给 AI 看？两种方式：</w:t>
+      </w:r>
+    </w:p>
+    <w:p>
+      <w:pPr>
+        <w:spacing w:after="0" w:before="0"/>
+      </w:pPr>
+      <w:r>
+        <w:rPr>
+          <w:rFonts w:ascii="Consolas" w:hAnsi="Consolas"/>
+          <w:color w:val="282828"/>
+          <w:sz w:val="15"/>
+        </w:rPr>
+        <w:br/>
+        <w:t>### 方式 1：在插件弹窗中一键导出</w:t>
+        <w:br/>
+        <w:br/>
+        <w:t>1. 打开弹窗 → 展开「导出项目代码为 Word」</w:t>
+        <w:br/>
+        <w:t>2. 填写要排除的文件（比如 `*.md`、`dist/`）</w:t>
+        <w:br/>
+        <w:t>3. 点击「一键导出」→ 自动生成 .docx 文件</w:t>
+        <w:br/>
+        <w:br/>
+        <w:t>### 方式 2：命令行</w:t>
+        <w:br/>
+        <w:br/>
+        <w:t>```bash</w:t>
+        <w:br/>
+        <w:t>pip install python-docx</w:t>
+        <w:br/>
+        <w:t>python export_code.py</w:t>
+        <w:br/>
+        <w:t>python export_code.py --exclude "*.md" dist/ node_modules/</w:t>
+        <w:br/>
+        <w:t>python export_code.py -o my_project.docx --max-size 500</w:t>
+        <w:br/>
+        <w:t>```</w:t>
+        <w:br/>
+        <w:br/>
+        <w:t>---</w:t>
+        <w:br/>
+        <w:br/>
+        <w:t>## 🌐 支持的 AI 平台</w:t>
+        <w:br/>
+        <w:br/>
+        <w:t>理论上支持所有能显示代码块的网页端 AI：</w:t>
+        <w:br/>
+        <w:br/>
+        <w:t>| 平台 | 状态 |</w:t>
+        <w:br/>
+        <w:t>|------|------|</w:t>
+        <w:br/>
+        <w:t>| ChatGPT | ✅ 已测试 |</w:t>
+        <w:br/>
+        <w:t>| Claude | ✅ 已测试 |</w:t>
+        <w:br/>
+        <w:t>| Google Gemini | ✅ 已测试 |</w:t>
+        <w:br/>
+        <w:t>| DeepSeek | ✅ 已测试 |</w:t>
+        <w:br/>
+        <w:t>| Kimi | ✅ 已测试 |</w:t>
+        <w:br/>
+        <w:t>| 通义千问 | ✅ 已测试 |</w:t>
+      </w:r>
+    </w:p>
+    <w:p>
+      <w:pPr>
+        <w:spacing w:after="0" w:before="0"/>
+      </w:pPr>
+      <w:r>
+        <w:rPr>
+          <w:rFonts w:ascii="Consolas" w:hAnsi="Consolas"/>
+          <w:color w:val="282828"/>
+          <w:sz w:val="15"/>
+        </w:rPr>
+        <w:t>| 其他 AI 网站 | ✅ 只要能输出代码块就支持 |</w:t>
+        <w:br/>
+        <w:br/>
+        <w:t>---</w:t>
+        <w:br/>
+        <w:br/>
+        <w:t>## ❓ 常见问题</w:t>
+        <w:br/>
+        <w:br/>
+        <w:t>### Q：按钮不出现？</w:t>
+        <w:br/>
+        <w:br/>
+        <w:t>1. 检查插件弹窗顶部是否显示绿色圆点（已连接）</w:t>
+        <w:br/>
+        <w:t>2. 检查浏览器扩展管理页面，该网站是否允许此扩展运行</w:t>
+        <w:br/>
+        <w:t>3. 点击弹窗中的「🔍 扫描页面」手动触发</w:t>
+        <w:br/>
+        <w:t>4. 按 F12 查看 Console 是否有 `[AI Code Agent] Content script loaded` 输出</w:t>
+        <w:br/>
+        <w:br/>
+        <w:t>### Q：发送后没反应？</w:t>
+        <w:br/>
+        <w:br/>
+        <w:t>1. 检查 VS Code 状态栏右下角是否显示 `AI Agent :9960`</w:t>
+        <w:br/>
+        <w:t>2. 确认 VS Code 打开的项目和你要修改的项目一致</w:t>
+        <w:br/>
+        <w:t>3. 如果开了多个 VS Code，在弹窗中点击正确的窗口芯片切换</w:t>
+        <w:br/>
+        <w:br/>
+        <w:t>### Q：Patch 匹配失败？</w:t>
+        <w:br/>
+        <w:br/>
+        <w:t>这通常是 AI 输出的 `find` 字段和实际代码有微小差异。解决方法：</w:t>
+        <w:br/>
+        <w:t>- 让 AI 用 `write` 模式重新输出完整文件</w:t>
+        <w:br/>
+        <w:t>- 或者在提示词中强调「直接用 write 不要用 patch」</w:t>
+        <w:br/>
+        <w:br/>
+        <w:t>### Q：如何撤销 AI 的修改？</w:t>
+        <w:br/>
+        <w:br/>
+        <w:t>- 插件弹窗点击「⏪ 撤销修改」</w:t>
+        <w:br/>
+        <w:t>- 或在 VS Code 中 `Ctrl+Shift+P` → `AI Agent: 撤销上一次 AI 修改`</w:t>
+        <w:br/>
+        <w:t>- 或直接用 Git：`git log --grep="AI-Agent"` 找到记录后 `git reset`</w:t>
+      </w:r>
+    </w:p>
+    <w:p>
+      <w:pPr>
+        <w:spacing w:after="0" w:before="0"/>
+      </w:pPr>
+      <w:r>
+        <w:rPr>
+          <w:rFonts w:ascii="Consolas" w:hAnsi="Consolas"/>
+          <w:color w:val="282828"/>
+          <w:sz w:val="15"/>
+        </w:rPr>
+        <w:br/>
+        <w:t>---</w:t>
+        <w:br/>
+        <w:br/>
+        <w:t>## 📝 更新日志</w:t>
+        <w:br/>
+        <w:br/>
+        <w:t>### v1.3.0</w:t>
+        <w:br/>
+        <w:t>- 插件弹窗 UI 全面重构：顶部状态栏、折叠分组、芯片式窗口切换</w:t>
+        <w:br/>
+        <w:t>- 一键导出项目代码为 Word</w:t>
+        <w:br/>
+        <w:t>- 按钮发送改为直接 HTTP 通信，速度提升</w:t>
+        <w:br/>
+        <w:t>- 页面不可见时暂停扫描，减少内存占用</w:t>
+        <w:br/>
+        <w:br/>
+        <w:t>### v1.2.0</w:t>
+        <w:br/>
+        <w:t>- WebSocket continuation frame 支持</w:t>
+        <w:br/>
+        <w:t>- Patch 匹配 5 级容错</w:t>
+        <w:br/>
+        <w:t>- 历史文件原子写入</w:t>
+        <w:br/>
+        <w:t>- 提示词规则强化</w:t>
         <w:br/>
         <w:br/>
         <w:t>### v1.1.0</w:t>
         <w:br/>
-        <w:t>- 插件总开关、一键复制提示词、自动跳转 VS Code</w:t>
-        <w:br/>
-        <w:t>- 多窗口自动寻找可用端口</w:t>
-        <w:br/>
-        <w:t>- Diff 预览「全部接受/全部拒绝」</w:t>
-        <w:br/>
-        <w:t>- WebSocket 指数退避重连</w:t>
+        <w:t>- 插件总开关、一键复制提示词</w:t>
+        <w:br/>
+        <w:t>- 多窗口自动端口分配</w:t>
+        <w:br/>
+        <w:t>- Diff 预览全部接受/拒绝</w:t>
         <w:br/>
         <w:br/>
         <w:t>### v1.0.0</w:t>
         <w:br/>
-        <w:t>- 浏览器扩展自动检测代码块</w:t>
-        <w:br/>
-        <w:t>- VS Code 扩展接收并应用代码</w:t>
-        <w:br/>
-        <w:t>- Diff 预览 + Git 快照 + 操作历史</w:t>
+        <w:t>- 首个版本：代码检测、Diff 预览、Git 快照、WebSocket 通信</w:t>
+        <w:br/>
+        <w:br/>
+        <w:t>---</w:t>
         <w:br/>
         <w:br/>
         <w:t>## 🤝 贡献</w:t>
         <w:br/>
         <w:br/>
         <w:t>欢迎提 Issue 和 PR！</w:t>
+      </w:r>
+    </w:p>
+    <w:p>
+      <w:pPr>
+        <w:spacing w:after="0" w:before="0"/>
+      </w:pPr>
+      <w:r>
+        <w:rPr>
+          <w:rFonts w:ascii="Consolas" w:hAnsi="Consolas"/>
+          <w:color w:val="282828"/>
+          <w:sz w:val="15"/>
+        </w:rPr>
+        <w:br/>
+        <w:t>如果遇到问题：</w:t>
+        <w:br/>
+        <w:t>1. 在插件弹窗点击「🔍 调试信息」复制状态</w:t>
+        <w:br/>
+        <w:t>2. 到 [GitHub Issues](https://github.com/whywbhydyq/ai-code-agent/issues) 提交</w:t>
         <w:br/>
         <w:br/>
         <w:t>## 📄 协议</w:t>
@@ -8108,7 +8322,7 @@
           <w:color w:val="828282"/>
           <w:sz w:val="16"/>
         </w:rPr>
-        <w:t>JavaScript  |  641 lines  |  28,997 bytes</w:t>
+        <w:t>JavaScript  |  645 lines  |  29,780 bytes</w:t>
       </w:r>
     </w:p>
     <w:p>
@@ -9199,11 +9413,11 @@
         <w:br/>
         <w:t xml:space="preserve">        }</w:t>
         <w:br/>
-        <w:t xml:space="preserve">        if (message.type === 'collect-last-reply') {</w:t>
-        <w:br/>
-        <w:t xml:space="preserve">            sendResponse({ text: collectLastAIReply() });</w:t>
-        <w:br/>
-        <w:t xml:space="preserve">            return true;</w:t>
+        <w:t xml:space="preserve">        if (message.type === 'update-auto-jump') {</w:t>
+        <w:br/>
+        <w:t xml:space="preserve">            autoJumpEnabled = message.enabled;</w:t>
+        <w:br/>
+        <w:t xml:space="preserve">            return;</w:t>
       </w:r>
     </w:p>
     <w:p>
@@ -9218,6 +9432,14 @@
         </w:rPr>
         <w:t xml:space="preserve">        }</w:t>
         <w:br/>
+        <w:t xml:space="preserve">        if (message.type === 'collect-last-reply') {</w:t>
+        <w:br/>
+        <w:t xml:space="preserve">            sendResponse({ text: collectLastAIReply() });</w:t>
+        <w:br/>
+        <w:t xml:space="preserve">            return true;</w:t>
+        <w:br/>
+        <w:t xml:space="preserve">        }</w:t>
+        <w:br/>
         <w:t xml:space="preserve">        if (message.type === 'collect-debug-info') {</w:t>
         <w:br/>
         <w:t xml:space="preserve">            var codeBlocks = document.querySelectorAll('pre, code');</w:t>
@@ -9267,14 +9489,6 @@
         <w:t xml:space="preserve">            if (!extensionEnabled) return;</w:t>
         <w:br/>
         <w:t xml:space="preserve">            var allActions = [];</w:t>
-        <w:br/>
-        <w:t xml:space="preserve">            document.querySelectorAll('pre, code').forEach(function(el) {</w:t>
-        <w:br/>
-        <w:t xml:space="preserve">                extractActions(el.textContent || '').forEach(function(a) { allActions.push(a); });</w:t>
-        <w:br/>
-        <w:t xml:space="preserve">            });</w:t>
-        <w:br/>
-        <w:t xml:space="preserve">            if (allActions.length === 0) { showNotification('\u672a\u68c0\u6d4b\u5230\u64cd\u4f5c\u6307\u4ee4', false); return; }</w:t>
       </w:r>
     </w:p>
     <w:p>
@@ -9287,6 +9501,14 @@
           <w:color w:val="282828"/>
           <w:sz w:val="15"/>
         </w:rPr>
+        <w:t xml:space="preserve">            document.querySelectorAll('pre, code').forEach(function(el) {</w:t>
+        <w:br/>
+        <w:t xml:space="preserve">                extractActions(el.textContent || '').forEach(function(a) { allActions.push(a); });</w:t>
+        <w:br/>
+        <w:t xml:space="preserve">            });</w:t>
+        <w:br/>
+        <w:t xml:space="preserve">            if (allActions.length === 0) { showNotification('\u672a\u68c0\u6d4b\u5230\u64cd\u4f5c\u6307\u4ee4', false); return; }</w:t>
+        <w:br/>
         <w:t xml:space="preserve">            sendToVSCode({ actions: allActions }, function(resp) {</w:t>
         <w:br/>
         <w:t xml:space="preserve">                showNotification(resp &amp;&amp; resp.success ? '\u5df2\u53d1\u9001 ' + allActions.length + ' \u4e2a\u64cd\u4f5c' : (resp ? resp.message : '\u5931\u8d25'), resp &amp;&amp; resp.success);</w:t>
@@ -9337,13 +9559,6 @@
         <w:t xml:space="preserve">            notif.style.transform = 'translateX(100px)';</w:t>
         <w:br/>
         <w:t xml:space="preserve">            setTimeout(function() { notif.remove(); }, 500);</w:t>
-        <w:br/>
-        <w:t xml:space="preserve">        }, 3000);</w:t>
-        <w:br/>
-        <w:t xml:space="preserve">    }</w:t>
-        <w:br/>
-        <w:br/>
-        <w:t xml:space="preserve">    console.log('[AI Code Agent] Content script loaded. v1.2.5');</w:t>
       </w:r>
     </w:p>
     <w:p>
@@ -9356,6 +9571,13 @@
           <w:color w:val="282828"/>
           <w:sz w:val="15"/>
         </w:rPr>
+        <w:t xml:space="preserve">        }, 3000);</w:t>
+        <w:br/>
+        <w:t xml:space="preserve">    }</w:t>
+        <w:br/>
+        <w:br/>
+        <w:t xml:space="preserve">    console.log('[AI Code Agent] Content script loaded. v1.2.5');</w:t>
+        <w:br/>
         <w:br/>
         <w:t xml:space="preserve">    // ======================== WebSocket ========================</w:t>
         <w:br/>
@@ -9405,14 +9627,6 @@
         <w:t xml:space="preserve">                    wsReconnectTimer = setTimeout(wsConnect, wsRetryDelay);</w:t>
         <w:br/>
         <w:t xml:space="preserve">                    wsRetryDelay = Math.min(wsRetryDelay * 2, WS_MAX_RETRY_DELAY);</w:t>
-        <w:br/>
-        <w:t xml:space="preserve">                }</w:t>
-        <w:br/>
-        <w:t xml:space="preserve">            };</w:t>
-        <w:br/>
-        <w:t xml:space="preserve">            ws.onerror = function() {</w:t>
-        <w:br/>
-        <w:t xml:space="preserve">                ws = null;</w:t>
       </w:r>
     </w:p>
     <w:p>
@@ -9425,6 +9639,14 @@
           <w:color w:val="282828"/>
           <w:sz w:val="15"/>
         </w:rPr>
+        <w:t xml:space="preserve">                }</w:t>
+        <w:br/>
+        <w:t xml:space="preserve">            };</w:t>
+        <w:br/>
+        <w:t xml:space="preserve">            ws.onerror = function() {</w:t>
+        <w:br/>
+        <w:t xml:space="preserve">                ws = null;</w:t>
+        <w:br/>
         <w:t xml:space="preserve">                if (extensionEnabled) {</w:t>
         <w:br/>
         <w:t xml:space="preserve">                    wsReconnectTimer = setTimeout(wsConnect, wsRetryDelay);</w:t>
@@ -9474,13 +9696,6 @@
         <w:t xml:space="preserve">            if (!wsSend(data)) { clearTimeout(timeout); pendingRequests.delete(reqId); resolve({ success: false, message: 'not connected' }); }</w:t>
         <w:br/>
         <w:t xml:space="preserve">        });</w:t>
-        <w:br/>
-        <w:t xml:space="preserve">    }</w:t>
-        <w:br/>
-        <w:br/>
-        <w:t xml:space="preserve">    function handleWSMessage(data) {</w:t>
-        <w:br/>
-        <w:t xml:space="preserve">        if (data.reqId &amp;&amp; pendingRequests.has(data.reqId)) { pendingRequests.get(data.reqId)(data); return; }</w:t>
       </w:r>
     </w:p>
     <w:p>
@@ -9493,6 +9708,13 @@
           <w:color w:val="282828"/>
           <w:sz w:val="15"/>
         </w:rPr>
+        <w:t xml:space="preserve">    }</w:t>
+        <w:br/>
+        <w:br/>
+        <w:t xml:space="preserve">    function handleWSMessage(data) {</w:t>
+        <w:br/>
+        <w:t xml:space="preserve">        if (data.reqId &amp;&amp; pendingRequests.has(data.reqId)) { pendingRequests.get(data.reqId)(data); return; }</w:t>
+        <w:br/>
         <w:t xml:space="preserve">        switch (data.type) {</w:t>
         <w:br/>
         <w:t xml:space="preserve">            case 'connected': console.log('[AI Code Agent] workspace:', data.workspace); break;</w:t>
@@ -9543,14 +9765,6 @@
         <w:t xml:space="preserve">        if (target.tagName === 'TEXTAREA') {</w:t>
         <w:br/>
         <w:t xml:space="preserve">            var currentVal = target.value;</w:t>
-        <w:br/>
-        <w:t xml:space="preserve">            target.value = currentVal ? currentVal + '\n\n' + text : text;</w:t>
-        <w:br/>
-        <w:t xml:space="preserve">            target.dispatchEvent(new Event('input', { bubbles: true }));</w:t>
-        <w:br/>
-        <w:t xml:space="preserve">            target.dispatchEvent(new Event('change', { bubbles: true }));</w:t>
-        <w:br/>
-        <w:t xml:space="preserve">        } else {</w:t>
       </w:r>
     </w:p>
     <w:p>
@@ -9563,6 +9777,14 @@
           <w:color w:val="282828"/>
           <w:sz w:val="15"/>
         </w:rPr>
+        <w:t xml:space="preserve">            target.value = currentVal ? currentVal + '\n\n' + text : text;</w:t>
+        <w:br/>
+        <w:t xml:space="preserve">            target.dispatchEvent(new Event('input', { bubbles: true }));</w:t>
+        <w:br/>
+        <w:t xml:space="preserve">            target.dispatchEvent(new Event('change', { bubbles: true }));</w:t>
+        <w:br/>
+        <w:t xml:space="preserve">        } else {</w:t>
+        <w:br/>
         <w:t xml:space="preserve">            var currentContent = target.innerText || '';</w:t>
         <w:br/>
         <w:t xml:space="preserve">            target.innerText = currentContent ? currentContent + '\n\n' + text : text;</w:t>
@@ -9885,7 +10107,7 @@
           <w:color w:val="828282"/>
           <w:sz w:val="16"/>
         </w:rPr>
-        <w:t>HTML  |  286 lines  |  13,386 bytes</w:t>
+        <w:t>HTML  |  225 lines  |  11,326 bytes</w:t>
       </w:r>
     </w:p>
     <w:p>
@@ -9912,7 +10134,11 @@
         <w:br/>
         <w:t xml:space="preserve">        body {</w:t>
         <w:br/>
-        <w:t xml:space="preserve">            width: 380px;</w:t>
+        <w:t xml:space="preserve">            width: 400px;</w:t>
+        <w:br/>
+        <w:t xml:space="preserve">            max-height: 600px;</w:t>
+        <w:br/>
+        <w:t xml:space="preserve">            overflow-y: auto;</w:t>
         <w:br/>
         <w:t xml:space="preserve">            font-family: -apple-system, BlinkMacSystemFont, "Segoe UI", sans-serif;</w:t>
         <w:br/>
@@ -9920,43 +10146,39 @@
         <w:br/>
         <w:t xml:space="preserve">            color: #cdd6f4;</w:t>
         <w:br/>
-        <w:t xml:space="preserve">            padding: 14px;</w:t>
-        <w:br/>
         <w:t xml:space="preserve">            font-size: 13px;</w:t>
         <w:br/>
+        <w:t xml:space="preserve">            padding: 12px;</w:t>
+        <w:br/>
         <w:t xml:space="preserve">        }</w:t>
         <w:br/>
-        <w:t xml:space="preserve">        h1 {</w:t>
-        <w:br/>
-        <w:t xml:space="preserve">            font-size: 15px;</w:t>
-        <w:br/>
-        <w:t xml:space="preserve">            margin-bottom: 12px;</w:t>
-        <w:br/>
-        <w:t xml:space="preserve">            display: flex;</w:t>
-        <w:br/>
-        <w:t xml:space="preserve">            align-items: center;</w:t>
-        <w:br/>
-        <w:t xml:space="preserve">            gap: 8px;</w:t>
-        <w:br/>
-        <w:t xml:space="preserve">            color: #89b4fa;</w:t>
+        <w:t xml:space="preserve">        h1 { font-size: 15px; color: #89b4fa; margin-bottom: 10px; display: flex; align-items: center; gap: 6px; }</w:t>
+        <w:br/>
+        <w:t xml:space="preserve">        .card {</w:t>
+        <w:br/>
+        <w:t xml:space="preserve">            background: #313244;</w:t>
+        <w:br/>
+        <w:t xml:space="preserve">            border-radius: 8px;</w:t>
+        <w:br/>
+        <w:t xml:space="preserve">            padding: 10px 12px;</w:t>
+        <w:br/>
+        <w:t xml:space="preserve">            margin-bottom: 8px;</w:t>
         <w:br/>
         <w:t xml:space="preserve">        }</w:t>
         <w:br/>
-        <w:t xml:space="preserve">        .master-toggle {</w:t>
-        <w:br/>
-        <w:t xml:space="preserve">            background: linear-gradient(135deg, #1a1a3e, #16213e);</w:t>
-        <w:br/>
-        <w:t xml:space="preserve">            border: 1.5px solid #89b4fa;</w:t>
-        <w:br/>
-        <w:t xml:space="preserve">            border-radius: 10px;</w:t>
-        <w:br/>
-        <w:t xml:space="preserve">            padding: 12px 14px;</w:t>
-        <w:br/>
-        <w:t xml:space="preserve">            margin-bottom: 12px;</w:t>
-        <w:br/>
-        <w:t xml:space="preserve">            display: flex;</w:t>
-        <w:br/>
-        <w:t xml:space="preserve">            align-items: center;</w:t>
+        <w:t xml:space="preserve">        .card-title {</w:t>
+        <w:br/>
+        <w:t xml:space="preserve">            font-size: 11px; color: #6c7086; text-transform: uppercase;</w:t>
+        <w:br/>
+        <w:t xml:space="preserve">            letter-spacing: 0.5px; margin-bottom: 6px;</w:t>
+        <w:br/>
+        <w:t xml:space="preserve">        }</w:t>
+        <w:br/>
+        <w:t xml:space="preserve">        .dot { width: 8px; height: 8px; border-radius: 50%; display: inline-block; }</w:t>
+        <w:br/>
+        <w:t xml:space="preserve">        .dot-green { background: #a6e3a1; box-shadow: 0 0 4px #a6e3a1; }</w:t>
+        <w:br/>
+        <w:t xml:space="preserve">        .dot-red { background: #f38ba8; box-shadow: 0 0 4px #f38ba8; }</w:t>
       </w:r>
     </w:p>
     <w:p>
@@ -9969,65 +10191,65 @@
           <w:color w:val="282828"/>
           <w:sz w:val="15"/>
         </w:rPr>
-        <w:t xml:space="preserve">            justify-content: space-between;</w:t>
+        <w:t xml:space="preserve">        .status-row { display: flex; align-items: center; gap: 6px; font-size: 12px; margin-bottom: 4px; }</w:t>
+        <w:br/>
+        <w:t xml:space="preserve">        .workspace-name { font-family: monospace; color: #89b4fa; font-size: 12px; }</w:t>
+        <w:br/>
+        <w:t xml:space="preserve">        .ws-chip {</w:t>
+        <w:br/>
+        <w:t xml:space="preserve">            display: inline-block; padding: 3px 10px; border-radius: 12px;</w:t>
+        <w:br/>
+        <w:t xml:space="preserve">            border: 1px solid #45475a; background: #1e1e2e; color: #cdd6f4;</w:t>
+        <w:br/>
+        <w:t xml:space="preserve">            font-size: 11px; font-family: monospace; cursor: pointer;</w:t>
+        <w:br/>
+        <w:t xml:space="preserve">            transition: all 0.15s; margin: 2px;</w:t>
         <w:br/>
         <w:t xml:space="preserve">        }</w:t>
         <w:br/>
-        <w:t xml:space="preserve">        .master-toggle.disabled {</w:t>
-        <w:br/>
-        <w:t xml:space="preserve">            border-color: #45475a;</w:t>
-        <w:br/>
-        <w:t xml:space="preserve">            background: #313244;</w:t>
+        <w:t xml:space="preserve">        .ws-chip:hover { border-color: #89b4fa; }</w:t>
+        <w:br/>
+        <w:t xml:space="preserve">        .ws-chip.active { border-color: #89b4fa; background: rgba(137,180,250,0.15); color: #89b4fa; }</w:t>
+        <w:br/>
+        <w:t xml:space="preserve">        .btn-row { display: flex; gap: 6px; margin-bottom: 8px; }</w:t>
+        <w:br/>
+        <w:t xml:space="preserve">        .btn {</w:t>
+        <w:br/>
+        <w:t xml:space="preserve">            flex: 1; padding: 8px 6px; border: none; border-radius: 6px;</w:t>
+        <w:br/>
+        <w:t xml:space="preserve">            background: #45475a; color: #cdd6f4; font-size: 11px;</w:t>
+        <w:br/>
+        <w:t xml:space="preserve">            cursor: pointer; text-align: center; transition: all 0.15s;</w:t>
         <w:br/>
         <w:t xml:space="preserve">        }</w:t>
         <w:br/>
-        <w:t xml:space="preserve">        .master-label { font-size: 14px; font-weight: 600; color: #cdd6f4; }</w:t>
-        <w:br/>
-        <w:t xml:space="preserve">        .master-hint { font-size: 11px; color: #6c7086; margin-top: 2px; }</w:t>
-        <w:br/>
-        <w:t xml:space="preserve">        #main-content.disabled {</w:t>
-        <w:br/>
-        <w:t xml:space="preserve">            opacity: 0.35;</w:t>
-        <w:br/>
-        <w:t xml:space="preserve">            pointer-events: none;</w:t>
-        <w:br/>
-        <w:t xml:space="preserve">            filter: grayscale(0.3);</w:t>
-        <w:br/>
-        <w:t xml:space="preserve">            transition: all 0.3s ease;</w:t>
+        <w:t xml:space="preserve">        .btn:hover { background: #585b70; }</w:t>
+        <w:br/>
+        <w:t xml:space="preserve">        .btn.primary { background: #89b4fa; color: #1e1e2e; font-weight: 600; }</w:t>
+        <w:br/>
+        <w:t xml:space="preserve">        .btn.primary:hover { background: #74c7ec; }</w:t>
+        <w:br/>
+        <w:t xml:space="preserve">        .btn.green { background: #a6e3a1; color: #1e1e2e; font-weight: 600; }</w:t>
+        <w:br/>
+        <w:t xml:space="preserve">        .btn.green:hover { background: #74dba0; }</w:t>
+        <w:br/>
+        <w:t xml:space="preserve">        .btn.danger:hover { background: #45273a; color: #f38ba8; }</w:t>
+        <w:br/>
+        <w:t xml:space="preserve">        .btn.warn { background: #fab387; color: #1e1e2e; font-weight: 600; }</w:t>
+        <w:br/>
+        <w:t xml:space="preserve">        .btn.warn:hover { background: #f9c87c; }</w:t>
+        <w:br/>
+        <w:t xml:space="preserve">        .btn:disabled { opacity: 0.5; cursor: not-allowed; }</w:t>
+        <w:br/>
+        <w:t xml:space="preserve">        .toggle-row {</w:t>
+        <w:br/>
+        <w:t xml:space="preserve">            display: flex; align-items: center; justify-content: space-between; padding: 4px 0;</w:t>
         <w:br/>
         <w:t xml:space="preserve">        }</w:t>
         <w:br/>
-        <w:t xml:space="preserve">        #main-content { transition: all 0.3s ease; }</w:t>
-        <w:br/>
-        <w:t xml:space="preserve">        .status-card {</w:t>
-        <w:br/>
-        <w:t xml:space="preserve">            background: #313244;</w:t>
-        <w:br/>
-        <w:t xml:space="preserve">            border-radius: 8px;</w:t>
-        <w:br/>
-        <w:t xml:space="preserve">            padding: 10px 12px;</w:t>
-        <w:br/>
-        <w:t xml:space="preserve">            margin-bottom: 10px;</w:t>
-        <w:br/>
-        <w:t xml:space="preserve">            display: flex;</w:t>
-        <w:br/>
-        <w:t xml:space="preserve">            align-items: center;</w:t>
-        <w:br/>
-        <w:t xml:space="preserve">            justify-content: space-between;</w:t>
-        <w:br/>
-        <w:t xml:space="preserve">        }</w:t>
-        <w:br/>
-        <w:t xml:space="preserve">        .status-left { display: flex; flex-direction: column; gap: 3px; }</w:t>
-        <w:br/>
-        <w:t xml:space="preserve">        .status-row { display: flex; align-items: center; gap: 7px; font-size: 13px; }</w:t>
-        <w:br/>
-        <w:t xml:space="preserve">        .dot { width: 9px; height: 9px; border-radius: 50%; flex-shrink: 0; }</w:t>
-        <w:br/>
-        <w:t xml:space="preserve">        .dot-green { background: #a6e3a1; box-shadow: 0 0 5px #a6e3a1; }</w:t>
-        <w:br/>
-        <w:t xml:space="preserve">        .dot-red   { background: #f38ba8; box-shadow: 0 0 5px #f38ba8; }</w:t>
-        <w:br/>
-        <w:t xml:space="preserve">        .workspace-path {</w:t>
+        <w:t xml:space="preserve">        .toggle-label { font-size: 12px; }</w:t>
+        <w:br/>
+        <w:t xml:space="preserve">        .toggle-switch { position: relative; width: 36px; height: 18px; flex-shrink: 0; }</w:t>
       </w:r>
     </w:p>
     <w:p>
@@ -10040,65 +10262,65 @@
           <w:color w:val="282828"/>
           <w:sz w:val="15"/>
         </w:rPr>
-        <w:t xml:space="preserve">            font-size: 11px; color: #6c7086; font-family: monospace;</w:t>
-        <w:br/>
-        <w:t xml:space="preserve">            word-break: break-all; max-width: 260px;</w:t>
+        <w:t xml:space="preserve">        .toggle-switch input { display: none; }</w:t>
+        <w:br/>
+        <w:t xml:space="preserve">        .toggle-slider {</w:t>
+        <w:br/>
+        <w:t xml:space="preserve">            position: absolute; top:0; left:0; right:0; bottom:0;</w:t>
+        <w:br/>
+        <w:t xml:space="preserve">            background: #45475a; border-radius: 18px; cursor: pointer; transition: 0.2s;</w:t>
         <w:br/>
         <w:t xml:space="preserve">        }</w:t>
         <w:br/>
-        <w:t xml:space="preserve">        .toggle-row {</w:t>
-        <w:br/>
-        <w:t xml:space="preserve">            display: flex; align-items: center; justify-content: space-between;</w:t>
-        <w:br/>
-        <w:t xml:space="preserve">            background: #313244; border-radius: 8px; padding: 10px 12px; margin-bottom: 10px;</w:t>
+        <w:t xml:space="preserve">        .toggle-slider::before {</w:t>
+        <w:br/>
+        <w:t xml:space="preserve">            content:''; position: absolute; width: 14px; height: 14px;</w:t>
+        <w:br/>
+        <w:t xml:space="preserve">            left: 2px; top: 2px; background: white; border-radius: 50%; transition: 0.2s;</w:t>
         <w:br/>
         <w:t xml:space="preserve">        }</w:t>
         <w:br/>
-        <w:t xml:space="preserve">        .toggle-label { font-size: 13px; color: #cdd6f4; }</w:t>
-        <w:br/>
-        <w:t xml:space="preserve">        .toggle-hint  { font-size: 11px; color: #6c7086; margin-top: 2px; }</w:t>
-        <w:br/>
-        <w:t xml:space="preserve">        .toggle-switch { position: relative; width: 42px; height: 22px; flex-shrink: 0; }</w:t>
-        <w:br/>
-        <w:t xml:space="preserve">        .toggle-switch input { display: none; }</w:t>
-        <w:br/>
-        <w:t xml:space="preserve">        .toggle-slider {</w:t>
-        <w:br/>
-        <w:t xml:space="preserve">            position: absolute; top: 0; left: 0; right: 0; bottom: 0;</w:t>
-        <w:br/>
-        <w:t xml:space="preserve">            background: #45475a; border-radius: 22px; cursor: pointer; transition: background 0.2s;</w:t>
+        <w:t xml:space="preserve">        .toggle-switch input:checked + .toggle-slider { background: #89b4fa; }</w:t>
+        <w:br/>
+        <w:t xml:space="preserve">        .toggle-switch input:checked + .toggle-slider::before { transform: translateX(18px); }</w:t>
+        <w:br/>
+        <w:t xml:space="preserve">        input[type="text"], textarea {</w:t>
+        <w:br/>
+        <w:t xml:space="preserve">            width: 100%; padding: 6px 8px; border: 1px solid #45475a; border-radius: 6px;</w:t>
+        <w:br/>
+        <w:t xml:space="preserve">            background: #1e1e2e; color: #cdd6f4; font-size: 12px; outline: none;</w:t>
         <w:br/>
         <w:t xml:space="preserve">        }</w:t>
         <w:br/>
-        <w:t xml:space="preserve">        .toggle-slider::before {</w:t>
-        <w:br/>
-        <w:t xml:space="preserve">            content: ''; position: absolute; width: 16px; height: 16px;</w:t>
-        <w:br/>
-        <w:t xml:space="preserve">            left: 3px; top: 3px; background: white; border-radius: 50%; transition: transform 0.2s;</w:t>
+        <w:t xml:space="preserve">        input:focus, textarea:focus { border-color: #89b4fa; }</w:t>
+        <w:br/>
+        <w:t xml:space="preserve">        textarea { height: 80px; resize: vertical; font-family: monospace; font-size: 11px; }</w:t>
+        <w:br/>
+        <w:t xml:space="preserve">        .recent-item {</w:t>
+        <w:br/>
+        <w:t xml:space="preserve">            display: flex; align-items: center; gap: 5px; padding: 3px 0; font-size: 11px;</w:t>
         <w:br/>
         <w:t xml:space="preserve">        }</w:t>
         <w:br/>
-        <w:t xml:space="preserve">        .toggle-switch input:checked + .toggle-slider { background: #89b4fa; }</w:t>
-        <w:br/>
-        <w:t xml:space="preserve">        .toggle-switch input:checked + .toggle-slider::before { transform: translateX(20px); }</w:t>
-        <w:br/>
-        <w:t xml:space="preserve">        .section-title {</w:t>
-        <w:br/>
-        <w:t xml:space="preserve">            font-size: 11px; color: #6c7086; text-transform: uppercase;</w:t>
-        <w:br/>
-        <w:t xml:space="preserve">            letter-spacing: 0.8px; margin-bottom: 6px;</w:t>
+        <w:t xml:space="preserve">        .recent-file { flex:1; font-family: monospace; overflow: hidden; text-overflow: ellipsis; white-space: nowrap; }</w:t>
+        <w:br/>
+        <w:t xml:space="preserve">        .recent-time { color: #6c7086; font-size: 10px; flex-shrink: 0; }</w:t>
+        <w:br/>
+        <w:t xml:space="preserve">        .path-item {</w:t>
+        <w:br/>
+        <w:t xml:space="preserve">            display: flex; align-items: center; gap: 4px; padding: 3px 6px;</w:t>
+        <w:br/>
+        <w:t xml:space="preserve">            background: #1e1e2e; border-radius: 4px; font-size: 11px; margin-top: 3px;</w:t>
         <w:br/>
         <w:t xml:space="preserve">        }</w:t>
         <w:br/>
-        <w:t xml:space="preserve">        .action-grid {</w:t>
-        <w:br/>
-        <w:t xml:space="preserve">            display: grid; grid-template-columns: 1fr 1fr;</w:t>
-        <w:br/>
-        <w:t xml:space="preserve">            gap: 6px; margin-bottom: 10px;</w:t>
-        <w:br/>
-        <w:t xml:space="preserve">        }</w:t>
-        <w:br/>
-        <w:t xml:space="preserve">        .action-btn {</w:t>
+        <w:t xml:space="preserve">        .path-name { flex:1; font-family: monospace; overflow: hidden; text-overflow: ellipsis; white-space: nowrap; cursor: pointer; }</w:t>
+        <w:br/>
+        <w:t xml:space="preserve">        .path-name:hover { color: #89b4fa; }</w:t>
+        <w:br/>
+        <w:t xml:space="preserve">        .path-del { color: #6c7086; cursor: pointer; font-size: 13px; }</w:t>
+        <w:br/>
+        <w:t xml:space="preserve">        .path-del:hover { color: #f38ba8; }</w:t>
       </w:r>
     </w:p>
     <w:p>
@@ -10111,65 +10333,64 @@
           <w:color w:val="282828"/>
           <w:sz w:val="15"/>
         </w:rPr>
-        <w:t xml:space="preserve">            padding: 8px 6px; border: none; border-radius: 6px;</w:t>
-        <w:br/>
-        <w:t xml:space="preserve">            background: #313244; color: #cdd6f4; font-size: 12px;</w:t>
-        <w:br/>
-        <w:t xml:space="preserve">            cursor: pointer; transition: all 0.15s; text-align: center; line-height: 1.4;</w:t>
+        <w:t xml:space="preserve">        .path-badge { font-size: 9px; color: #a6e3a1; background: rgba(166,227,161,0.1); padding: 1px 5px; border-radius: 8px; }</w:t>
+        <w:br/>
+        <w:t xml:space="preserve">        .result {</w:t>
+        <w:br/>
+        <w:t xml:space="preserve">            padding: 6px 10px; border-radius: 6px; font-size: 11px; display: none; margin-top: 6px;</w:t>
         <w:br/>
         <w:t xml:space="preserve">        }</w:t>
         <w:br/>
-        <w:t xml:space="preserve">        .action-btn:hover { background: #45475a; }</w:t>
-        <w:br/>
-        <w:t xml:space="preserve">        .action-btn.danger:hover { background: #3a1a1a; color: #f38ba8; }</w:t>
-        <w:br/>
-        <w:t xml:space="preserve">        .path-section {</w:t>
-        <w:br/>
-        <w:t xml:space="preserve">            background: #313244; border-radius: 8px; padding: 10px 12px; margin-bottom: 10px;</w:t>
+        <w:t xml:space="preserve">        .result-success { background: #1a3a1a; color: #a6e3a1; border: 1px solid #2e7d32; display: block; }</w:t>
+        <w:br/>
+        <w:t xml:space="preserve">        .result-error { background: #3a1a1a; color: #f38ba8; border: 1px solid #d32f2f; display: block; }</w:t>
+        <w:br/>
+        <w:t xml:space="preserve">        .collapse-header {</w:t>
+        <w:br/>
+        <w:t xml:space="preserve">            display: flex; align-items: center; justify-content: space-between;</w:t>
+        <w:br/>
+        <w:t xml:space="preserve">            padding: 6px 0; cursor: pointer; user-select: none;</w:t>
         <w:br/>
         <w:t xml:space="preserve">        }</w:t>
         <w:br/>
-        <w:t xml:space="preserve">        .path-input-row { display: flex; gap: 6px; margin-top: 6px; }</w:t>
-        <w:br/>
-        <w:t xml:space="preserve">        input[type="text"], input[type="number"], textarea, select {</w:t>
-        <w:br/>
-        <w:t xml:space="preserve">            width: 100%; padding: 7px 9px; border: 1px solid #45475a; border-radius: 6px;</w:t>
-        <w:br/>
-        <w:t xml:space="preserve">            background: #1e1e2e; color: #cdd6f4; font-size: 12px; outline: none;</w:t>
-        <w:br/>
-        <w:t xml:space="preserve">            transition: border-color 0.15s;</w:t>
+        <w:t xml:space="preserve">        .collapse-header:hover .collapse-title { color: #89b4fa; }</w:t>
+        <w:br/>
+        <w:t xml:space="preserve">        .collapse-title { font-size: 12px; color: #6c7086; }</w:t>
+        <w:br/>
+        <w:t xml:space="preserve">        .collapse-arrow { color: #6c7086; font-size: 10px; transition: transform 0.2s; }</w:t>
+        <w:br/>
+        <w:t xml:space="preserve">        .collapse-arrow.open { transform: rotate(90deg); }</w:t>
+        <w:br/>
+        <w:t xml:space="preserve">        .collapse-body { display: none; }</w:t>
+        <w:br/>
+        <w:t xml:space="preserve">        .collapse-body.open { display: block; }</w:t>
+        <w:br/>
+        <w:t xml:space="preserve">        .btn-small {</w:t>
+        <w:br/>
+        <w:t xml:space="preserve">            padding: 5px 10px; border: none; border-radius: 6px;</w:t>
+        <w:br/>
+        <w:t xml:space="preserve">            background: #89b4fa; color: #1e1e2e; font-size: 11px; font-weight: 600; cursor: pointer;</w:t>
         <w:br/>
         <w:t xml:space="preserve">        }</w:t>
         <w:br/>
-        <w:t xml:space="preserve">        input:focus, textarea:focus, select:focus { border-color: #89b4fa; }</w:t>
-        <w:br/>
-        <w:t xml:space="preserve">        .btn-small {</w:t>
-        <w:br/>
-        <w:t xml:space="preserve">            padding: 7px 12px; border: none; border-radius: 6px;</w:t>
-        <w:br/>
-        <w:t xml:space="preserve">            background: #89b4fa; color: #1e1e2e; font-size: 12px;</w:t>
-        <w:br/>
-        <w:t xml:space="preserve">            font-weight: 600; cursor: pointer; white-space: nowrap;</w:t>
-        <w:br/>
-        <w:t xml:space="preserve">        }</w:t>
-        <w:br/>
         <w:t xml:space="preserve">        .btn-small:hover { background: #74c7ec; }</w:t>
         <w:br/>
-        <w:t xml:space="preserve">        .project-list {</w:t>
-        <w:br/>
-        <w:t xml:space="preserve">            margin-top: 8px; display: flex; flex-direction: column; gap: 4px;</w:t>
-        <w:br/>
-        <w:t xml:space="preserve">            max-height: 100px; overflow-y: auto;</w:t>
-        <w:br/>
-        <w:t xml:space="preserve">        }</w:t>
-        <w:br/>
-        <w:t xml:space="preserve">        .project-item {</w:t>
-        <w:br/>
-        <w:t xml:space="preserve">            display: flex; align-items: center; justify-content: space-between;</w:t>
-        <w:br/>
-        <w:t xml:space="preserve">            padding: 5px 8px; background: #1e1e2e; border-radius: 5px;</w:t>
-        <w:br/>
-        <w:t xml:space="preserve">            font-size: 11px; cursor: pointer; border: 1px solid transparent;</w:t>
+        <w:t xml:space="preserve">        .divider { height: 1px; background: #313244; margin: 8px 0; }</w:t>
+        <w:br/>
+        <w:t xml:space="preserve">    &lt;/style&gt;</w:t>
+        <w:br/>
+        <w:t>&lt;/head&gt;</w:t>
+        <w:br/>
+        <w:t>&lt;body&gt;</w:t>
+        <w:br/>
+        <w:t xml:space="preserve">    &lt;h1&gt;&amp;#x26A1; AI Code Agent&lt;/h1&gt;</w:t>
+        <w:br/>
+        <w:br/>
+        <w:t xml:space="preserve">    &lt;!-- ===== 连接状态 + 工作区 ===== --&gt;</w:t>
+        <w:br/>
+        <w:t xml:space="preserve">    &lt;div class="card"&gt;</w:t>
+        <w:br/>
+        <w:t xml:space="preserve">        &lt;div class="status-row"&gt;</w:t>
       </w:r>
     </w:p>
     <w:p>
@@ -10182,65 +10403,62 @@
           <w:color w:val="282828"/>
           <w:sz w:val="15"/>
         </w:rPr>
-        <w:t xml:space="preserve">        }</w:t>
-        <w:br/>
-        <w:t xml:space="preserve">        .project-item:hover { border-color: #45475a; }</w:t>
-        <w:br/>
-        <w:t xml:space="preserve">        .project-item.active { border-color: #89b4fa; color: #89b4fa; }</w:t>
-        <w:br/>
-        <w:t xml:space="preserve">        .project-item-name { font-family: monospace; flex: 1; overflow: hidden; text-overflow: ellipsis; white-space: nowrap; }</w:t>
-        <w:br/>
-        <w:t xml:space="preserve">        .project-item-del { color: #6c7086; cursor: pointer; padding: 0 4px; font-size: 14px; flex-shrink: 0; }</w:t>
-        <w:br/>
-        <w:t xml:space="preserve">        .project-item-del:hover { color: #f38ba8; }</w:t>
-        <w:br/>
-        <w:t xml:space="preserve">        .manual-section {</w:t>
-        <w:br/>
-        <w:t xml:space="preserve">            background: #313244; border-radius: 8px; padding: 10px 12px; margin-bottom: 10px;</w:t>
-        <w:br/>
-        <w:t xml:space="preserve">        }</w:t>
-        <w:br/>
-        <w:t xml:space="preserve">        textarea {</w:t>
-        <w:br/>
-        <w:t xml:space="preserve">            height: 90px; resize: vertical;</w:t>
-        <w:br/>
-        <w:t xml:space="preserve">            font-family: "Cascadia Code", "Fira Code", monospace; font-size: 11px;</w:t>
-        <w:br/>
-        <w:t xml:space="preserve">        }</w:t>
-        <w:br/>
-        <w:t xml:space="preserve">        .btn-primary {</w:t>
-        <w:br/>
-        <w:t xml:space="preserve">            display: block; width: 100%; padding: 9px; margin-top: 7px;</w:t>
-        <w:br/>
-        <w:t xml:space="preserve">            border: none; border-radius: 6px; background: #89b4fa; color: #1e1e2e;</w:t>
-        <w:br/>
-        <w:t xml:space="preserve">            font-size: 13px; font-weight: 600; cursor: pointer; transition: background 0.15s;</w:t>
-        <w:br/>
-        <w:t xml:space="preserve">        }</w:t>
-        <w:br/>
-        <w:t xml:space="preserve">        .btn-primary:hover { background: #74c7ec; }</w:t>
-        <w:br/>
-        <w:t xml:space="preserve">        .btn-primary:disabled { opacity: 0.6; cursor: not-allowed; }</w:t>
-        <w:br/>
-        <w:t xml:space="preserve">        .result {</w:t>
-        <w:br/>
-        <w:t xml:space="preserve">            padding: 8px 10px; border-radius: 6px; font-size: 12px;</w:t>
-        <w:br/>
-        <w:t xml:space="preserve">            display: none; margin-top: 6px;</w:t>
-        <w:br/>
-        <w:t xml:space="preserve">        }</w:t>
-        <w:br/>
-        <w:t xml:space="preserve">        .result-success { background: #1a3a1a; color: #a6e3a1; border: 1px solid #2e7d32; display: block; }</w:t>
-        <w:br/>
-        <w:t xml:space="preserve">        .result-error   { background: #3a1a1a; color: #f38ba8; border: 1px solid #d32f2f; display: block; }</w:t>
-        <w:br/>
-        <w:t xml:space="preserve">        .prompt-card {</w:t>
-        <w:br/>
-        <w:t xml:space="preserve">            background: linear-gradient(135deg, #1a3a2a, #16213e);</w:t>
-        <w:br/>
-        <w:t xml:space="preserve">            border: 1px solid #2e7d32;</w:t>
-        <w:br/>
-        <w:t xml:space="preserve">            border-radius: 8px;</w:t>
+        <w:t xml:space="preserve">            &lt;span id="status-dot" class="dot dot-red"&gt;&lt;/span&gt;</w:t>
+        <w:br/>
+        <w:t xml:space="preserve">            &lt;span id="status-label"&gt;检查连接中...&lt;/span&gt;</w:t>
+        <w:br/>
+        <w:t xml:space="preserve">            &lt;span style="flex:1"&gt;&lt;/span&gt;</w:t>
+        <w:br/>
+        <w:t xml:space="preserve">            &lt;button class="btn" id="btn-refresh" style="flex:none;padding:4px 8px;font-size:10px;"&gt;刷新&lt;/button&gt;</w:t>
+        <w:br/>
+        <w:t xml:space="preserve">        &lt;/div&gt;</w:t>
+        <w:br/>
+        <w:t xml:space="preserve">        &lt;div id="workspace-name" class="workspace-name" style="margin-bottom:4px;"&gt;&lt;/div&gt;</w:t>
+        <w:br/>
+        <w:t xml:space="preserve">        &lt;div id="instance-list" style="margin-top:4px;"&gt;&lt;/div&gt;</w:t>
+        <w:br/>
+        <w:t xml:space="preserve">    &lt;/div&gt;</w:t>
+        <w:br/>
+        <w:br/>
+        <w:t xml:space="preserve">    &lt;!-- ===== 一键复制提示词（醒目） ===== --&gt;</w:t>
+        <w:br/>
+        <w:t xml:space="preserve">    &lt;button class="btn green" id="btn-copy-prompt" style="width:100%;margin-bottom:8px;padding:10px;font-size:13px;"&gt;</w:t>
+        <w:br/>
+        <w:t xml:space="preserve">        &amp;#x1F4CB; 一键复制 AI 提示词（首次对话必用）</w:t>
+        <w:br/>
+        <w:t xml:space="preserve">    &lt;/button&gt;</w:t>
+        <w:br/>
+        <w:br/>
+        <w:t xml:space="preserve">    &lt;!-- ===== 插件开关 + 自动跳转 + 自动扫描 ===== --&gt;</w:t>
+        <w:br/>
+        <w:t xml:space="preserve">    &lt;div class="card"&gt;</w:t>
+        <w:br/>
+        <w:t xml:space="preserve">        &lt;div class="toggle-row"&gt;</w:t>
+        <w:br/>
+        <w:t xml:space="preserve">            &lt;span class="toggle-label"&gt;&amp;#x1F50C; 插件总开关&lt;/span&gt;</w:t>
+        <w:br/>
+        <w:t xml:space="preserve">            &lt;label class="toggle-switch"&gt;&lt;input type="checkbox" id="extension-toggle" checked /&gt;&lt;span class="toggle-slider"&gt;&lt;/span&gt;&lt;/label&gt;</w:t>
+        <w:br/>
+        <w:t xml:space="preserve">        &lt;/div&gt;</w:t>
+        <w:br/>
+        <w:t xml:space="preserve">        &lt;div class="toggle-row"&gt;</w:t>
+        <w:br/>
+        <w:t xml:space="preserve">            &lt;span class="toggle-label"&gt;&amp;#x1F680; 发送后跳转 VS Code&lt;/span&gt;</w:t>
+        <w:br/>
+        <w:t xml:space="preserve">            &lt;label class="toggle-switch"&gt;&lt;input type="checkbox" id="auto-jump-toggle" checked /&gt;&lt;span class="toggle-slider"&gt;&lt;/span&gt;&lt;/label&gt;</w:t>
+        <w:br/>
+        <w:t xml:space="preserve">        &lt;/div&gt;</w:t>
+        <w:br/>
+        <w:t xml:space="preserve">        &lt;div class="toggle-row"&gt;</w:t>
+        <w:br/>
+        <w:t xml:space="preserve">            &lt;span class="toggle-label"&gt;&amp;#x1F50D; 自动检测代码块&lt;/span&gt;</w:t>
+        <w:br/>
+        <w:t xml:space="preserve">            &lt;label class="toggle-switch"&gt;&lt;input type="checkbox" id="auto-scan-toggle" checked /&gt;&lt;span class="toggle-slider"&gt;&lt;/span&gt;&lt;/label&gt;</w:t>
+        <w:br/>
+        <w:t xml:space="preserve">        &lt;/div&gt;</w:t>
+        <w:br/>
+        <w:t xml:space="preserve">    &lt;/div&gt;</w:t>
+        <w:br/>
       </w:r>
     </w:p>
     <w:p>
@@ -10253,65 +10471,61 @@
           <w:color w:val="282828"/>
           <w:sz w:val="15"/>
         </w:rPr>
-        <w:t xml:space="preserve">            padding: 10px 12px;</w:t>
-        <w:br/>
-        <w:t xml:space="preserve">            margin-bottom: 10px;</w:t>
-        <w:br/>
-        <w:t xml:space="preserve">        }</w:t>
-        <w:br/>
-        <w:t xml:space="preserve">        .prompt-card .section-title { color: #a6e3a1; }</w:t>
-        <w:br/>
-        <w:t xml:space="preserve">        .prompt-card p {</w:t>
-        <w:br/>
-        <w:t xml:space="preserve">            font-size: 11px; color: #6c7086; margin: 4px 0 8px 0; line-height: 1.5;</w:t>
-        <w:br/>
-        <w:t xml:space="preserve">        }</w:t>
-        <w:br/>
-        <w:t xml:space="preserve">        .btn-copy-prompt {</w:t>
-        <w:br/>
-        <w:t xml:space="preserve">            display: flex; align-items: center; justify-content: center; gap: 6px;</w:t>
-        <w:br/>
-        <w:t xml:space="preserve">            width: 100%; padding: 9px; border: none; border-radius: 6px;</w:t>
-        <w:br/>
-        <w:t xml:space="preserve">            background: #a6e3a1; color: #1e1e2e; font-size: 13px;</w:t>
-        <w:br/>
-        <w:t xml:space="preserve">            font-weight: 600; cursor: pointer; transition: all 0.15s;</w:t>
-        <w:br/>
-        <w:t xml:space="preserve">        }</w:t>
-        <w:br/>
-        <w:t xml:space="preserve">        .btn-copy-prompt:hover { background: #74dba0; }</w:t>
-        <w:br/>
-        <w:t xml:space="preserve">        .btn-copy-prompt.copied {</w:t>
-        <w:br/>
-        <w:t xml:space="preserve">            background: #2e7d32; color: #a6e3a1;</w:t>
-        <w:br/>
-        <w:t xml:space="preserve">        }</w:t>
-        <w:br/>
-        <w:t xml:space="preserve">        .instance-item {</w:t>
-        <w:br/>
-        <w:t xml:space="preserve">            display: flex; align-items: center; justify-content: space-between;</w:t>
-        <w:br/>
-        <w:t xml:space="preserve">            padding: 6px 8px; margin-top: 4px; background: #1e1e2e; border-radius: 5px;</w:t>
-        <w:br/>
-        <w:t xml:space="preserve">            font-size: 11px; cursor: pointer; border: 1px solid transparent;</w:t>
-        <w:br/>
-        <w:t xml:space="preserve">            transition: all 0.15s;</w:t>
-        <w:br/>
-        <w:t xml:space="preserve">        }</w:t>
-        <w:br/>
-        <w:t xml:space="preserve">        .instance-item:hover { border-color: #45475a; }</w:t>
-        <w:br/>
-        <w:t xml:space="preserve">        .instance-item.active { border-color: #89b4fa; }</w:t>
-        <w:br/>
-        <w:t xml:space="preserve">        .instance-name {</w:t>
-        <w:br/>
-        <w:t xml:space="preserve">            font-family: monospace; flex: 1; overflow: hidden;</w:t>
-        <w:br/>
-        <w:t xml:space="preserve">            text-overflow: ellipsis; white-space: nowrap;</w:t>
-        <w:br/>
-        <w:t xml:space="preserve">        }</w:t>
-        <w:br/>
-        <w:t xml:space="preserve">        .instance-port {</w:t>
+        <w:t xml:space="preserve">    &lt;!-- ===== 核心操作按钮 ===== --&gt;</w:t>
+        <w:br/>
+        <w:t xml:space="preserve">    &lt;div class="btn-row"&gt;</w:t>
+        <w:br/>
+        <w:t xml:space="preserve">        &lt;button class="btn primary" id="btn-scan"&gt;&amp;#x1F50D; 扫描页面&lt;/button&gt;</w:t>
+        <w:br/>
+        <w:t xml:space="preserve">        &lt;button class="btn" id="btn-copy-reply"&gt;&amp;#x1F4CB; 复制AI回复&lt;/button&gt;</w:t>
+        <w:br/>
+        <w:t xml:space="preserve">        &lt;button class="btn danger" id="btn-undo"&gt;&amp;#x23EA; 撤销修改&lt;/button&gt;</w:t>
+        <w:br/>
+        <w:t xml:space="preserve">    &lt;/div&gt;</w:t>
+        <w:br/>
+        <w:br/>
+        <w:t xml:space="preserve">    &lt;!-- ===== 最近操作 ===== --&gt;</w:t>
+        <w:br/>
+        <w:t xml:space="preserve">    &lt;div class="card"&gt;</w:t>
+        <w:br/>
+        <w:t xml:space="preserve">        &lt;div class="card-title"&gt;最近操作&lt;/div&gt;</w:t>
+        <w:br/>
+        <w:t xml:space="preserve">        &lt;div id="recent-list"&gt;&lt;div style="color:#6c7086;font-size:11px;"&gt;暂无记录&lt;/div&gt;&lt;/div&gt;</w:t>
+        <w:br/>
+        <w:t xml:space="preserve">    &lt;/div&gt;</w:t>
+        <w:br/>
+        <w:br/>
+        <w:t xml:space="preserve">    &lt;!-- ===== 快捷发送（恢复） ===== --&gt;</w:t>
+        <w:br/>
+        <w:t xml:space="preserve">    &lt;div class="card"&gt;</w:t>
+        <w:br/>
+        <w:t xml:space="preserve">        &lt;div class="card-title"&gt;快捷发送代码到 VS Code&lt;/div&gt;</w:t>
+        <w:br/>
+        <w:t xml:space="preserve">        &lt;textarea id="manual-text" placeholder="粘贴 agent-action 代码块或任意代码..."&gt;&lt;/textarea&gt;</w:t>
+        <w:br/>
+        <w:t xml:space="preserve">        &lt;button class="btn primary" id="manual-send-btn" style="width:100%;margin-top:6px;"&gt;&amp;#x1F4E4; 发送&lt;/button&gt;</w:t>
+        <w:br/>
+        <w:t xml:space="preserve">    &lt;/div&gt;</w:t>
+        <w:br/>
+        <w:br/>
+        <w:t xml:space="preserve">    &lt;div class="divider"&gt;&lt;/div&gt;</w:t>
+        <w:br/>
+        <w:br/>
+        <w:t xml:space="preserve">    &lt;!-- ===== 导出项目（折叠） ===== --&gt;</w:t>
+        <w:br/>
+        <w:t xml:space="preserve">    &lt;div class="collapse-header" data-target="export-section"&gt;</w:t>
+        <w:br/>
+        <w:t xml:space="preserve">        &lt;span class="collapse-title"&gt;&amp;#x1F4E6; 导出项目代码为 Word&lt;/span&gt;</w:t>
+        <w:br/>
+        <w:t xml:space="preserve">        &lt;span class="collapse-arrow"&gt;&amp;#x25B6;&lt;/span&gt;</w:t>
+        <w:br/>
+        <w:t xml:space="preserve">    &lt;/div&gt;</w:t>
+        <w:br/>
+        <w:t xml:space="preserve">    &lt;div class="collapse-body" id="export-section"&gt;</w:t>
+        <w:br/>
+        <w:t xml:space="preserve">        &lt;div class="card"&gt;</w:t>
+        <w:br/>
+        <w:t xml:space="preserve">            &lt;label style="font-size:11px;color:#6c7086;"&gt;排除（每行一个）：&lt;/label&gt;</w:t>
       </w:r>
     </w:p>
     <w:p>
@@ -10324,61 +10538,63 @@
           <w:color w:val="282828"/>
           <w:sz w:val="15"/>
         </w:rPr>
-        <w:t xml:space="preserve">            color: #6c7086; font-size: 10px; flex-shrink: 0; margin-left: 8px;</w:t>
-        <w:br/>
-        <w:t xml:space="preserve">        }</w:t>
-        <w:br/>
-        <w:t xml:space="preserve">    &lt;/style&gt;</w:t>
-        <w:br/>
-        <w:t>&lt;/head&gt;</w:t>
-        <w:br/>
-        <w:t>&lt;body&gt;</w:t>
-        <w:br/>
-        <w:t xml:space="preserve">    &lt;h1&gt;&amp;#x26A1; AI Code Agent&lt;/h1&gt;</w:t>
-        <w:br/>
-        <w:br/>
-        <w:t xml:space="preserve">    &lt;div class="master-toggle" id="master-toggle-card"&gt;</w:t>
-        <w:br/>
-        <w:t xml:space="preserve">        &lt;div&gt;</w:t>
-        <w:br/>
-        <w:t xml:space="preserve">            &lt;div class="master-label"&gt;&amp;#x1F50C; 插件总开关&lt;/div&gt;</w:t>
-        <w:br/>
-        <w:t xml:space="preserve">            &lt;div class="master-hint" id="master-hint"&gt;插件已启用，正在监控页面&lt;/div&gt;</w:t>
+        <w:t xml:space="preserve">            &lt;textarea id="export-excludes" style="height:50px;margin:4px 0;" placeholder="*.md&amp;#10;dist/&amp;#10;*.docx"&gt;&lt;/textarea&gt;</w:t>
+        <w:br/>
+        <w:t xml:space="preserve">            &lt;button class="btn warn" id="btn-export" style="width:100%;"&gt;&amp;#x1F4E6; 一键导出&lt;/button&gt;</w:t>
         <w:br/>
         <w:t xml:space="preserve">        &lt;/div&gt;</w:t>
         <w:br/>
-        <w:t xml:space="preserve">        &lt;label class="toggle-switch"&gt;</w:t>
-        <w:br/>
-        <w:t xml:space="preserve">            &lt;input type="checkbox" id="extension-enabled-toggle" checked /&gt;</w:t>
-        <w:br/>
-        <w:t xml:space="preserve">            &lt;span class="toggle-slider"&gt;&lt;/span&gt;</w:t>
-        <w:br/>
-        <w:t xml:space="preserve">        &lt;/label&gt;</w:t>
-        <w:br/>
         <w:t xml:space="preserve">    &lt;/div&gt;</w:t>
         <w:br/>
         <w:br/>
-        <w:t xml:space="preserve">    &lt;div id="main-content"&gt;</w:t>
-        <w:br/>
-        <w:br/>
-        <w:t xml:space="preserve">        &lt;div class="prompt-card"&gt;</w:t>
-        <w:br/>
-        <w:t xml:space="preserve">            &lt;div class="section-title"&gt;&amp;#x1F680; 快速开始&lt;/div&gt;</w:t>
-        <w:br/>
-        <w:t xml:space="preserve">            &lt;p&gt;第一次和 AI 对话时，先发送这段提示词，AI 就会按照插件能识别的格式回复代码。&lt;/p&gt;</w:t>
-        <w:br/>
-        <w:t xml:space="preserve">            &lt;button class="btn-copy-prompt" id="btn-copy-prompt"&gt;&amp;#x1F4CB; 一键复制 AI 提示词&lt;/button&gt;</w:t>
+        <w:t xml:space="preserve">    &lt;!-- ===== 项目快捷方式（折叠） ===== --&gt;</w:t>
+        <w:br/>
+        <w:t xml:space="preserve">    &lt;div class="collapse-header" data-target="paths-section"&gt;</w:t>
+        <w:br/>
+        <w:t xml:space="preserve">        &lt;span class="collapse-title"&gt;&amp;#x1F4C1; 项目快捷方式&lt;/span&gt;</w:t>
+        <w:br/>
+        <w:t xml:space="preserve">        &lt;span class="collapse-arrow"&gt;&amp;#x25B6;&lt;/span&gt;</w:t>
+        <w:br/>
+        <w:t xml:space="preserve">    &lt;/div&gt;</w:t>
+        <w:br/>
+        <w:t xml:space="preserve">    &lt;div class="collapse-body" id="paths-section"&gt;</w:t>
+        <w:br/>
+        <w:t xml:space="preserve">        &lt;div class="card"&gt;</w:t>
+        <w:br/>
+        <w:t xml:space="preserve">            &lt;div style="display:flex;gap:6px;"&gt;</w:t>
+        <w:br/>
+        <w:t xml:space="preserve">                &lt;input type="text" id="path-input" placeholder="D:\\桌面\\project" style="flex:1;" /&gt;</w:t>
+        <w:br/>
+        <w:t xml:space="preserve">                &lt;button class="btn-small" id="add-path-btn"&gt;添加&lt;/button&gt;</w:t>
+        <w:br/>
+        <w:t xml:space="preserve">            &lt;/div&gt;</w:t>
+        <w:br/>
+        <w:t xml:space="preserve">            &lt;div id="project-list" style="margin-top:4px;"&gt;&lt;/div&gt;</w:t>
         <w:br/>
         <w:t xml:space="preserve">        &lt;/div&gt;</w:t>
         <w:br/>
-        <w:br/>
-        <w:t xml:space="preserve">        &lt;!-- 连接状态 + 多窗口列表 --&gt;</w:t>
-        <w:br/>
-        <w:t xml:space="preserve">        &lt;div class="status-card"&gt;</w:t>
-        <w:br/>
-        <w:t xml:space="preserve">            &lt;div class="status-left"&gt;</w:t>
-        <w:br/>
-        <w:t xml:space="preserve">                &lt;div class="status-row"&gt;</w:t>
+        <w:t xml:space="preserve">    &lt;/div&gt;</w:t>
+        <w:br/>
+        <w:br/>
+        <w:t xml:space="preserve">    &lt;!-- ===== 工具（折叠） ===== --&gt;</w:t>
+        <w:br/>
+        <w:t xml:space="preserve">    &lt;div class="collapse-header" data-target="tools-section"&gt;</w:t>
+        <w:br/>
+        <w:t xml:space="preserve">        &lt;span class="collapse-title"&gt;&amp;#x1F527; 工具&lt;/span&gt;</w:t>
+        <w:br/>
+        <w:t xml:space="preserve">        &lt;span class="collapse-arrow"&gt;&amp;#x25B6;&lt;/span&gt;</w:t>
+        <w:br/>
+        <w:t xml:space="preserve">    &lt;/div&gt;</w:t>
+        <w:br/>
+        <w:t xml:space="preserve">    &lt;div class="collapse-body" id="tools-section"&gt;</w:t>
+        <w:br/>
+        <w:t xml:space="preserve">        &lt;div class="btn-row"&gt;</w:t>
+        <w:br/>
+        <w:t xml:space="preserve">            &lt;button class="btn" id="btn-restart"&gt;重启服务器&lt;/button&gt;</w:t>
+        <w:br/>
+        <w:t xml:space="preserve">            &lt;button class="btn" id="btn-open-log"&gt;查看日志&lt;/button&gt;</w:t>
+        <w:br/>
+        <w:t xml:space="preserve">        &lt;/div&gt;</w:t>
       </w:r>
     </w:p>
     <w:p>
@@ -10391,159 +10607,21 @@
           <w:color w:val="282828"/>
           <w:sz w:val="15"/>
         </w:rPr>
-        <w:t xml:space="preserve">                    &lt;span id="status-dot" class="dot dot-red"&gt;&lt;/span&gt;</w:t>
-        <w:br/>
-        <w:t xml:space="preserve">                    &lt;span id="status-label"&gt;检查连接中...&lt;/span&gt;</w:t>
-        <w:br/>
-        <w:t xml:space="preserve">                &lt;/div&gt;</w:t>
-        <w:br/>
-        <w:t xml:space="preserve">                &lt;div id="workspace-info" class="workspace-path"&gt;&lt;/div&gt;</w:t>
-        <w:br/>
-        <w:t xml:space="preserve">            &lt;/div&gt;</w:t>
-        <w:br/>
-        <w:t xml:space="preserve">            &lt;button class="btn-small" id="refresh-btn" style="height:32px"&gt;&amp;#x1F504; 刷新&lt;/button&gt;</w:t>
+        <w:t xml:space="preserve">        &lt;div class="btn-row"&gt;</w:t>
+        <w:br/>
+        <w:t xml:space="preserve">            &lt;button class="btn" id="btn-reload-page"&gt;刷新页面&lt;/button&gt;</w:t>
+        <w:br/>
+        <w:t xml:space="preserve">            &lt;button class="btn" id="btn-reload-ext"&gt;重载插件&lt;/button&gt;</w:t>
         <w:br/>
         <w:t xml:space="preserve">        &lt;/div&gt;</w:t>
         <w:br/>
-        <w:t xml:space="preserve">        &lt;div id="instance-list-section"&gt;&lt;/div&gt;</w:t>
-        <w:br/>
-        <w:br/>
-        <w:t xml:space="preserve">        &lt;div class="toggle-row"&gt;</w:t>
-        <w:br/>
-        <w:t xml:space="preserve">            &lt;div&gt;</w:t>
-        <w:br/>
-        <w:t xml:space="preserve">                &lt;div class="toggle-label"&gt;&amp;#x1F680; 点击后自动跳转到 VS Code&lt;/div&gt;</w:t>
-        <w:br/>
-        <w:t xml:space="preserve">                &lt;div class="toggle-hint"&gt;发送代码后自动切换窗口到 VS Code&lt;/div&gt;</w:t>
-        <w:br/>
-        <w:t xml:space="preserve">            &lt;/div&gt;</w:t>
-        <w:br/>
-        <w:t xml:space="preserve">            &lt;label class="toggle-switch"&gt;</w:t>
-        <w:br/>
-        <w:t xml:space="preserve">                &lt;input type="checkbox" id="auto-jump-toggle" checked /&gt;</w:t>
-        <w:br/>
-        <w:t xml:space="preserve">                &lt;span class="toggle-slider"&gt;&lt;/span&gt;</w:t>
-        <w:br/>
-        <w:t xml:space="preserve">            &lt;/label&gt;</w:t>
+        <w:t xml:space="preserve">        &lt;div class="btn-row"&gt;</w:t>
+        <w:br/>
+        <w:t xml:space="preserve">            &lt;button class="btn" id="btn-debug-info"&gt;调试信息&lt;/button&gt;</w:t>
+        <w:br/>
+        <w:t xml:space="preserve">            &lt;button class="btn" id="btn-clear-history"&gt;清空历史&lt;/button&gt;</w:t>
         <w:br/>
         <w:t xml:space="preserve">        &lt;/div&gt;</w:t>
-        <w:br/>
-        <w:br/>
-        <w:t xml:space="preserve">        &lt;div class="toggle-row"&gt;</w:t>
-        <w:br/>
-        <w:t xml:space="preserve">            &lt;div&gt;</w:t>
-        <w:br/>
-        <w:t xml:space="preserve">                &lt;div class="toggle-label"&gt;&amp;#x1F50D; 自动检测页面代码块&lt;/div&gt;</w:t>
-        <w:br/>
-        <w:t xml:space="preserve">                &lt;div class="toggle-hint"&gt;在 AI 回答旁自动显示「应用」按钮&lt;/div&gt;</w:t>
-        <w:br/>
-        <w:t xml:space="preserve">            &lt;/div&gt;</w:t>
-        <w:br/>
-        <w:t xml:space="preserve">            &lt;label class="toggle-switch"&gt;</w:t>
-        <w:br/>
-        <w:t xml:space="preserve">                &lt;input type="checkbox" id="auto-scan-toggle" checked /&gt;</w:t>
-        <w:br/>
-        <w:t xml:space="preserve">                &lt;span class="toggle-slider"&gt;&lt;/span&gt;</w:t>
-        <w:br/>
-        <w:t xml:space="preserve">            &lt;/label&gt;</w:t>
-        <w:br/>
-        <w:t xml:space="preserve">        &lt;/div&gt;</w:t>
-      </w:r>
-    </w:p>
-    <w:p>
-      <w:pPr>
-        <w:spacing w:after="0" w:before="0"/>
-      </w:pPr>
-      <w:r>
-        <w:rPr>
-          <w:rFonts w:ascii="Consolas" w:hAnsi="Consolas"/>
-          <w:color w:val="282828"/>
-          <w:sz w:val="15"/>
-        </w:rPr>
-        <w:br/>
-        <w:t xml:space="preserve">        &lt;div class="section-title"&gt;快捷操作&lt;/div&gt;</w:t>
-        <w:br/>
-        <w:t xml:space="preserve">        &lt;div class="action-grid"&gt;</w:t>
-        <w:br/>
-        <w:t xml:space="preserve">            &lt;button class="action-btn" id="btn-scan"&gt;&amp;#x1F50D; 立即扫描当前页面&lt;/button&gt;</w:t>
-        <w:br/>
-        <w:t xml:space="preserve">            &lt;button class="action-btn" id="btn-restart"&gt;&amp;#x1F504; 重启 VS Code 服务器&lt;/button&gt;</w:t>
-        <w:br/>
-        <w:t xml:space="preserve">            &lt;button class="action-btn danger" id="btn-undo"&gt;&amp;#x23EA; 撤销上次 AI 修改&lt;/button&gt;</w:t>
-        <w:br/>
-        <w:t xml:space="preserve">            &lt;button class="action-btn" id="btn-open-log"&gt;&amp;#x1F4DC; 查看操作日志&lt;/button&gt;</w:t>
-        <w:br/>
-        <w:t xml:space="preserve">            &lt;button class="action-btn" id="btn-reload-page"&gt;&amp;#x1F503; 重新加载当前页面&lt;/button&gt;</w:t>
-        <w:br/>
-        <w:t xml:space="preserve">            &lt;button class="action-btn" id="btn-reload-ext"&gt;&amp;#x267B;&amp;#xFE0F; 重载浏览器插件&lt;/button&gt;</w:t>
-        <w:br/>
-        <w:t xml:space="preserve">            &lt;button class="action-btn" id="btn-copy-reply"&gt;&amp;#x1F4CB; 复制最近AI回复&lt;/button&gt;</w:t>
-        <w:br/>
-        <w:t xml:space="preserve">            &lt;button class="action-btn" id="btn-debug-info"&gt;&amp;#x1F50D; 收集调试信息&lt;/button&gt;</w:t>
-        <w:br/>
-        <w:t xml:space="preserve">        &lt;/div&gt;</w:t>
-        <w:br/>
-        <w:br/>
-        <w:t xml:space="preserve">        &lt;!-- 项目快捷方式（新窗口打开） --&gt;</w:t>
-        <w:br/>
-        <w:t xml:space="preserve">        &lt;div class="path-section"&gt;</w:t>
-        <w:br/>
-        <w:t xml:space="preserve">            &lt;div class="section-title"&gt;&amp;#x1F4C1; 项目快捷方式（点击在新窗口打开）&lt;/div&gt;</w:t>
-        <w:br/>
-        <w:t xml:space="preserve">            &lt;div class="path-input-row"&gt;</w:t>
-        <w:br/>
-        <w:t xml:space="preserve">                &lt;input type="text" id="path-input" placeholder="D:\\桌面\\my-project 或 /home/user/project" /&gt;</w:t>
-        <w:br/>
-        <w:t xml:space="preserve">                &lt;button class="btn-small" id="add-path-btn"&gt;添加&lt;/button&gt;</w:t>
-        <w:br/>
-        <w:t xml:space="preserve">            &lt;/div&gt;</w:t>
-        <w:br/>
-        <w:t xml:space="preserve">            &lt;div id="project-list" class="project-list"&gt;&lt;/div&gt;</w:t>
-        <w:br/>
-        <w:t xml:space="preserve">        &lt;/div&gt;</w:t>
-        <w:br/>
-        <w:br/>
-        <w:t xml:space="preserve">        &lt;div class="manual-section"&gt;</w:t>
-        <w:br/>
-        <w:t xml:space="preserve">             &lt;!-- 导出项目代码 --&gt;</w:t>
-        <w:br/>
-        <w:t xml:space="preserve">        &lt;div class="path-section"&gt;</w:t>
-        <w:br/>
-        <w:t xml:space="preserve">            &lt;div class="section-title"&gt;&amp;#x1F4E6; 导出项目代码为 Word&lt;/div&gt;</w:t>
-        <w:br/>
-        <w:t xml:space="preserve">            &lt;p style="font-size:11px;color:#6c7086;margin-bottom:6px;"&gt;将当前 VS Code 项目的所有代码导出为 .docx 文件&lt;/p&gt;</w:t>
-        <w:br/>
-        <w:t xml:space="preserve">            &lt;div style="margin-bottom:6px;"&gt;</w:t>
-        <w:br/>
-        <w:t xml:space="preserve">                &lt;label style="font-size:11px;color:#6c7086;"&gt;排除的文件/目录（每行一个，支持 *.md 通配符）：&lt;/label&gt;</w:t>
-      </w:r>
-    </w:p>
-    <w:p>
-      <w:pPr>
-        <w:spacing w:after="0" w:before="0"/>
-      </w:pPr>
-      <w:r>
-        <w:rPr>
-          <w:rFonts w:ascii="Consolas" w:hAnsi="Consolas"/>
-          <w:color w:val="282828"/>
-          <w:sz w:val="15"/>
-        </w:rPr>
-        <w:t xml:space="preserve">                &lt;textarea id="export-excludes" style="height:60px;margin-top:4px;" placeholder="node_modules&amp;#10;*.md&amp;#10;dist/&amp;#10;export_code.py"&gt;&lt;/textarea&gt;</w:t>
-        <w:br/>
-        <w:t xml:space="preserve">            &lt;/div&gt;</w:t>
-        <w:br/>
-        <w:t xml:space="preserve">            &lt;button class="btn-primary" id="btn-export" style="background:#fab387;color:#1e1e2e;"&gt;&amp;#x1F4E6; 一键导出当前项目&lt;/button&gt;</w:t>
-        <w:br/>
-        <w:t xml:space="preserve">        &lt;/div&gt;</w:t>
-        <w:br/>
-        <w:t xml:space="preserve">            &lt;div class="section-title"&gt;手动粘贴 AI 回复&lt;/div&gt;</w:t>
-        <w:br/>
-        <w:t xml:space="preserve">            &lt;textarea id="manual-text" placeholder="粘贴包含 agent-action 代码块的 AI 回复文本..."&gt;&lt;/textarea&gt;</w:t>
-        <w:br/>
-        <w:t xml:space="preserve">            &lt;button class="btn-primary" id="manual-send-btn"&gt;&amp;#x1F4E4; 发送到 VS Code&lt;/button&gt;</w:t>
-        <w:br/>
-        <w:t xml:space="preserve">        &lt;/div&gt;</w:t>
-        <w:br/>
         <w:br/>
         <w:t xml:space="preserve">    &lt;/div&gt;</w:t>
         <w:br/>
@@ -10592,7 +10670,7 @@
           <w:color w:val="828282"/>
           <w:sz w:val="16"/>
         </w:rPr>
-        <w:t>JavaScript  |  563 lines  |  27,466 bytes</w:t>
+        <w:t>JavaScript  |  391 lines  |  20,435 bytes</w:t>
       </w:r>
     </w:p>
     <w:p>
@@ -10607,60 +10685,60 @@
         </w:rPr>
         <w:t>document.addEventListener('DOMContentLoaded', function() {</w:t>
         <w:br/>
-        <w:br/>
-        <w:t xml:space="preserve">    var statusDot       = document.getElementById('status-dot');</w:t>
-        <w:br/>
-        <w:t xml:space="preserve">    var statusLabel     = document.getElementById('status-label');</w:t>
-        <w:br/>
-        <w:t xml:space="preserve">    var workspaceInfo   = document.getElementById('workspace-info');</w:t>
-        <w:br/>
-        <w:t xml:space="preserve">    var refreshBtn      = document.getElementById('refresh-btn');</w:t>
-        <w:br/>
-        <w:t xml:space="preserve">    var autoJumpToggle  = document.getElementById('auto-jump-toggle');</w:t>
-        <w:br/>
-        <w:t xml:space="preserve">    var autoScanToggle  = document.getElementById('auto-scan-toggle');</w:t>
-        <w:br/>
-        <w:t xml:space="preserve">    var pathInput       = document.getElementById('path-input');</w:t>
-        <w:br/>
-        <w:t xml:space="preserve">    var addPathBtn      = document.getElementById('add-path-btn');</w:t>
-        <w:br/>
-        <w:t xml:space="preserve">    var projectList     = document.getElementById('project-list');</w:t>
-        <w:br/>
-        <w:t xml:space="preserve">    var manualText      = document.getElementById('manual-text');</w:t>
-        <w:br/>
-        <w:t xml:space="preserve">    var manualSendBtn   = document.getElementById('manual-send-btn');</w:t>
-        <w:br/>
-        <w:t xml:space="preserve">    var resultDiv       = document.getElementById('result');</w:t>
-        <w:br/>
-        <w:t xml:space="preserve">    var btnScan         = document.getElementById('btn-scan');</w:t>
-        <w:br/>
-        <w:t xml:space="preserve">    var btnRestart      = document.getElementById('btn-restart');</w:t>
-        <w:br/>
-        <w:t xml:space="preserve">    var btnUndo         = document.getElementById('btn-undo');</w:t>
-        <w:br/>
-        <w:t xml:space="preserve">    var btnOpenLog      = document.getElementById('btn-open-log');</w:t>
-        <w:br/>
-        <w:t xml:space="preserve">    var extEnabledToggle  = document.getElementById('extension-enabled-toggle');</w:t>
-        <w:br/>
-        <w:t xml:space="preserve">    var masterToggleCard  = document.getElementById('master-toggle-card');</w:t>
-        <w:br/>
-        <w:t xml:space="preserve">    var masterHint        = document.getElementById('master-hint');</w:t>
-        <w:br/>
-        <w:t xml:space="preserve">    var mainContent       = document.getElementById('main-content');</w:t>
-        <w:br/>
-        <w:t xml:space="preserve">    var btnCopyPrompt     = document.getElementById('btn-copy-prompt');</w:t>
-        <w:br/>
-        <w:t xml:space="preserve">    var instanceListSection = document.getElementById('instance-list-section');</w:t>
-        <w:br/>
+        <w:t xml:space="preserve">    var statusDot = document.getElementById('status-dot');</w:t>
+        <w:br/>
+        <w:t xml:space="preserve">    var statusLabel = document.getElementById('status-label');</w:t>
+        <w:br/>
+        <w:t xml:space="preserve">    var workspaceName = document.getElementById('workspace-name');</w:t>
+        <w:br/>
+        <w:t xml:space="preserve">    var instanceList = document.getElementById('instance-list');</w:t>
+        <w:br/>
+        <w:t xml:space="preserve">    var recentList = document.getElementById('recent-list');</w:t>
+        <w:br/>
+        <w:t xml:space="preserve">    var manualText = document.getElementById('manual-text');</w:t>
+        <w:br/>
+        <w:t xml:space="preserve">    var manualSendBtn = document.getElementById('manual-send-btn');</w:t>
+        <w:br/>
+        <w:t xml:space="preserve">    var resultDiv = document.getElementById('result');</w:t>
+        <w:br/>
+        <w:t xml:space="preserve">    var autoJumpToggle = document.getElementById('auto-jump-toggle');</w:t>
+        <w:br/>
+        <w:t xml:space="preserve">    var autoScanToggle = document.getElementById('auto-scan-toggle');</w:t>
+        <w:br/>
+        <w:t xml:space="preserve">    var extToggle = document.getElementById('extension-toggle');</w:t>
+        <w:br/>
+        <w:br/>
+        <w:t xml:space="preserve">    var currentPort = 9960;</w:t>
         <w:br/>
         <w:t xml:space="preserve">    var currentWorkspace = '';</w:t>
         <w:br/>
-        <w:t xml:space="preserve">    var currentPort = 9960;</w:t>
-        <w:br/>
         <w:t xml:space="preserve">    var discoveredInstances = [];</w:t>
         <w:br/>
+        <w:t xml:space="preserve">    var extensionEnabled = true;</w:t>
+        <w:br/>
         <w:br/>
         <w:t xml:space="preserve">    var PROMPT_TEMPLATE = '';</w:t>
+        <w:br/>
+        <w:t xml:space="preserve">    try {</w:t>
+        <w:br/>
+        <w:t xml:space="preserve">        fetch(chrome.runtime.getURL('prompt-template.txt'))</w:t>
+        <w:br/>
+        <w:t xml:space="preserve">            .then(function(r) { return r.text(); })</w:t>
+        <w:br/>
+        <w:t xml:space="preserve">            .then(function(t) { if (t &amp;&amp; t.length &gt; 50) PROMPT_TEMPLATE = t; })</w:t>
+        <w:br/>
+        <w:t xml:space="preserve">            .catch(function() {});</w:t>
+        <w:br/>
+        <w:t xml:space="preserve">    } catch (_) {}</w:t>
+        <w:br/>
+        <w:t xml:space="preserve">    setTimeout(function() {</w:t>
+        <w:br/>
+        <w:t xml:space="preserve">        if (!PROMPT_TEMPLATE) PROMPT_TEMPLATE = 'Please use agent-action format.';</w:t>
+        <w:br/>
+        <w:t xml:space="preserve">    }, 1000);</w:t>
+        <w:br/>
+        <w:br/>
+        <w:t xml:space="preserve">    chrome.storage.local.get(</w:t>
       </w:r>
     </w:p>
     <w:p>
@@ -10673,671 +10751,63 @@
           <w:color w:val="282828"/>
           <w:sz w:val="15"/>
         </w:rPr>
-        <w:t xml:space="preserve">    try {</w:t>
-        <w:br/>
-        <w:t xml:space="preserve">        fetch(chrome.runtime.getURL('prompt-template.txt'))</w:t>
-        <w:br/>
-        <w:t xml:space="preserve">            .then(function(r) { return r.text(); })</w:t>
-        <w:br/>
-        <w:t xml:space="preserve">            .then(function(t) { if (t &amp;&amp; t.trim().length &gt; 50) PROMPT_TEMPLATE = t; })</w:t>
-        <w:br/>
-        <w:t xml:space="preserve">            .catch(function() {});</w:t>
-        <w:br/>
-        <w:t xml:space="preserve">    } catch (_) {}</w:t>
-        <w:br/>
-        <w:t xml:space="preserve">    // Fallback</w:t>
-        <w:br/>
-        <w:t xml:space="preserve">    setTimeout(function() {</w:t>
-        <w:br/>
-        <w:t xml:space="preserve">        if (!PROMPT_TEMPLATE) {</w:t>
-        <w:br/>
-        <w:t xml:space="preserve">            PROMPT_TEMPLATE = '\u8bf7\u5728\u540e\u7eed\u5bf9\u8bdd\u4e2d\u4f7f\u7528 agent-action \u683c\u5f0f\u8f93\u51fa\u4ee3\u7801\u64cd\u4f5c\u3002';</w:t>
+        <w:t xml:space="preserve">        ['serverPort', 'autoJump', 'autoScan', 'savedProjects', 'extensionEnabled', 'exportExcludes'],</w:t>
+        <w:br/>
+        <w:t xml:space="preserve">        function(r) {</w:t>
+        <w:br/>
+        <w:t xml:space="preserve">            if (r.serverPort) currentPort = r.serverPort;</w:t>
+        <w:br/>
+        <w:t xml:space="preserve">            autoJumpToggle.checked = r.autoJump !== false;</w:t>
+        <w:br/>
+        <w:t xml:space="preserve">            autoScanToggle.checked = r.autoScan !== false;</w:t>
+        <w:br/>
+        <w:t xml:space="preserve">            extensionEnabled = r.extensionEnabled !== false;</w:t>
+        <w:br/>
+        <w:t xml:space="preserve">            extToggle.checked = extensionEnabled;</w:t>
+        <w:br/>
+        <w:t xml:space="preserve">            renderProjectList(r.savedProjects || []);</w:t>
+        <w:br/>
+        <w:t xml:space="preserve">            if (document.getElementById('export-excludes') &amp;&amp; r.exportExcludes) {</w:t>
+        <w:br/>
+        <w:t xml:space="preserve">                document.getElementById('export-excludes').value = r.exportExcludes;</w:t>
+        <w:br/>
+        <w:t xml:space="preserve">            }</w:t>
         <w:br/>
         <w:t xml:space="preserve">        }</w:t>
         <w:br/>
-        <w:t xml:space="preserve">    }, 1000);</w:t>
-        <w:br/>
-        <w:br/>
-        <w:t xml:space="preserve">    btnCopyPrompt.addEventListener('click', function() {</w:t>
-        <w:br/>
-        <w:t xml:space="preserve">        navigator.clipboard.writeText(PROMPT_TEMPLATE).then(function() {</w:t>
-        <w:br/>
-        <w:t xml:space="preserve">            btnCopyPrompt.textContent = '\u2705 \u5df2\u590d\u5236\uff01\u7c98\u8d34\u5230 AI \u5bf9\u8bdd\u7684\u7b2c\u4e00\u6761\u6d88\u606f';</w:t>
-        <w:br/>
-        <w:t xml:space="preserve">            btnCopyPrompt.classList.add('copied');</w:t>
-        <w:br/>
-        <w:t xml:space="preserve">            setTimeout(function() {</w:t>
-        <w:br/>
-        <w:t xml:space="preserve">                btnCopyPrompt.textContent = '\ud83d\udccb \u4e00\u952e\u590d\u5236 AI \u63d0\u793a\u8bcd';</w:t>
-        <w:br/>
-        <w:t xml:space="preserve">                btnCopyPrompt.classList.remove('copied');</w:t>
-        <w:br/>
-        <w:t xml:space="preserve">            }, 3000);</w:t>
-        <w:br/>
-        <w:t xml:space="preserve">        }).catch(function() {</w:t>
-        <w:br/>
-        <w:t xml:space="preserve">            var ta = document.createElement('textarea');</w:t>
-        <w:br/>
-        <w:t xml:space="preserve">            ta.value = PROMPT_TEMPLATE;</w:t>
-        <w:br/>
-        <w:t xml:space="preserve">            document.body.appendChild(ta);</w:t>
-        <w:br/>
-        <w:t xml:space="preserve">            ta.select();</w:t>
-        <w:br/>
-        <w:t xml:space="preserve">            document.execCommand('copy');</w:t>
-        <w:br/>
-        <w:t xml:space="preserve">            ta.remove();</w:t>
-        <w:br/>
-        <w:t xml:space="preserve">            btnCopyPrompt.textContent = '\u2705 \u5df2\u590d\u5236\uff01';</w:t>
-        <w:br/>
-        <w:t xml:space="preserve">            setTimeout(function() {</w:t>
-      </w:r>
-    </w:p>
-    <w:p>
-      <w:pPr>
-        <w:spacing w:after="0" w:before="0"/>
-      </w:pPr>
-      <w:r>
-        <w:rPr>
-          <w:rFonts w:ascii="Consolas" w:hAnsi="Consolas"/>
-          <w:color w:val="282828"/>
-          <w:sz w:val="15"/>
-        </w:rPr>
-        <w:t xml:space="preserve">                btnCopyPrompt.textContent = '\ud83d\udccb \u4e00\u952e\u590d\u5236 AI \u63d0\u793a\u8bcd';</w:t>
-        <w:br/>
-        <w:t xml:space="preserve">            }, 3000);</w:t>
+        <w:t xml:space="preserve">    );</w:t>
+        <w:br/>
+        <w:t xml:space="preserve">    checkConnection();</w:t>
+        <w:br/>
+        <w:br/>
+        <w:t xml:space="preserve">    document.querySelectorAll('.collapse-header').forEach(function(h) {</w:t>
+        <w:br/>
+        <w:t xml:space="preserve">        h.addEventListener('click', function() {</w:t>
+        <w:br/>
+        <w:t xml:space="preserve">            var body = document.getElementById(h.getAttribute('data-target'));</w:t>
+        <w:br/>
+        <w:t xml:space="preserve">            var arrow = h.querySelector('.collapse-arrow');</w:t>
+        <w:br/>
+        <w:t xml:space="preserve">            body.classList.toggle('open');</w:t>
+        <w:br/>
+        <w:t xml:space="preserve">            arrow.classList.toggle('open');</w:t>
         <w:br/>
         <w:t xml:space="preserve">        });</w:t>
         <w:br/>
         <w:t xml:space="preserve">    });</w:t>
         <w:br/>
         <w:br/>
-        <w:t xml:space="preserve">    chrome.storage.local.get(</w:t>
-        <w:br/>
-        <w:t xml:space="preserve">        ['serverPort', 'autoJump', 'autoScan', 'savedProjects', 'extensionEnabled'],</w:t>
-        <w:br/>
-        <w:t xml:space="preserve">        function(result) {</w:t>
-        <w:br/>
-        <w:t xml:space="preserve">            if (result.serverPort) currentPort = result.serverPort;</w:t>
-        <w:br/>
-        <w:t xml:space="preserve">            autoJumpToggle.checked = result.autoJump !== false;</w:t>
-        <w:br/>
-        <w:t xml:space="preserve">            autoScanToggle.checked = result.autoScan !== false;</w:t>
-        <w:br/>
-        <w:t xml:space="preserve">            var enabled = result.extensionEnabled !== false;</w:t>
-        <w:br/>
-        <w:t xml:space="preserve">            extEnabledToggle.checked = enabled;</w:t>
-        <w:br/>
-        <w:t xml:space="preserve">            updateMasterToggleUI(enabled);</w:t>
-        <w:br/>
-        <w:t xml:space="preserve">            renderProjectList(result.savedProjects || []);</w:t>
-        <w:br/>
-        <w:t xml:space="preserve">        }</w:t>
-        <w:br/>
-        <w:t xml:space="preserve">    );</w:t>
-        <w:br/>
-        <w:br/>
-        <w:t xml:space="preserve">    checkConnection();</w:t>
-        <w:br/>
-        <w:br/>
-        <w:t xml:space="preserve">    function updateMasterToggleUI(enabled) {</w:t>
-        <w:br/>
-        <w:t xml:space="preserve">        if (enabled) {</w:t>
-        <w:br/>
-        <w:t xml:space="preserve">            mainContent.classList.remove('disabled');</w:t>
-        <w:br/>
-        <w:t xml:space="preserve">            masterToggleCard.classList.remove('disabled');</w:t>
-        <w:br/>
-        <w:t xml:space="preserve">            masterHint.textContent = '\u63d2\u4ef6\u5df2\u542f\u7528\uff0c\u6b63\u5728\u76d1\u63a7\u9875\u9762';</w:t>
-        <w:br/>
-        <w:t xml:space="preserve">        } else {</w:t>
-        <w:br/>
-        <w:t xml:space="preserve">            mainContent.classList.add('disabled');</w:t>
-        <w:br/>
-        <w:t xml:space="preserve">            masterToggleCard.classList.add('disabled');</w:t>
-        <w:br/>
-        <w:t xml:space="preserve">            masterHint.textContent = '\u63d2\u4ef6\u5df2\u5173\u95ed\uff0c\u9875\u9762\u4e0a\u7684\u6309\u94ae\u5df2\u5168\u90e8\u79fb\u9664';</w:t>
-        <w:br/>
-        <w:t xml:space="preserve">        }</w:t>
-      </w:r>
-    </w:p>
-    <w:p>
-      <w:pPr>
-        <w:spacing w:after="0" w:before="0"/>
-      </w:pPr>
-      <w:r>
-        <w:rPr>
-          <w:rFonts w:ascii="Consolas" w:hAnsi="Consolas"/>
-          <w:color w:val="282828"/>
-          <w:sz w:val="15"/>
-        </w:rPr>
-        <w:t xml:space="preserve">    }</w:t>
-        <w:br/>
-        <w:br/>
-        <w:t xml:space="preserve">    extEnabledToggle.addEventListener('change', function() {</w:t>
-        <w:br/>
-        <w:t xml:space="preserve">        var enabled = extEnabledToggle.checked;</w:t>
-        <w:br/>
-        <w:t xml:space="preserve">        chrome.storage.local.set({ extensionEnabled: enabled });</w:t>
-        <w:br/>
-        <w:t xml:space="preserve">        updateMasterToggleUI(enabled);</w:t>
+        <w:t xml:space="preserve">    extToggle.addEventListener('change', function() {</w:t>
+        <w:br/>
+        <w:t xml:space="preserve">        extensionEnabled = extToggle.checked;</w:t>
+        <w:br/>
+        <w:t xml:space="preserve">        chrome.storage.local.set({ extensionEnabled: extensionEnabled });</w:t>
         <w:br/>
         <w:t xml:space="preserve">        chrome.tabs.query({}, function(tabs) {</w:t>
         <w:br/>
         <w:t xml:space="preserve">            tabs.forEach(function(tab) {</w:t>
         <w:br/>
-        <w:t xml:space="preserve">                try {</w:t>
-        <w:br/>
-        <w:t xml:space="preserve">                    chrome.tabs.sendMessage(tab.id, { type: 'toggle-extension', enabled: enabled });</w:t>
-        <w:br/>
-        <w:t xml:space="preserve">                } catch (_) {}</w:t>
-        <w:br/>
-        <w:t xml:space="preserve">            });</w:t>
-        <w:br/>
-        <w:t xml:space="preserve">        });</w:t>
-        <w:br/>
-        <w:t xml:space="preserve">        showResult(enabled ? '\u2705 \u63d2\u4ef6\u5df2\u542f\u7528' : '\u23f8 \u63d2\u4ef6\u5df2\u5173\u95ed', enabled);</w:t>
-        <w:br/>
-        <w:t xml:space="preserve">    });</w:t>
-        <w:br/>
-        <w:br/>
-        <w:t xml:space="preserve">    // ========== \u591a\u7a97\u53e3\u7aef\u53e3\u626b\u63cf ==========</w:t>
-        <w:br/>
-        <w:t xml:space="preserve">    function scanAllPorts(callback) {</w:t>
-        <w:br/>
-        <w:t xml:space="preserve">        var basePort = 9960;</w:t>
-        <w:br/>
-        <w:t xml:space="preserve">        var instances = [];</w:t>
-        <w:br/>
-        <w:t xml:space="preserve">        var pending = 10;</w:t>
-        <w:br/>
-        <w:t xml:space="preserve">        for (var i = 0; i &lt; 10; i++) {</w:t>
-        <w:br/>
-        <w:t xml:space="preserve">            (function(port) {</w:t>
-        <w:br/>
-        <w:t xml:space="preserve">                fetch('http://127.0.0.1:' + port + '/status', { signal: AbortSignal.timeout(500) })</w:t>
-        <w:br/>
-        <w:t xml:space="preserve">                    .then(function(resp) { return resp.json(); })</w:t>
-        <w:br/>
-        <w:t xml:space="preserve">                    .then(function(data) {</w:t>
-        <w:br/>
-        <w:t xml:space="preserve">                        instances.push({ port: port, workspace: data.workspace || '', wsClients: data.wsClients || 0 });</w:t>
-        <w:br/>
-        <w:t xml:space="preserve">                    })</w:t>
-        <w:br/>
-        <w:t xml:space="preserve">                    .catch(function() {})</w:t>
-        <w:br/>
-        <w:t xml:space="preserve">                    .finally(function() {</w:t>
-      </w:r>
-    </w:p>
-    <w:p>
-      <w:pPr>
-        <w:spacing w:after="0" w:before="0"/>
-      </w:pPr>
-      <w:r>
-        <w:rPr>
-          <w:rFonts w:ascii="Consolas" w:hAnsi="Consolas"/>
-          <w:color w:val="282828"/>
-          <w:sz w:val="15"/>
-        </w:rPr>
-        <w:t xml:space="preserve">                        pending--;</w:t>
-        <w:br/>
-        <w:t xml:space="preserve">                        if (pending === 0) {</w:t>
-        <w:br/>
-        <w:t xml:space="preserve">                            instances.sort(function(a, b) { return a.port - b.port; });</w:t>
-        <w:br/>
-        <w:t xml:space="preserve">                            discoveredInstances = instances;</w:t>
-        <w:br/>
-        <w:t xml:space="preserve">                            callback(instances);</w:t>
-        <w:br/>
-        <w:t xml:space="preserve">                        }</w:t>
-        <w:br/>
-        <w:t xml:space="preserve">                    });</w:t>
-        <w:br/>
-        <w:t xml:space="preserve">            })(basePort + i);</w:t>
-        <w:br/>
-        <w:t xml:space="preserve">        }</w:t>
-        <w:br/>
-        <w:t xml:space="preserve">    }</w:t>
-        <w:br/>
-        <w:br/>
-        <w:t xml:space="preserve">    function checkConnection() {</w:t>
-        <w:br/>
-        <w:t xml:space="preserve">        statusLabel.textContent = '\u68c0\u67e5\u4e2d...';</w:t>
-        <w:br/>
-        <w:t xml:space="preserve">        scanAllPorts(function(instances) {</w:t>
-        <w:br/>
-        <w:t xml:space="preserve">            if (instances.length === 0) {</w:t>
-        <w:br/>
-        <w:t xml:space="preserve">                statusDot.className = 'dot dot-red';</w:t>
-        <w:br/>
-        <w:t xml:space="preserve">                statusLabel.textContent = '\u672a\u8fde\u63a5 \u2014 \u68c0\u67e5 VS Code \u6269\u5c55\u662f\u5426\u542f\u52a8';</w:t>
-        <w:br/>
-        <w:t xml:space="preserve">                workspaceInfo.textContent = '';</w:t>
-        <w:br/>
-        <w:t xml:space="preserve">                currentWorkspace = '';</w:t>
-        <w:br/>
-        <w:t xml:space="preserve">                instanceListSection.innerHTML = '';</w:t>
-        <w:br/>
-        <w:t xml:space="preserve">                renderProjectList();</w:t>
-        <w:br/>
-        <w:t xml:space="preserve">                return;</w:t>
-        <w:br/>
-        <w:t xml:space="preserve">            }</w:t>
-        <w:br/>
-        <w:br/>
-        <w:t xml:space="preserve">            // \u627e\u5230\u5f53\u524d\u7aef\u53e3\u5bf9\u5e94\u7684\u5b9e\u4f8b\uff0c\u5982\u679c\u5f53\u524d\u7aef\u53e3\u4e0d\u5728\u5217\u8868\u4e2d\u5219\u7528\u7b2c\u4e00\u4e2a</w:t>
-        <w:br/>
-        <w:t xml:space="preserve">            var active = instances.find(function(inst) { return inst.port === currentPort; }) || instances[0];</w:t>
-        <w:br/>
-        <w:t xml:space="preserve">            currentPort = active.port;</w:t>
-        <w:br/>
-        <w:t xml:space="preserve">            currentWorkspace = active.workspace;</w:t>
-        <w:br/>
-        <w:br/>
-        <w:t xml:space="preserve">            chrome.storage.local.set({ serverPort: currentPort });</w:t>
-      </w:r>
-    </w:p>
-    <w:p>
-      <w:pPr>
-        <w:spacing w:after="0" w:before="0"/>
-      </w:pPr>
-      <w:r>
-        <w:rPr>
-          <w:rFonts w:ascii="Consolas" w:hAnsi="Consolas"/>
-          <w:color w:val="282828"/>
-          <w:sz w:val="15"/>
-        </w:rPr>
-        <w:br/>
-        <w:t xml:space="preserve">            statusDot.className = 'dot dot-green';</w:t>
-        <w:br/>
-        <w:t xml:space="preserve">            if (instances.length === 1) {</w:t>
-        <w:br/>
-        <w:t xml:space="preserve">                statusLabel.textContent = 'VS Code \u5df2\u8fde\u63a5 (\u7aef\u53e3:' + currentPort + ')';</w:t>
-        <w:br/>
-        <w:t xml:space="preserve">            } else {</w:t>
-        <w:br/>
-        <w:t xml:space="preserve">                statusLabel.textContent = instances.length + ' \u4e2a VS Code \u7a97\u53e3 (\u5f53\u524d:' + currentPort + ')';</w:t>
-        <w:br/>
-        <w:t xml:space="preserve">            }</w:t>
-        <w:br/>
-        <w:br/>
-        <w:t xml:space="preserve">            var folderName = currentWorkspace.split(/[\/\\]/).pop() || currentWorkspace;</w:t>
-        <w:br/>
-        <w:t xml:space="preserve">            workspaceInfo.textContent = currentWorkspace ? '\ud83d\udcc2 ' + folderName : '';</w:t>
-        <w:br/>
-        <w:t xml:space="preserve">            workspaceInfo.title = currentWorkspace;</w:t>
-        <w:br/>
-        <w:br/>
-        <w:t xml:space="preserve">            renderInstanceList(instances);</w:t>
-        <w:br/>
-        <w:t xml:space="preserve">            renderProjectList();</w:t>
-        <w:br/>
-        <w:t xml:space="preserve">        });</w:t>
-        <w:br/>
-        <w:t xml:space="preserve">    }</w:t>
-        <w:br/>
-        <w:br/>
-        <w:t xml:space="preserve">    function renderInstanceList(instances) {</w:t>
-        <w:br/>
-        <w:t xml:space="preserve">        instanceListSection.innerHTML = '';</w:t>
-        <w:br/>
-        <w:t xml:space="preserve">        if (instances.length &lt;= 1) return;</w:t>
-        <w:br/>
-        <w:br/>
-        <w:t xml:space="preserve">        var title = document.createElement('div');</w:t>
-        <w:br/>
-        <w:t xml:space="preserve">        title.className = 'section-title';</w:t>
-        <w:br/>
-        <w:t xml:space="preserve">        title.textContent = '\u70b9\u51fb\u5207\u6362\u76ee\u6807\u7a97\u53e3\uff08\u4ee3\u7801\u53d1\u5230\u54ea\u4e2a VS Code\uff09';</w:t>
-        <w:br/>
-        <w:t xml:space="preserve">        instanceListSection.appendChild(title);</w:t>
-        <w:br/>
-        <w:br/>
-        <w:t xml:space="preserve">        instances.forEach(function(inst) {</w:t>
-        <w:br/>
-        <w:t xml:space="preserve">            var item = document.createElement('div');</w:t>
-        <w:br/>
-        <w:t xml:space="preserve">            var isActive = inst.port === currentPort;</w:t>
-        <w:br/>
-        <w:t xml:space="preserve">            item.className = 'instance-item' + (isActive ? ' active' : '');</w:t>
-      </w:r>
-    </w:p>
-    <w:p>
-      <w:pPr>
-        <w:spacing w:after="0" w:before="0"/>
-      </w:pPr>
-      <w:r>
-        <w:rPr>
-          <w:rFonts w:ascii="Consolas" w:hAnsi="Consolas"/>
-          <w:color w:val="282828"/>
-          <w:sz w:val="15"/>
-        </w:rPr>
-        <w:br/>
-        <w:t xml:space="preserve">            var name = document.createElement('span');</w:t>
-        <w:br/>
-        <w:t xml:space="preserve">            name.className = 'instance-name';</w:t>
-        <w:br/>
-        <w:t xml:space="preserve">            var folderName = inst.workspace.split(/[\/\\]/).pop() || inst.workspace;</w:t>
-        <w:br/>
-        <w:t xml:space="preserve">            name.textContent = (isActive ? '\u25cf ' : '\u25cb ') + folderName;</w:t>
-        <w:br/>
-        <w:t xml:space="preserve">            name.title = inst.workspace;</w:t>
-        <w:br/>
-        <w:t xml:space="preserve">            name.style.color = isActive ? '#89b4fa' : '#cdd6f4';</w:t>
-        <w:br/>
-        <w:br/>
-        <w:t xml:space="preserve">            var portLabel = document.createElement('span');</w:t>
-        <w:br/>
-        <w:t xml:space="preserve">            portLabel.className = 'instance-port';</w:t>
-        <w:br/>
-        <w:t xml:space="preserve">            portLabel.textContent = ':' + inst.port;</w:t>
-        <w:br/>
-        <w:br/>
-        <w:t xml:space="preserve">            item.appendChild(name);</w:t>
-        <w:br/>
-        <w:t xml:space="preserve">            item.appendChild(portLabel);</w:t>
-        <w:br/>
-        <w:br/>
-        <w:t xml:space="preserve">            item.addEventListener('click', function() {</w:t>
-        <w:br/>
-        <w:t xml:space="preserve">                currentPort = inst.port;</w:t>
-        <w:br/>
-        <w:t xml:space="preserve">                currentWorkspace = inst.workspace;</w:t>
-        <w:br/>
-        <w:t xml:space="preserve">                chrome.storage.local.set({ serverPort: inst.port });</w:t>
-        <w:br/>
-        <w:br/>
-        <w:t xml:space="preserve">                // \u901a\u77e5\u6240\u6709\u9875\u9762\u7684 content.js \u91cd\u8fde WebSocket</w:t>
-        <w:br/>
-        <w:t xml:space="preserve">                chrome.tabs.query({}, function(tabs) {</w:t>
-        <w:br/>
-        <w:t xml:space="preserve">                    tabs.forEach(function(tab) {</w:t>
-        <w:br/>
-        <w:t xml:space="preserve">                        try {</w:t>
-        <w:br/>
-        <w:t xml:space="preserve">                            chrome.tabs.sendMessage(tab.id, { type: 'reconnect-ws', port: inst.port });</w:t>
-        <w:br/>
-        <w:t xml:space="preserve">                        } catch (_) {}</w:t>
-        <w:br/>
-        <w:t xml:space="preserve">                    });</w:t>
-        <w:br/>
-        <w:t xml:space="preserve">                });</w:t>
-        <w:br/>
-        <w:br/>
-        <w:t xml:space="preserve">                showResult('\u2705 \u5df2\u5207\u6362\u5230: ' + folderName + ' (:' + inst.port + ')', true);</w:t>
-      </w:r>
-    </w:p>
-    <w:p>
-      <w:pPr>
-        <w:spacing w:after="0" w:before="0"/>
-      </w:pPr>
-      <w:r>
-        <w:rPr>
-          <w:rFonts w:ascii="Consolas" w:hAnsi="Consolas"/>
-          <w:color w:val="282828"/>
-          <w:sz w:val="15"/>
-        </w:rPr>
-        <w:t xml:space="preserve">                renderInstanceList(instances);</w:t>
-        <w:br/>
-        <w:br/>
-        <w:t xml:space="preserve">                var fn = inst.workspace.split(/[\/\\]/).pop() || inst.workspace;</w:t>
-        <w:br/>
-        <w:t xml:space="preserve">                statusLabel.textContent = instances.length + ' \u4e2a VS Code \u7a97\u53e3 (\u5f53\u524d:' + inst.port + ')';</w:t>
-        <w:br/>
-        <w:t xml:space="preserve">                workspaceInfo.textContent = '\ud83d\udcc2 ' + fn;</w:t>
-        <w:br/>
-        <w:t xml:space="preserve">                workspaceInfo.title = inst.workspace;</w:t>
-        <w:br/>
-        <w:t xml:space="preserve">            });</w:t>
-        <w:br/>
-        <w:br/>
-        <w:t xml:space="preserve">            instanceListSection.appendChild(item);</w:t>
-        <w:br/>
-        <w:t xml:space="preserve">        });</w:t>
-        <w:br/>
-        <w:t xml:space="preserve">    }</w:t>
-        <w:br/>
-        <w:br/>
-        <w:t xml:space="preserve">    refreshBtn.addEventListener('click', checkConnection);</w:t>
-        <w:br/>
-        <w:br/>
-        <w:t xml:space="preserve">    autoJumpToggle.addEventListener('change', function() {</w:t>
-        <w:br/>
-        <w:t xml:space="preserve">        chrome.storage.local.set({ autoJump: autoJumpToggle.checked });</w:t>
-        <w:br/>
-        <w:t xml:space="preserve">        chrome.runtime.sendMessage({ type: 'update-setting', key: 'autoJump', value: autoJumpToggle.checked });</w:t>
-        <w:br/>
-        <w:t xml:space="preserve">        showResult(autoJumpToggle.checked ? '\u5df2\u5f00\u542f\u81ea\u52a8\u8df3\u8f6c' : '\u5df2\u5173\u95ed\u81ea\u52a8\u8df3\u8f6c', true);</w:t>
-        <w:br/>
-        <w:t xml:space="preserve">    });</w:t>
-        <w:br/>
-        <w:br/>
-        <w:t xml:space="preserve">    autoScanToggle.addEventListener('change', function() {</w:t>
-        <w:br/>
-        <w:t xml:space="preserve">        chrome.storage.local.set({ autoScan: autoScanToggle.checked });</w:t>
-        <w:br/>
-        <w:t xml:space="preserve">        chrome.tabs.query({ active: true, currentWindow: true }, function(tabs) {</w:t>
-        <w:br/>
-        <w:t xml:space="preserve">            if (tabs[0]) {</w:t>
-        <w:br/>
-        <w:t xml:space="preserve">                chrome.tabs.sendMessage(tabs[0].id, { type: 'toggle-auto-scan', enabled: autoScanToggle.checked });</w:t>
-        <w:br/>
-        <w:t xml:space="preserve">            }</w:t>
-        <w:br/>
-        <w:t xml:space="preserve">        });</w:t>
-        <w:br/>
-        <w:t xml:space="preserve">        showResult(autoScanToggle.checked ? '\u5df2\u5f00\u542f\u81ea\u52a8\u68c0\u6d4b' : '\u5df2\u5173\u95ed\u81ea\u52a8\u68c0\u6d4b', true);</w:t>
-        <w:br/>
-        <w:t xml:space="preserve">    });</w:t>
-        <w:br/>
-      </w:r>
-    </w:p>
-    <w:p>
-      <w:pPr>
-        <w:spacing w:after="0" w:before="0"/>
-      </w:pPr>
-      <w:r>
-        <w:rPr>
-          <w:rFonts w:ascii="Consolas" w:hAnsi="Consolas"/>
-          <w:color w:val="282828"/>
-          <w:sz w:val="15"/>
-        </w:rPr>
-        <w:t xml:space="preserve">    btnScan.addEventListener('click', function() {</w:t>
-        <w:br/>
-        <w:t xml:space="preserve">        chrome.tabs.query({ active: true, currentWindow: true }, function(tabs) {</w:t>
-        <w:br/>
-        <w:t xml:space="preserve">            if (tabs[0]) {</w:t>
-        <w:br/>
-        <w:t xml:space="preserve">                chrome.tabs.sendMessage(tabs[0].id, { type: 'scan-page-only' });</w:t>
-        <w:br/>
-        <w:t xml:space="preserve">                showResult('\u5df2\u89e6\u53d1\u9875\u9762\u626b\u63cf', true);</w:t>
-        <w:br/>
-        <w:t xml:space="preserve">            }</w:t>
-        <w:br/>
-        <w:t xml:space="preserve">        });</w:t>
-        <w:br/>
-        <w:t xml:space="preserve">    });</w:t>
-        <w:br/>
-        <w:br/>
-        <w:t xml:space="preserve">    btnRestart.addEventListener('click', function() {</w:t>
-        <w:br/>
-        <w:t xml:space="preserve">        chrome.runtime.sendMessage({ type: 'restart-server' }, function(resp) {</w:t>
-        <w:br/>
-        <w:t xml:space="preserve">            showResult(resp &amp;&amp; resp.success ? '\u91cd\u542f\u6307\u4ee4\u5df2\u53d1\u9001' : '\u53d1\u9001\u5931\u8d25', resp &amp;&amp; resp.success);</w:t>
-        <w:br/>
-        <w:t xml:space="preserve">            setTimeout(checkConnection, 2000);</w:t>
-        <w:br/>
-        <w:t xml:space="preserve">        });</w:t>
-        <w:br/>
-        <w:t xml:space="preserve">    });</w:t>
-        <w:br/>
-        <w:br/>
-        <w:t xml:space="preserve">    btnUndo.addEventListener('click', function() {</w:t>
-        <w:br/>
-        <w:t xml:space="preserve">        chrome.runtime.sendMessage({ type: 'undo-last-change' }, function(resp) {</w:t>
-        <w:br/>
-        <w:t xml:space="preserve">            showResult(resp &amp;&amp; resp.success ? '\u64a4\u9500\u6307\u4ee4\u5df2\u53d1\u9001' : (resp ? resp.message : '\u5931\u8d25'), resp &amp;&amp; resp.success);</w:t>
-        <w:br/>
-        <w:t xml:space="preserve">        });</w:t>
-        <w:br/>
-        <w:t xml:space="preserve">    });</w:t>
-        <w:br/>
-        <w:br/>
-        <w:t xml:space="preserve">    btnOpenLog.addEventListener('click', function() {</w:t>
-        <w:br/>
-        <w:t xml:space="preserve">        chrome.runtime.sendMessage({ type: 'open-log' }, function() {</w:t>
-        <w:br/>
-        <w:t xml:space="preserve">            showResult('\u5df2\u53d1\u9001\u6253\u5f00\u65e5\u5fd7\u6307\u4ee4', true);</w:t>
-        <w:br/>
-        <w:t xml:space="preserve">        });</w:t>
-        <w:br/>
-        <w:t xml:space="preserve">    });</w:t>
-        <w:br/>
-        <w:br/>
-        <w:t xml:space="preserve">    // ========== \u590d\u5236\u6700\u8fd1AI\u56de\u590d ==========</w:t>
-        <w:br/>
-        <w:t xml:space="preserve">    var btnCopyReply = document.getElementById('btn-copy-reply');</w:t>
-      </w:r>
-    </w:p>
-    <w:p>
-      <w:pPr>
-        <w:spacing w:after="0" w:before="0"/>
-      </w:pPr>
-      <w:r>
-        <w:rPr>
-          <w:rFonts w:ascii="Consolas" w:hAnsi="Consolas"/>
-          <w:color w:val="282828"/>
-          <w:sz w:val="15"/>
-        </w:rPr>
-        <w:t xml:space="preserve">    if (btnCopyReply) {</w:t>
-        <w:br/>
-        <w:t xml:space="preserve">        btnCopyReply.addEventListener('click', function() {</w:t>
-        <w:br/>
-        <w:t xml:space="preserve">            chrome.tabs.query({ active: true, currentWindow: true }, function(tabs) {</w:t>
-        <w:br/>
-        <w:t xml:space="preserve">                if (!tabs[0]) return;</w:t>
-        <w:br/>
-        <w:t xml:space="preserve">                chrome.tabs.sendMessage(tabs[0].id, { type: 'collect-last-reply' }, function(resp) {</w:t>
-        <w:br/>
-        <w:t xml:space="preserve">                    if (resp &amp;&amp; resp.text) {</w:t>
-        <w:br/>
-        <w:t xml:space="preserve">                        navigator.clipboard.writeText(resp.text).then(function() {</w:t>
-        <w:br/>
-        <w:t xml:space="preserve">                            showResult('\u2705 \u5df2\u590d\u5236(' + resp.text.length + '\u5b57\u7b26)', true);</w:t>
-        <w:br/>
-        <w:t xml:space="preserve">                        }).catch(function() { showResult('\u274c \u590d\u5236\u5931\u8d25', false); });</w:t>
-        <w:br/>
-        <w:t xml:space="preserve">                    } else {</w:t>
-        <w:br/>
-        <w:t xml:space="preserve">                        showResult('\u274c \u672a\u627e\u5230AI\u56de\u590d', false);</w:t>
-        <w:br/>
-        <w:t xml:space="preserve">                    }</w:t>
-        <w:br/>
-        <w:t xml:space="preserve">                });</w:t>
-        <w:br/>
-        <w:t xml:space="preserve">            });</w:t>
-        <w:br/>
-        <w:t xml:space="preserve">        });</w:t>
-        <w:br/>
-        <w:t xml:space="preserve">    }</w:t>
-        <w:br/>
-        <w:br/>
-        <w:t xml:space="preserve">    // ========== \u6536\u96c6\u8c03\u8bd5\u4fe1\u606f ==========</w:t>
-        <w:br/>
-        <w:t xml:space="preserve">    var btnDebugInfo = document.getElementById('btn-debug-info');</w:t>
-        <w:br/>
-        <w:t xml:space="preserve">    if (btnDebugInfo) {</w:t>
-        <w:br/>
-        <w:t xml:space="preserve">        btnDebugInfo.addEventListener('click', function() {</w:t>
-        <w:br/>
-        <w:t xml:space="preserve">            chrome.tabs.query({ active: true, currentWindow: true }, function(tabs) {</w:t>
-        <w:br/>
-        <w:t xml:space="preserve">                if (!tabs[0]) return;</w:t>
-        <w:br/>
-        <w:t xml:space="preserve">                chrome.tabs.sendMessage(tabs[0].id, { type: 'collect-debug-info' }, function(resp) {</w:t>
-        <w:br/>
-        <w:t xml:space="preserve">                    var info = '=== AI Code Agent ===\n';</w:t>
-        <w:br/>
-        <w:t xml:space="preserve">                    info += 'Page: ' + tabs[0].url + '\n';</w:t>
-        <w:br/>
-        <w:t xml:space="preserve">                    info += 'Port: ' + currentPort + '\n';</w:t>
-        <w:br/>
-        <w:t xml:space="preserve">                    info += 'Workspace: ' + currentWorkspace + '\n';</w:t>
-        <w:br/>
-        <w:t xml:space="preserve">                    info += 'Instances: ' + discoveredInstances.length + '\n';</w:t>
-        <w:br/>
-        <w:t xml:space="preserve">                    if (resp) {</w:t>
-      </w:r>
-    </w:p>
-    <w:p>
-      <w:pPr>
-        <w:spacing w:after="0" w:before="0"/>
-      </w:pPr>
-      <w:r>
-        <w:rPr>
-          <w:rFonts w:ascii="Consolas" w:hAnsi="Consolas"/>
-          <w:color w:val="282828"/>
-          <w:sz w:val="15"/>
-        </w:rPr>
-        <w:t xml:space="preserve">                        info += 'Version: ' + (resp.version || '?') + '\n';</w:t>
-        <w:br/>
-        <w:t xml:space="preserve">                        info += 'Enabled: ' + resp.enabled + '\n';</w:t>
-        <w:br/>
-        <w:t xml:space="preserve">                        info += 'AutoScan: ' + resp.autoScan + '\n';</w:t>
-        <w:br/>
-        <w:t xml:space="preserve">                        info += 'WS: ' + resp.wsConnected + '\n';</w:t>
-        <w:br/>
-        <w:t xml:space="preserve">                        info += 'CodeBlocks: ' + resp.codeBlockCount + '\n';</w:t>
-        <w:br/>
-        <w:t xml:space="preserve">                        info += 'Processed: ' + resp.processedCount + '\n';</w:t>
-        <w:br/>
-        <w:t xml:space="preserve">                        info += 'Buttons: ' + resp.buttonCount + '\n';</w:t>
-        <w:br/>
-        <w:t xml:space="preserve">                        info += 'Unprocessed: ' + resp.unprocessedCount + '\n';</w:t>
-        <w:br/>
-        <w:t xml:space="preserve">                        if (resp.unprocessedSamples &amp;&amp; resp.unprocessedSamples.length &gt; 0) {</w:t>
-        <w:br/>
-        <w:t xml:space="preserve">                            info += '--- samples ---\n';</w:t>
-        <w:br/>
-        <w:t xml:space="preserve">                            resp.unprocessedSamples.forEach(function(s, i) {</w:t>
-        <w:br/>
-        <w:t xml:space="preserve">                                info += (i+1) + '. ' + s.tag + '(' + s.length + '): ' + s.preview + '\n';</w:t>
-        <w:br/>
-        <w:t xml:space="preserve">                            });</w:t>
-        <w:br/>
-        <w:t xml:space="preserve">                        }</w:t>
-        <w:br/>
-        <w:t xml:space="preserve">                    } else {</w:t>
-        <w:br/>
-        <w:t xml:space="preserve">                        info += 'content.js: not loaded\n';</w:t>
-        <w:br/>
-        <w:t xml:space="preserve">                    }</w:t>
-        <w:br/>
-        <w:t xml:space="preserve">                    navigator.clipboard.writeText(info).then(function() {</w:t>
-        <w:br/>
-        <w:t xml:space="preserve">                        showResult('\u2705 \u8c03\u8bd5\u4fe1\u606f\u5df2\u590d\u5236', true);</w:t>
-        <w:br/>
-        <w:t xml:space="preserve">                    }).catch(function() { showResult('\u274c \u590d\u5236\u5931\u8d25', false); });</w:t>
-        <w:br/>
-        <w:t xml:space="preserve">                });</w:t>
-        <w:br/>
-        <w:t xml:space="preserve">            });</w:t>
-        <w:br/>
-        <w:t xml:space="preserve">        });</w:t>
-        <w:br/>
-        <w:t xml:space="preserve">    }</w:t>
-        <w:br/>
-        <w:br/>
-        <w:t xml:space="preserve">    var btnReloadPage = document.getElementById('btn-reload-page');</w:t>
-        <w:br/>
-        <w:t xml:space="preserve">    if (btnReloadPage) {</w:t>
-        <w:br/>
-        <w:t xml:space="preserve">        btnReloadPage.addEventListener('click', function() {</w:t>
-        <w:br/>
-        <w:t xml:space="preserve">            chrome.tabs.query({ active: true, currentWindow: true }, function(tabs) {</w:t>
-        <w:br/>
-        <w:t xml:space="preserve">                if (tabs[0]) { chrome.tabs.reload(tabs[0].id); showResult('\u9875\u9762\u5df2\u5237\u65b0', true); }</w:t>
+        <w:t xml:space="preserve">                try { chrome.tabs.sendMessage(tab.id, { type: 'toggle-extension', enabled: extensionEnabled }); } catch (_) {}</w:t>
       </w:r>
     </w:p>
     <w:p>
@@ -11354,58 +10824,58 @@
         <w:br/>
         <w:t xml:space="preserve">        });</w:t>
         <w:br/>
-        <w:t xml:space="preserve">    }</w:t>
-        <w:br/>
-        <w:br/>
-        <w:t xml:space="preserve">    var btnReloadExt = document.getElementById('btn-reload-ext');</w:t>
-        <w:br/>
-        <w:t xml:space="preserve">    if (btnReloadExt) {</w:t>
-        <w:br/>
-        <w:t xml:space="preserve">        btnReloadExt.addEventListener('click', function() {</w:t>
-        <w:br/>
-        <w:t xml:space="preserve">            showResult('\u63d2\u4ef6\u91cd\u8f7d\u4e2d...', true);</w:t>
-        <w:br/>
-        <w:t xml:space="preserve">            setTimeout(function() { chrome.runtime.reload(); }, 500);</w:t>
+        <w:t xml:space="preserve">        showResult(extensionEnabled ? '\u2705 \u5df2\u542f\u7528' : '\u23f8 \u5df2\u5173\u95ed', extensionEnabled);</w:t>
+        <w:br/>
+        <w:t xml:space="preserve">    });</w:t>
+        <w:br/>
+        <w:br/>
+        <w:t xml:space="preserve">    autoJumpToggle.addEventListener('change', function() {</w:t>
+        <w:br/>
+        <w:t xml:space="preserve">        chrome.storage.local.set({ autoJump: autoJumpToggle.checked });</w:t>
+        <w:br/>
+        <w:t xml:space="preserve">        chrome.tabs.query({}, function(tabs) {</w:t>
+        <w:br/>
+        <w:t xml:space="preserve">            tabs.forEach(function(tab) {</w:t>
+        <w:br/>
+        <w:t xml:space="preserve">                try { chrome.tabs.sendMessage(tab.id, { type: 'update-auto-jump', enabled: autoJumpToggle.checked }); } catch (_) {}</w:t>
+        <w:br/>
+        <w:t xml:space="preserve">            });</w:t>
         <w:br/>
         <w:t xml:space="preserve">        });</w:t>
         <w:br/>
-        <w:t xml:space="preserve">    }</w:t>
-        <w:br/>
-        <w:br/>
-        <w:t xml:space="preserve">    // ========== \u9879\u76ee\u5feb\u6377\u65b9\u5f0f ==========</w:t>
-        <w:br/>
-        <w:t xml:space="preserve">    function getSavedProjects(callback) {</w:t>
-        <w:br/>
-        <w:t xml:space="preserve">        chrome.storage.local.get(['savedProjects'], function(r) { callback(r.savedProjects || []); });</w:t>
-        <w:br/>
-        <w:t xml:space="preserve">    }</w:t>
-        <w:br/>
-        <w:t xml:space="preserve">    function saveProjects(projects) {</w:t>
-        <w:br/>
-        <w:t xml:space="preserve">        chrome.storage.local.set({ savedProjects: projects });</w:t>
-        <w:br/>
-        <w:t xml:space="preserve">    }</w:t>
-        <w:br/>
-        <w:br/>
-        <w:t xml:space="preserve">    function renderProjectList(projects) {</w:t>
-        <w:br/>
-        <w:t xml:space="preserve">        if (projects === undefined) { getSavedProjects(renderProjectList); return; }</w:t>
-        <w:br/>
-        <w:t xml:space="preserve">        projectList.innerHTML = '';</w:t>
-        <w:br/>
-        <w:t xml:space="preserve">        if (projects.length === 0) {</w:t>
-        <w:br/>
-        <w:t xml:space="preserve">            projectList.innerHTML = '&lt;div style="color:#6c7086;font-size:11px;padding:4px 0"&gt;\u6682\u65e0\u4fdd\u5b58\u7684\u9879\u76ee\u8def\u5f84&lt;/div&gt;';</w:t>
-        <w:br/>
-        <w:t xml:space="preserve">            return;</w:t>
-        <w:br/>
-        <w:t xml:space="preserve">        }</w:t>
-        <w:br/>
-        <w:t xml:space="preserve">        projects.forEach(function(p, i) {</w:t>
-        <w:br/>
-        <w:t xml:space="preserve">            var item = document.createElement('div');</w:t>
-        <w:br/>
-        <w:t xml:space="preserve">            // \u68c0\u67e5\u8fd9\u4e2a\u8def\u5f84\u662f\u5426\u5df2\u7ecf\u5728\u67d0\u4e2a VS Code \u7a97\u53e3\u4e2d\u6253\u5f00</w:t>
+        <w:t xml:space="preserve">        showResult(autoJumpToggle.checked ? '\u5df2\u5f00\u542f\u81ea\u52a8\u8df3\u8f6c' : '\u5df2\u5173\u95ed\u81ea\u52a8\u8df3\u8f6c', true);</w:t>
+        <w:br/>
+        <w:t xml:space="preserve">    });</w:t>
+        <w:br/>
+        <w:br/>
+        <w:t xml:space="preserve">    autoScanToggle.addEventListener('change', function() {</w:t>
+        <w:br/>
+        <w:t xml:space="preserve">        chrome.storage.local.set({ autoScan: autoScanToggle.checked });</w:t>
+        <w:br/>
+        <w:t xml:space="preserve">        chrome.tabs.query({ active: true, currentWindow: true }, function(tabs) {</w:t>
+        <w:br/>
+        <w:t xml:space="preserve">            if (tabs[0]) chrome.tabs.sendMessage(tabs[0].id, { type: 'toggle-auto-scan', enabled: autoScanToggle.checked });</w:t>
+        <w:br/>
+        <w:t xml:space="preserve">        });</w:t>
+        <w:br/>
+        <w:t xml:space="preserve">    });</w:t>
+        <w:br/>
+        <w:br/>
+        <w:t xml:space="preserve">    function scanAllPorts(callback) {</w:t>
+        <w:br/>
+        <w:t xml:space="preserve">        var instances = [];</w:t>
+        <w:br/>
+        <w:t xml:space="preserve">        var pending = 10;</w:t>
+        <w:br/>
+        <w:t xml:space="preserve">        for (var i = 0; i &lt; 10; i++) {</w:t>
+        <w:br/>
+        <w:t xml:space="preserve">            (function(port) {</w:t>
+        <w:br/>
+        <w:t xml:space="preserve">                fetch('http://127.0.0.1:' + port + '/status', { signal: AbortSignal.timeout(500) })</w:t>
+        <w:br/>
+        <w:t xml:space="preserve">                    .then(function(r) { return r.json(); })</w:t>
+        <w:br/>
+        <w:t xml:space="preserve">                    .then(function(d) {</w:t>
       </w:r>
     </w:p>
     <w:p>
@@ -11418,63 +10888,63 @@
           <w:color w:val="282828"/>
           <w:sz w:val="15"/>
         </w:rPr>
-        <w:t xml:space="preserve">            var matchedInstance = discoveredInstances.find(function(inst) {</w:t>
-        <w:br/>
-        <w:t xml:space="preserve">                return inst.workspace &amp;&amp; (inst.workspace === p || inst.workspace.replace(/\\/g, '/') === p.replace(/\\/g, '/'));</w:t>
-        <w:br/>
-        <w:t xml:space="preserve">            });</w:t>
-        <w:br/>
-        <w:t xml:space="preserve">            var isOpen = !!matchedInstance;</w:t>
-        <w:br/>
-        <w:t xml:space="preserve">            item.className = 'project-item' + (isOpen ? ' active' : '');</w:t>
-        <w:br/>
-        <w:br/>
-        <w:t xml:space="preserve">            var name = document.createElement('span');</w:t>
-        <w:br/>
-        <w:t xml:space="preserve">            name.className = 'project-item-name';</w:t>
-        <w:br/>
-        <w:t xml:space="preserve">            var folderName = p.split(/[\/\\]/).pop() || p;</w:t>
-        <w:br/>
-        <w:t xml:space="preserve">            name.textContent = (isOpen ? '\u25cf ' : '') + folderName;</w:t>
-        <w:br/>
-        <w:t xml:space="preserve">            name.title = p + (isOpen ? ' (\u5df2\u5728 :' + matchedInstance.port + ' \u6253\u5f00)' : ' (\u70b9\u51fb\u5728\u65b0\u7a97\u53e3\u6253\u5f00)');</w:t>
-        <w:br/>
-        <w:br/>
-        <w:t xml:space="preserve">            name.addEventListener('click', function() {</w:t>
-        <w:br/>
-        <w:t xml:space="preserve">                if (isOpen) {</w:t>
-        <w:br/>
-        <w:t xml:space="preserve">                    // \u5df2\u6253\u5f00 \u2192 \u5207\u6362\u5230\u8be5\u7a97\u53e3</w:t>
-        <w:br/>
-        <w:t xml:space="preserve">                    currentPort = matchedInstance.port;</w:t>
-        <w:br/>
-        <w:t xml:space="preserve">                    currentWorkspace = matchedInstance.workspace;</w:t>
-        <w:br/>
-        <w:t xml:space="preserve">                    chrome.storage.local.set({ serverPort: matchedInstance.port });</w:t>
-        <w:br/>
-        <w:t xml:space="preserve">                    chrome.tabs.query({}, function(tabs) {</w:t>
-        <w:br/>
-        <w:t xml:space="preserve">                        tabs.forEach(function(tab) {</w:t>
-        <w:br/>
-        <w:t xml:space="preserve">                            try { chrome.tabs.sendMessage(tab.id, { type: 'reconnect-ws', port: matchedInstance.port }); } catch (_) {}</w:t>
-        <w:br/>
-        <w:t xml:space="preserve">                        });</w:t>
+        <w:t xml:space="preserve">                        instances.push({ port: port, workspace: d.workspace || '', wsClients: d.wsClients || 0 });</w:t>
+        <w:br/>
+        <w:t xml:space="preserve">                    })</w:t>
+        <w:br/>
+        <w:t xml:space="preserve">                    .catch(function() {})</w:t>
+        <w:br/>
+        <w:t xml:space="preserve">                    .finally(function() {</w:t>
+        <w:br/>
+        <w:t xml:space="preserve">                        pending--;</w:t>
+        <w:br/>
+        <w:t xml:space="preserve">                        if (pending === 0) {</w:t>
+        <w:br/>
+        <w:t xml:space="preserve">                            instances.sort(function(a, b) { return a.port - b.port; });</w:t>
+        <w:br/>
+        <w:t xml:space="preserve">                            discoveredInstances = instances;</w:t>
+        <w:br/>
+        <w:t xml:space="preserve">                            callback(instances);</w:t>
+        <w:br/>
+        <w:t xml:space="preserve">                        }</w:t>
         <w:br/>
         <w:t xml:space="preserve">                    });</w:t>
         <w:br/>
-        <w:t xml:space="preserve">                    showResult('\u2705 \u5df2\u5207\u6362\u5230: ' + folderName + ' (:' + matchedInstance.port + ')', true);</w:t>
-        <w:br/>
-        <w:t xml:space="preserve">                    checkConnection();</w:t>
-        <w:br/>
-        <w:t xml:space="preserve">                } else {</w:t>
-        <w:br/>
-        <w:t xml:space="preserve">                    // \u672a\u6253\u5f00 \u2192 \u7528 VS Code \u5728\u65b0\u7a97\u53e3\u6253\u5f00</w:t>
-        <w:br/>
-        <w:t xml:space="preserve">                    // \u901a\u8fc7\u547d\u4ee4\u884c\u6253\u5f00\u65b0\u7a97\u53e3</w:t>
-        <w:br/>
-        <w:t xml:space="preserve">                    fetch('http://127.0.0.1:' + currentPort + '/open-folder-new-window', {</w:t>
-        <w:br/>
-        <w:t xml:space="preserve">                        method: 'POST',</w:t>
+        <w:t xml:space="preserve">            })(9960 + i);</w:t>
+        <w:br/>
+        <w:t xml:space="preserve">        }</w:t>
+        <w:br/>
+        <w:t xml:space="preserve">    }</w:t>
+        <w:br/>
+        <w:br/>
+        <w:t xml:space="preserve">    function checkConnection() {</w:t>
+        <w:br/>
+        <w:t xml:space="preserve">        statusLabel.textContent = '\u68c0\u67e5\u4e2d...';</w:t>
+        <w:br/>
+        <w:t xml:space="preserve">        scanAllPorts(function(instances) {</w:t>
+        <w:br/>
+        <w:t xml:space="preserve">            if (instances.length === 0) {</w:t>
+        <w:br/>
+        <w:t xml:space="preserve">                statusDot.className = 'dot dot-red';</w:t>
+        <w:br/>
+        <w:t xml:space="preserve">                statusLabel.textContent = '\u672a\u8fde\u63a5 \u2014 \u8bf7\u542f\u52a8 VS Code';</w:t>
+        <w:br/>
+        <w:t xml:space="preserve">                workspaceName.textContent = '';</w:t>
+        <w:br/>
+        <w:t xml:space="preserve">                instanceList.innerHTML = '';</w:t>
+        <w:br/>
+        <w:t xml:space="preserve">                return;</w:t>
+        <w:br/>
+        <w:t xml:space="preserve">            }</w:t>
+        <w:br/>
+        <w:t xml:space="preserve">            var active = instances.find(function(i) { return i.port === currentPort; }) || instances[0];</w:t>
+        <w:br/>
+        <w:t xml:space="preserve">            currentPort = active.port;</w:t>
+        <w:br/>
+        <w:t xml:space="preserve">            currentWorkspace = active.workspace;</w:t>
+        <w:br/>
+        <w:t xml:space="preserve">            chrome.storage.local.set({ serverPort: currentPort });</w:t>
+        <w:br/>
       </w:r>
     </w:p>
     <w:p>
@@ -11487,63 +10957,60 @@
           <w:color w:val="282828"/>
           <w:sz w:val="15"/>
         </w:rPr>
-        <w:t xml:space="preserve">                        headers: { 'Content-Type': 'application/json' },</w:t>
-        <w:br/>
-        <w:t xml:space="preserve">                        body: JSON.stringify({ path: p })</w:t>
-        <w:br/>
-        <w:t xml:space="preserve">                    }).then(function(resp) { return resp.json(); }).then(function(data) {</w:t>
-        <w:br/>
-        <w:t xml:space="preserve">                        if (data.success) {</w:t>
-        <w:br/>
-        <w:t xml:space="preserve">                            showResult('\u2705 \u5df2\u5728\u65b0\u7a97\u53e3\u6253\u5f00: ' + folderName, true);</w:t>
-        <w:br/>
-        <w:t xml:space="preserve">                            setTimeout(checkConnection, 3000);</w:t>
-        <w:br/>
-        <w:t xml:space="preserve">                        } else {</w:t>
-        <w:br/>
-        <w:t xml:space="preserve">                            showResult('\u274c ' + (data.message || '\u6253\u5f00\u5931\u8d25'), false);</w:t>
-        <w:br/>
-        <w:t xml:space="preserve">                        }</w:t>
-        <w:br/>
-        <w:t xml:space="preserve">                    }).catch(function() {</w:t>
-        <w:br/>
-        <w:t xml:space="preserve">                        showResult('\u274c \u65e0\u6cd5\u8fde\u63a5 VS Code', false);</w:t>
-        <w:br/>
-        <w:t xml:space="preserve">                    });</w:t>
-        <w:br/>
-        <w:t xml:space="preserve">                }</w:t>
-        <w:br/>
-        <w:t xml:space="preserve">            });</w:t>
-        <w:br/>
-        <w:br/>
-        <w:t xml:space="preserve">            var del = document.createElement('span');</w:t>
-        <w:br/>
-        <w:t xml:space="preserve">            del.className = 'project-item-del';</w:t>
-        <w:br/>
-        <w:t xml:space="preserve">            del.textContent = '\u00d7';</w:t>
-        <w:br/>
-        <w:t xml:space="preserve">            del.title = '\u5220\u9664';</w:t>
-        <w:br/>
-        <w:t xml:space="preserve">            del.addEventListener('click', function(e) {</w:t>
-        <w:br/>
-        <w:t xml:space="preserve">                e.stopPropagation();</w:t>
-        <w:br/>
-        <w:t xml:space="preserve">                getSavedProjects(function(list) {</w:t>
-        <w:br/>
-        <w:t xml:space="preserve">                    list.splice(i, 1);</w:t>
-        <w:br/>
-        <w:t xml:space="preserve">                    saveProjects(list);</w:t>
-        <w:br/>
-        <w:t xml:space="preserve">                    renderProjectList(list);</w:t>
-        <w:br/>
-        <w:t xml:space="preserve">                });</w:t>
-        <w:br/>
-        <w:t xml:space="preserve">            });</w:t>
-        <w:br/>
-        <w:br/>
-        <w:t xml:space="preserve">            item.appendChild(name);</w:t>
-        <w:br/>
-        <w:t xml:space="preserve">            item.appendChild(del);</w:t>
+        <w:t xml:space="preserve">            statusDot.className = 'dot dot-green';</w:t>
+        <w:br/>
+        <w:t xml:space="preserve">            statusLabel.textContent = '\u5df2\u8fde\u63a5 :' + currentPort;</w:t>
+        <w:br/>
+        <w:br/>
+        <w:t xml:space="preserve">            var fn = currentWorkspace.split(/[\/\\]/).pop() || currentWorkspace;</w:t>
+        <w:br/>
+        <w:t xml:space="preserve">            workspaceName.textContent = fn;</w:t>
+        <w:br/>
+        <w:t xml:space="preserve">            workspaceName.title = currentWorkspace;</w:t>
+        <w:br/>
+        <w:br/>
+        <w:t xml:space="preserve">            renderInstances(instances);</w:t>
+        <w:br/>
+        <w:t xml:space="preserve">            renderProjectList();</w:t>
+        <w:br/>
+        <w:t xml:space="preserve">            loadHistory();</w:t>
+        <w:br/>
+        <w:t xml:space="preserve">        });</w:t>
+        <w:br/>
+        <w:t xml:space="preserve">    }</w:t>
+        <w:br/>
+        <w:br/>
+        <w:t xml:space="preserve">    function renderInstances(instances) {</w:t>
+        <w:br/>
+        <w:t xml:space="preserve">        instanceList.innerHTML = '';</w:t>
+        <w:br/>
+        <w:t xml:space="preserve">        if (instances.length &lt;= 1) return;</w:t>
+        <w:br/>
+        <w:br/>
+        <w:t xml:space="preserve">        var label = document.createElement('div');</w:t>
+        <w:br/>
+        <w:t xml:space="preserve">        label.style.cssText = 'font-size:10px;color:#6c7086;margin-bottom:2px;';</w:t>
+        <w:br/>
+        <w:t xml:space="preserve">        label.textContent = '\u70b9\u51fb\u5207\u6362\u76ee\u6807\u7a97\u53e3\uff1a';</w:t>
+        <w:br/>
+        <w:t xml:space="preserve">        instanceList.appendChild(label);</w:t>
+        <w:br/>
+        <w:br/>
+        <w:t xml:space="preserve">        instances.forEach(function(inst) {</w:t>
+        <w:br/>
+        <w:t xml:space="preserve">            var chip = document.createElement('span');</w:t>
+        <w:br/>
+        <w:t xml:space="preserve">            chip.className = 'ws-chip' + (inst.port === currentPort ? ' active' : '');</w:t>
+        <w:br/>
+        <w:t xml:space="preserve">            var fn = inst.workspace.split(/[\/\\]/).pop() || '?';</w:t>
+        <w:br/>
+        <w:t xml:space="preserve">            chip.textContent = fn + ' :' + inst.port;</w:t>
+        <w:br/>
+        <w:t xml:space="preserve">            chip.title = inst.workspace;</w:t>
+        <w:br/>
+        <w:t xml:space="preserve">            chip.addEventListener('click', function() {</w:t>
+        <w:br/>
+        <w:t xml:space="preserve">                currentPort = inst.port;</w:t>
       </w:r>
     </w:p>
     <w:p>
@@ -11556,61 +11023,60 @@
           <w:color w:val="282828"/>
           <w:sz w:val="15"/>
         </w:rPr>
-        <w:t xml:space="preserve">            projectList.appendChild(item);</w:t>
+        <w:t xml:space="preserve">                currentWorkspace = inst.workspace;</w:t>
+        <w:br/>
+        <w:t xml:space="preserve">                chrome.storage.local.set({ serverPort: inst.port });</w:t>
+        <w:br/>
+        <w:br/>
+        <w:t xml:space="preserve">                chrome.tabs.query({ active: true, currentWindow: true }, function(tabs) {</w:t>
+        <w:br/>
+        <w:t xml:space="preserve">                    if (tabs[0]) {</w:t>
+        <w:br/>
+        <w:t xml:space="preserve">                        chrome.tabs.sendMessage(tabs[0].id, { type: 'reconnect-ws', port: inst.port });</w:t>
+        <w:br/>
+        <w:t xml:space="preserve">                    }</w:t>
+        <w:br/>
+        <w:t xml:space="preserve">                });</w:t>
+        <w:br/>
+        <w:br/>
+        <w:t xml:space="preserve">                showResult('\u2705 \u5df2\u5207\u6362: ' + fn + ' :' + inst.port, true);</w:t>
+        <w:br/>
+        <w:t xml:space="preserve">                renderInstances(instances);</w:t>
+        <w:br/>
+        <w:t xml:space="preserve">                statusLabel.textContent = '\u5df2\u8fde\u63a5 :' + inst.port;</w:t>
+        <w:br/>
+        <w:t xml:space="preserve">                workspaceName.textContent = fn;</w:t>
+        <w:br/>
+        <w:t xml:space="preserve">                workspaceName.title = inst.workspace;</w:t>
+        <w:br/>
+        <w:t xml:space="preserve">            });</w:t>
+        <w:br/>
+        <w:t xml:space="preserve">            instanceList.appendChild(chip);</w:t>
         <w:br/>
         <w:t xml:space="preserve">        });</w:t>
         <w:br/>
         <w:t xml:space="preserve">    }</w:t>
         <w:br/>
         <w:br/>
-        <w:t xml:space="preserve">    addPathBtn.addEventListener('click', function() {</w:t>
-        <w:br/>
-        <w:t xml:space="preserve">        var p = pathInput.value.trim();</w:t>
-        <w:br/>
-        <w:t xml:space="preserve">        if (!p) { showResult('\u8bf7\u8f93\u5165\u8def\u5f84', false); return; }</w:t>
-        <w:br/>
-        <w:t xml:space="preserve">        getSavedProjects(function(list) {</w:t>
-        <w:br/>
-        <w:t xml:space="preserve">            if (list.includes(p)) { showResult('\u8def\u5f84\u5df2\u5b58\u5728', false); return; }</w:t>
-        <w:br/>
-        <w:t xml:space="preserve">            list.push(p);</w:t>
-        <w:br/>
-        <w:t xml:space="preserve">            saveProjects(list);</w:t>
-        <w:br/>
-        <w:t xml:space="preserve">            renderProjectList(list);</w:t>
-        <w:br/>
-        <w:t xml:space="preserve">            pathInput.value = '';</w:t>
-        <w:br/>
-        <w:t xml:space="preserve">            showResult('\u8def\u5f84\u5df2\u6dfb\u52a0', true);</w:t>
-        <w:br/>
-        <w:t xml:space="preserve">        });</w:t>
+        <w:t xml:space="preserve">    document.getElementById('btn-refresh').addEventListener('click', checkConnection);</w:t>
+        <w:br/>
+        <w:br/>
+        <w:t xml:space="preserve">    document.getElementById('btn-copy-prompt').addEventListener('click', function() {</w:t>
+        <w:br/>
+        <w:t xml:space="preserve">        var btn = document.getElementById('btn-copy-prompt');</w:t>
+        <w:br/>
+        <w:t xml:space="preserve">        navigator.clipboard.writeText(PROMPT_TEMPLATE).then(function() {</w:t>
+        <w:br/>
+        <w:t xml:space="preserve">            btn.textContent = '\u2705 \u5df2\u590d\u5236\uff01\u7c98\u8d34\u5230 AI \u5bf9\u8bdd\u7684\u7b2c\u4e00\u6761\u6d88\u606f';</w:t>
+        <w:br/>
+        <w:t xml:space="preserve">            setTimeout(function() { btn.textContent = '\ud83d\udccb \u4e00\u952e\u590d\u5236 AI \u63d0\u793a\u8bcd\uff08\u9996\u6b21\u5bf9\u8bdd\u5fc5\u7528\uff09'; }, 3000);</w:t>
+        <w:br/>
+        <w:t xml:space="preserve">        }).catch(function() { showResult('\u274c \u590d\u5236\u5931\u8d25', false); });</w:t>
         <w:br/>
         <w:t xml:space="preserve">    });</w:t>
         <w:br/>
         <w:br/>
-        <w:t xml:space="preserve">    pathInput.addEventListener('keydown', function(e) { if (e.key === 'Enter') addPathBtn.click(); });</w:t>
-        <w:br/>
-        <w:t xml:space="preserve">    var btnExport = document.getElementById('btn-export');</w:t>
-        <w:br/>
-        <w:t xml:space="preserve">    var exportExcludes = document.getElementById('export-excludes');</w:t>
-        <w:br/>
-        <w:br/>
-        <w:t xml:space="preserve">    chrome.storage.local.get(['exportExcludes'], function(r) {</w:t>
-        <w:br/>
-        <w:t xml:space="preserve">        if (r.exportExcludes) exportExcludes.value = r.exportExcludes;</w:t>
-        <w:br/>
-        <w:t xml:space="preserve">    });</w:t>
-        <w:br/>
-        <w:br/>
-        <w:t xml:space="preserve">    if (btnExport) {</w:t>
-        <w:br/>
-        <w:t xml:space="preserve">        btnExport.addEventListener('click', function() {</w:t>
-        <w:br/>
-        <w:t xml:space="preserve">            var excludeText = exportExcludes.value.trim();</w:t>
-        <w:br/>
-        <w:t xml:space="preserve">            var excludes = [];</w:t>
-        <w:br/>
-        <w:t xml:space="preserve">            if (excludeText) {</w:t>
+        <w:t xml:space="preserve">    document.getElementById('btn-scan').addEventListener('click', function() {</w:t>
       </w:r>
     </w:p>
     <w:p>
@@ -11623,62 +11089,62 @@
           <w:color w:val="282828"/>
           <w:sz w:val="15"/>
         </w:rPr>
-        <w:t xml:space="preserve">                excludes = excludeText.split('\n').map(function(l) { return l.trim(); }).filter(function(l) { return l &amp;&amp; !l.startsWith('#'); });</w:t>
-        <w:br/>
-        <w:t xml:space="preserve">            }</w:t>
-        <w:br/>
-        <w:br/>
-        <w:t xml:space="preserve">            chrome.storage.local.set({ exportExcludes: excludeText });</w:t>
-        <w:br/>
-        <w:br/>
-        <w:t xml:space="preserve">            btnExport.disabled = true;</w:t>
-        <w:br/>
-        <w:t xml:space="preserve">            btnExport.textContent = '\u23f3 导出中...';</w:t>
-        <w:br/>
-        <w:br/>
-        <w:t xml:space="preserve">            fetch('http://127.0.0.1:' + currentPort + '/export-project', {</w:t>
-        <w:br/>
-        <w:t xml:space="preserve">                method: 'POST',</w:t>
-        <w:br/>
-        <w:t xml:space="preserve">                headers: { 'Content-Type': 'application/json' },</w:t>
-        <w:br/>
-        <w:t xml:space="preserve">                body: JSON.stringify({ excludes: excludes, maxSize: 200 })</w:t>
-        <w:br/>
-        <w:t xml:space="preserve">            }).then(function(resp) { return resp.json(); }).then(function(data) {</w:t>
-        <w:br/>
-        <w:t xml:space="preserve">                if (data.success) {</w:t>
-        <w:br/>
-        <w:t xml:space="preserve">                    showResult('\u2705 ' + data.message, true);</w:t>
-        <w:br/>
-        <w:t xml:space="preserve">                } else {</w:t>
-        <w:br/>
-        <w:t xml:space="preserve">                    showResult('\u274c ' + (data.message || '导出失败'), false);</w:t>
-        <w:br/>
-        <w:t xml:space="preserve">                }</w:t>
-        <w:br/>
-        <w:t xml:space="preserve">            }).catch(function() {</w:t>
-        <w:br/>
-        <w:t xml:space="preserve">                showResult('\u274c 无法连接 VS Code', false);</w:t>
-        <w:br/>
-        <w:t xml:space="preserve">            }).finally(function() {</w:t>
-        <w:br/>
-        <w:t xml:space="preserve">                btnExport.disabled = false;</w:t>
-        <w:br/>
-        <w:t xml:space="preserve">                btnExport.textContent = '\ud83d\udce6 一键导出当前项目';</w:t>
+        <w:t xml:space="preserve">        chrome.tabs.query({ active: true, currentWindow: true }, function(tabs) {</w:t>
+        <w:br/>
+        <w:t xml:space="preserve">            if (tabs[0]) { chrome.tabs.sendMessage(tabs[0].id, { type: 'scan-page-only' }); showResult('\u5df2\u626b\u63cf', true); }</w:t>
+        <w:br/>
+        <w:t xml:space="preserve">        });</w:t>
+        <w:br/>
+        <w:t xml:space="preserve">    });</w:t>
+        <w:br/>
+        <w:br/>
+        <w:t xml:space="preserve">    document.getElementById('btn-copy-reply').addEventListener('click', function() {</w:t>
+        <w:br/>
+        <w:t xml:space="preserve">        chrome.tabs.query({ active: true, currentWindow: true }, function(tabs) {</w:t>
+        <w:br/>
+        <w:t xml:space="preserve">            if (!tabs[0]) return;</w:t>
+        <w:br/>
+        <w:t xml:space="preserve">            chrome.tabs.sendMessage(tabs[0].id, { type: 'collect-last-reply' }, function(resp) {</w:t>
+        <w:br/>
+        <w:t xml:space="preserve">                if (resp &amp;&amp; resp.text) {</w:t>
+        <w:br/>
+        <w:t xml:space="preserve">                    navigator.clipboard.writeText(resp.text).then(function() {</w:t>
+        <w:br/>
+        <w:t xml:space="preserve">                        showResult('\u2705 \u5df2\u590d\u5236 ' + resp.text.length + ' \u5b57\u7b26', true);</w:t>
+        <w:br/>
+        <w:t xml:space="preserve">                    });</w:t>
+        <w:br/>
+        <w:t xml:space="preserve">                } else { showResult('\u274c \u672a\u627e\u5230\u56de\u590d', false); }</w:t>
         <w:br/>
         <w:t xml:space="preserve">            });</w:t>
         <w:br/>
         <w:t xml:space="preserve">        });</w:t>
         <w:br/>
-        <w:t xml:space="preserve">    }</w:t>
+        <w:t xml:space="preserve">    });</w:t>
+        <w:br/>
+        <w:br/>
+        <w:t xml:space="preserve">    document.getElementById('btn-undo').addEventListener('click', function() {</w:t>
+        <w:br/>
+        <w:t xml:space="preserve">        chrome.runtime.sendMessage({ type: 'undo-last-change' }, function(r) {</w:t>
+        <w:br/>
+        <w:t xml:space="preserve">            showResult(r &amp;&amp; r.success ? '\u2705 \u5df2\u64a4\u9500' : (r ? r.message : '\u5931\u8d25'), r &amp;&amp; r.success);</w:t>
+        <w:br/>
+        <w:t xml:space="preserve">        });</w:t>
+        <w:br/>
+        <w:t xml:space="preserve">    });</w:t>
+        <w:br/>
         <w:br/>
         <w:t xml:space="preserve">    manualSendBtn.addEventListener('click', function() {</w:t>
         <w:br/>
         <w:t xml:space="preserve">        var text = manualText.value.trim();</w:t>
         <w:br/>
-        <w:t xml:space="preserve">        if (!text) { showResult('\u8bf7\u8f93\u5165\u6587\u672c', false); return; }</w:t>
+        <w:t xml:space="preserve">        if (!text) { showResult('\u8bf7\u8f93\u5165\u5185\u5bb9', false); return; }</w:t>
         <w:br/>
         <w:t xml:space="preserve">        manualSendBtn.disabled = true;</w:t>
+        <w:br/>
+        <w:t xml:space="preserve">        manualSendBtn.textContent = '\u23f3...';</w:t>
+        <w:br/>
+        <w:t xml:space="preserve">        fetch('http://127.0.0.1:' + currentPort + '/apply-text', {</w:t>
       </w:r>
     </w:p>
     <w:p>
@@ -11691,63 +11157,64 @@
           <w:color w:val="282828"/>
           <w:sz w:val="15"/>
         </w:rPr>
-        <w:t xml:space="preserve">        manualSendBtn.textContent = '\u23f3 \u53d1\u9001\u4e2d...';</w:t>
-        <w:br/>
-        <w:t xml:space="preserve">        chrome.runtime.sendMessage({ type: 'send-raw-text', text: text }, function(response) {</w:t>
+        <w:t xml:space="preserve">            method: 'POST',</w:t>
+        <w:br/>
+        <w:t xml:space="preserve">            headers: { 'Content-Type': 'application/json' },</w:t>
+        <w:br/>
+        <w:t xml:space="preserve">            body: JSON.stringify({ type: 'raw-text', text: text })</w:t>
+        <w:br/>
+        <w:t xml:space="preserve">        }).then(function(r) { return r.json(); }).then(function(d) {</w:t>
+        <w:br/>
+        <w:t xml:space="preserve">            var ok = d.status === 'success' || d.success;</w:t>
+        <w:br/>
+        <w:t xml:space="preserve">            showResult(ok ? '\u2705 ' + (d.message || '\u5df2\u53d1\u9001') : '\u274c ' + (d.message || '\u5931\u8d25'), ok);</w:t>
+        <w:br/>
+        <w:t xml:space="preserve">            if (ok) manualText.value = '';</w:t>
+        <w:br/>
+        <w:t xml:space="preserve">        }).catch(function() {</w:t>
+        <w:br/>
+        <w:t xml:space="preserve">            showResult('\u274c \u65e0\u6cd5\u8fde\u63a5 VS Code', false);</w:t>
+        <w:br/>
+        <w:t xml:space="preserve">        }).finally(function() {</w:t>
         <w:br/>
         <w:t xml:space="preserve">            manualSendBtn.disabled = false;</w:t>
         <w:br/>
-        <w:t xml:space="preserve">            manualSendBtn.textContent = '\ud83d\udce4 \u53d1\u9001\u5230 VS Code';</w:t>
-        <w:br/>
-        <w:t xml:space="preserve">            if (response &amp;&amp; response.success) {</w:t>
-        <w:br/>
-        <w:t xml:space="preserve">                showResult(response.message || '\u5df2\u53d1\u9001', true);</w:t>
-        <w:br/>
-        <w:t xml:space="preserve">                manualText.value = '';</w:t>
-        <w:br/>
-        <w:t xml:space="preserve">            } else {</w:t>
-        <w:br/>
-        <w:t xml:space="preserve">                showResult(response ? response.message : '\u53d1\u9001\u5931\u8d25', false);</w:t>
-        <w:br/>
-        <w:t xml:space="preserve">            }</w:t>
+        <w:t xml:space="preserve">            manualSendBtn.textContent = '\ud83d\udce4 \u53d1\u9001';</w:t>
         <w:br/>
         <w:t xml:space="preserve">        });</w:t>
         <w:br/>
         <w:t xml:space="preserve">    });</w:t>
         <w:br/>
         <w:br/>
-        <w:t xml:space="preserve">    function showResult(msg, success) {</w:t>
-        <w:br/>
-        <w:t xml:space="preserve">        resultDiv.textContent = msg;</w:t>
-        <w:br/>
-        <w:t xml:space="preserve">        resultDiv.className = success ? 'result result-success' : 'result result-error';</w:t>
-        <w:br/>
-        <w:t xml:space="preserve">        clearTimeout(resultDiv._t);</w:t>
-        <w:br/>
-        <w:t xml:space="preserve">        resultDiv._t = setTimeout(function() { resultDiv.className = 'result'; }, 4000);</w:t>
-        <w:br/>
-        <w:t xml:space="preserve">    }</w:t>
-        <w:br/>
-        <w:br/>
-        <w:t xml:space="preserve">    // ========== \u64cd\u4f5c\u5386\u53f2 ==========</w:t>
-        <w:br/>
-        <w:t xml:space="preserve">    var historySection = document.createElement('div');</w:t>
-        <w:br/>
-        <w:t xml:space="preserve">    historySection.className = 'manual-section';</w:t>
-        <w:br/>
-        <w:t xml:space="preserve">    historySection.style.marginBottom = '10px';</w:t>
-        <w:br/>
-        <w:t xml:space="preserve">    historySection.innerHTML =</w:t>
-        <w:br/>
-        <w:t xml:space="preserve">        '&lt;div class="section-title" style="display:flex;justify-content:space-between;align-items:center"&gt;' +</w:t>
-        <w:br/>
-        <w:t xml:space="preserve">        '&lt;span&gt;\ud83d\udcdc \u64cd\u4f5c\u5386\u53f2&lt;/span&gt;' +</w:t>
-        <w:br/>
-        <w:t xml:space="preserve">        '&lt;span id="history-count" style="color:#6c7086;font-size:10px"&gt;&lt;/span&gt;' +</w:t>
-        <w:br/>
-        <w:t xml:space="preserve">        '&lt;/div&gt;' +</w:t>
-        <w:br/>
-        <w:t xml:space="preserve">        '&lt;div id="history-list" style="max-height:120px;overflow-y:auto;margin-top:6px"&gt;&lt;/div&gt;' +</w:t>
+        <w:t xml:space="preserve">    document.getElementById('btn-restart').addEventListener('click', function() {</w:t>
+        <w:br/>
+        <w:t xml:space="preserve">        chrome.runtime.sendMessage({ type: 'restart-server' }, function(r) {</w:t>
+        <w:br/>
+        <w:t xml:space="preserve">            showResult(r &amp;&amp; r.success ? '\u5df2\u91cd\u542f' : '\u5931\u8d25', r &amp;&amp; r.success);</w:t>
+        <w:br/>
+        <w:t xml:space="preserve">            setTimeout(checkConnection, 2000);</w:t>
+        <w:br/>
+        <w:t xml:space="preserve">        });</w:t>
+        <w:br/>
+        <w:t xml:space="preserve">    });</w:t>
+        <w:br/>
+        <w:t xml:space="preserve">    document.getElementById('btn-open-log').addEventListener('click', function() {</w:t>
+        <w:br/>
+        <w:t xml:space="preserve">        chrome.runtime.sendMessage({ type: 'open-log' });</w:t>
+        <w:br/>
+        <w:t xml:space="preserve">        showResult('\u5df2\u6253\u5f00', true);</w:t>
+        <w:br/>
+        <w:t xml:space="preserve">    });</w:t>
+        <w:br/>
+        <w:t xml:space="preserve">    document.getElementById('btn-reload-page').addEventListener('click', function() {</w:t>
+        <w:br/>
+        <w:t xml:space="preserve">        chrome.tabs.query({ active: true, currentWindow: true }, function(t) { if (t[0]) chrome.tabs.reload(t[0].id); });</w:t>
+        <w:br/>
+        <w:t xml:space="preserve">        showResult('\u5df2\u5237\u65b0', true);</w:t>
+        <w:br/>
+        <w:t xml:space="preserve">    });</w:t>
+        <w:br/>
+        <w:t xml:space="preserve">    document.getElementById('btn-reload-ext').addEventListener('click', function() {</w:t>
       </w:r>
     </w:p>
     <w:p>
@@ -11760,63 +11227,64 @@
           <w:color w:val="282828"/>
           <w:sz w:val="15"/>
         </w:rPr>
-        <w:t xml:space="preserve">        '&lt;button id="clear-history-btn" style="' +</w:t>
-        <w:br/>
-        <w:t xml:space="preserve">        'width:100%;margin-top:6px;padding:5px;border:none;border-radius:5px;' +</w:t>
-        <w:br/>
-        <w:t xml:space="preserve">        'background:#45475a;color:#cdd6f4;font-size:11px;cursor:pointer' +</w:t>
-        <w:br/>
-        <w:t xml:space="preserve">        '"&gt;\ud83d\uddd1 \u6e05\u7a7a\u5386\u53f2&lt;/button&gt;';</w:t>
-        <w:br/>
-        <w:t xml:space="preserve">    var manualSectionEl = document.querySelector('.manual-section');</w:t>
-        <w:br/>
-        <w:t xml:space="preserve">    if (manualSectionEl) {</w:t>
-        <w:br/>
-        <w:t xml:space="preserve">        manualSectionEl.parentNode.insertBefore(historySection, manualSectionEl);</w:t>
-        <w:br/>
-        <w:t xml:space="preserve">    }</w:t>
-        <w:br/>
-        <w:br/>
-        <w:t xml:space="preserve">    var historyList     = document.getElementById('history-list');</w:t>
-        <w:br/>
-        <w:t xml:space="preserve">    var historyCount    = document.getElementById('history-count');</w:t>
-        <w:br/>
-        <w:t xml:space="preserve">    var clearHistoryBtn = document.getElementById('clear-history-btn');</w:t>
-        <w:br/>
-        <w:br/>
-        <w:t xml:space="preserve">    function renderHistory(items) {</w:t>
-        <w:br/>
-        <w:t xml:space="preserve">        if (!items || items.length === 0) {</w:t>
-        <w:br/>
-        <w:t xml:space="preserve">            historyList.innerHTML = '&lt;div style="color:#6c7086;font-size:11px;padding:4px"&gt;\u6682\u65e0\u64cd\u4f5c\u8bb0\u5f55&lt;/div&gt;';</w:t>
-        <w:br/>
-        <w:t xml:space="preserve">            historyCount.textContent = '';</w:t>
-        <w:br/>
-        <w:t xml:space="preserve">            return;</w:t>
-        <w:br/>
-        <w:t xml:space="preserve">        }</w:t>
-        <w:br/>
-        <w:t xml:space="preserve">        historyCount.textContent = '\u5171 ' + items.length + ' \u6761';</w:t>
-        <w:br/>
-        <w:t xml:space="preserve">        historyList.innerHTML = items.map(function(item) {</w:t>
-        <w:br/>
-        <w:t xml:space="preserve">            var icon = item.accepted ? '\u2705' : '\u274c';</w:t>
-        <w:br/>
-        <w:t xml:space="preserve">            var colors = { write:'#89b4fa', create:'#a6e3a1', patch:'#fab387', delete:'#f38ba8', update:'#89dceb' };</w:t>
-        <w:br/>
-        <w:t xml:space="preserve">            var c = colors[item.action] || '#cdd6f4';</w:t>
-        <w:br/>
-        <w:t xml:space="preserve">            var t = (item.timeStr || '').split(' ')[1] || '';</w:t>
-        <w:br/>
-        <w:t xml:space="preserve">            return '&lt;div style="display:flex;align-items:center;gap:6px;padding:4px 6px;border-radius:4px;margin-bottom:2px;background:#1e1e2e;font-size:11px" title="' + (item.timeStr||'') + '"&gt;' +</w:t>
-        <w:br/>
-        <w:t xml:space="preserve">                '&lt;span&gt;' + icon + '&lt;/span&gt;' +</w:t>
-        <w:br/>
-        <w:t xml:space="preserve">                '&lt;span style="color:' + c + ';flex-shrink:0"&gt;' + item.action + '&lt;/span&gt;' +</w:t>
-        <w:br/>
-        <w:t xml:space="preserve">                '&lt;span style="flex:1;overflow:hidden;text-overflow:ellipsis;white-space:nowrap;font-family:monospace;color:#cdd6f4"&gt;' + item.file + '&lt;/span&gt;' +</w:t>
-        <w:br/>
-        <w:t xml:space="preserve">                '&lt;span style="color:#6c7086;flex-shrink:0;font-size:10px"&gt;' + t + '&lt;/span&gt;' +</w:t>
+        <w:t xml:space="preserve">        showResult('\u91cd\u8f7d\u4e2d...', true);</w:t>
+        <w:br/>
+        <w:t xml:space="preserve">        setTimeout(function() { chrome.runtime.reload(); }, 500);</w:t>
+        <w:br/>
+        <w:t xml:space="preserve">    });</w:t>
+        <w:br/>
+        <w:t xml:space="preserve">    document.getElementById('btn-debug-info').addEventListener('click', function() {</w:t>
+        <w:br/>
+        <w:t xml:space="preserve">        chrome.tabs.query({ active: true, currentWindow: true }, function(tabs) {</w:t>
+        <w:br/>
+        <w:t xml:space="preserve">            if (!tabs[0]) return;</w:t>
+        <w:br/>
+        <w:t xml:space="preserve">            chrome.tabs.sendMessage(tabs[0].id, { type: 'collect-debug-info' }, function(resp) {</w:t>
+        <w:br/>
+        <w:t xml:space="preserve">                var info = '=== AI Code Agent ===\nPort:' + currentPort + '\nWorkspace:' + currentWorkspace + '\n';</w:t>
+        <w:br/>
+        <w:t xml:space="preserve">                if (resp) {</w:t>
+        <w:br/>
+        <w:t xml:space="preserve">                    info += 'Enabled:' + resp.enabled + '\nAutoScan:' + resp.autoScan + '\nWS:' + resp.wsConnected;</w:t>
+        <w:br/>
+        <w:t xml:space="preserve">                    info += '\nBlocks:' + resp.codeBlockCount + '\nButtons:' + resp.buttonCount + '\nUnprocessed:' + resp.unprocessedCount;</w:t>
+        <w:br/>
+        <w:t xml:space="preserve">                } else { info += 'content.js not loaded'; }</w:t>
+        <w:br/>
+        <w:t xml:space="preserve">                navigator.clipboard.writeText(info).then(function() { showResult('\u2705 \u5df2\u590d\u5236', true); });</w:t>
+        <w:br/>
+        <w:t xml:space="preserve">            });</w:t>
+        <w:br/>
+        <w:t xml:space="preserve">        });</w:t>
+        <w:br/>
+        <w:t xml:space="preserve">    });</w:t>
+        <w:br/>
+        <w:t xml:space="preserve">    document.getElementById('btn-clear-history').addEventListener('click', function() {</w:t>
+        <w:br/>
+        <w:t xml:space="preserve">        chrome.runtime.sendMessage({ type: 'clear-history' }, function() {</w:t>
+        <w:br/>
+        <w:t xml:space="preserve">            recentList.innerHTML = '&lt;div style="color:#6c7086;font-size:11px;"&gt;\u5df2\u6e05\u7a7a&lt;/div&gt;';</w:t>
+        <w:br/>
+        <w:t xml:space="preserve">            showResult('\u5df2\u6e05\u7a7a', true);</w:t>
+        <w:br/>
+        <w:t xml:space="preserve">        });</w:t>
+        <w:br/>
+        <w:t xml:space="preserve">    });</w:t>
+        <w:br/>
+        <w:br/>
+        <w:t xml:space="preserve">    var btnExport = document.getElementById('btn-export');</w:t>
+        <w:br/>
+        <w:t xml:space="preserve">    if (btnExport) {</w:t>
+        <w:br/>
+        <w:t xml:space="preserve">        btnExport.addEventListener('click', function() {</w:t>
+        <w:br/>
+        <w:t xml:space="preserve">            var textarea = document.getElementById('export-excludes');</w:t>
+        <w:br/>
+        <w:t xml:space="preserve">            var lines = (textarea.value || '').split('\n').map(function(l) { return l.trim(); }).filter(function(l) { return l &amp;&amp; !l.startsWith('#'); });</w:t>
+        <w:br/>
+        <w:t xml:space="preserve">            chrome.storage.local.set({ exportExcludes: textarea.value });</w:t>
+        <w:br/>
+        <w:t xml:space="preserve">            btnExport.disabled = true;</w:t>
       </w:r>
     </w:p>
     <w:p>
@@ -11829,46 +11297,284 @@
           <w:color w:val="282828"/>
           <w:sz w:val="15"/>
         </w:rPr>
-        <w:t xml:space="preserve">                '&lt;/div&gt;';</w:t>
+        <w:t xml:space="preserve">            btnExport.textContent = '\u23f3 \u5bfc\u51fa\u4e2d...';</w:t>
+        <w:br/>
+        <w:t xml:space="preserve">            fetch('http://127.0.0.1:' + currentPort + '/export-project', {</w:t>
+        <w:br/>
+        <w:t xml:space="preserve">                method: 'POST',</w:t>
+        <w:br/>
+        <w:t xml:space="preserve">                headers: { 'Content-Type': 'application/json' },</w:t>
+        <w:br/>
+        <w:t xml:space="preserve">                body: JSON.stringify({ excludes: lines, maxSize: 200 })</w:t>
+        <w:br/>
+        <w:t xml:space="preserve">            }).then(function(r) { return r.json(); }).then(function(d) {</w:t>
+        <w:br/>
+        <w:t xml:space="preserve">                showResult(d.success ? '\u2705 ' + d.message : '\u274c ' + (d.message || '\u5931\u8d25'), d.success);</w:t>
+        <w:br/>
+        <w:t xml:space="preserve">            }).catch(function() {</w:t>
+        <w:br/>
+        <w:t xml:space="preserve">                showResult('\u274c \u65e0\u6cd5\u8fde\u63a5', false);</w:t>
+        <w:br/>
+        <w:t xml:space="preserve">            }).finally(function() {</w:t>
+        <w:br/>
+        <w:t xml:space="preserve">                btnExport.disabled = false;</w:t>
+        <w:br/>
+        <w:t xml:space="preserve">                btnExport.textContent = '\ud83d\udce6 \u4e00\u952e\u5bfc\u51fa';</w:t>
+        <w:br/>
+        <w:t xml:space="preserve">            });</w:t>
+        <w:br/>
+        <w:t xml:space="preserve">        });</w:t>
+        <w:br/>
+        <w:t xml:space="preserve">    }</w:t>
+        <w:br/>
+        <w:br/>
+        <w:t xml:space="preserve">    var pathInput = document.getElementById('path-input');</w:t>
+        <w:br/>
+        <w:t xml:space="preserve">    var addPathBtn = document.getElementById('add-path-btn');</w:t>
+        <w:br/>
+        <w:t xml:space="preserve">    var projectListEl = document.getElementById('project-list');</w:t>
+        <w:br/>
+        <w:br/>
+        <w:t xml:space="preserve">    function getSaved(cb) { chrome.storage.local.get(['savedProjects'], function(r) { cb(r.savedProjects || []); }); }</w:t>
+        <w:br/>
+        <w:t xml:space="preserve">    function savePaths(p) { chrome.storage.local.set({ savedProjects: p }); }</w:t>
+        <w:br/>
+        <w:br/>
+        <w:t xml:space="preserve">    function renderProjectList(projects) {</w:t>
+        <w:br/>
+        <w:t xml:space="preserve">        if (projects === undefined) { getSaved(renderProjectList); return; }</w:t>
+        <w:br/>
+        <w:t xml:space="preserve">        projectListEl.innerHTML = '';</w:t>
+        <w:br/>
+        <w:t xml:space="preserve">        projects.forEach(function(p, i) {</w:t>
+        <w:br/>
+        <w:t xml:space="preserve">            var matched = discoveredInstances.find(function(inst) {</w:t>
+        <w:br/>
+        <w:t xml:space="preserve">                return inst.workspace &amp;&amp; (inst.workspace === p || inst.workspace.replace(/\\/g, '/') === p.replace(/\\/g, '/'));</w:t>
+        <w:br/>
+        <w:t xml:space="preserve">            });</w:t>
+      </w:r>
+    </w:p>
+    <w:p>
+      <w:pPr>
+        <w:spacing w:after="0" w:before="0"/>
+      </w:pPr>
+      <w:r>
+        <w:rPr>
+          <w:rFonts w:ascii="Consolas" w:hAnsi="Consolas"/>
+          <w:color w:val="282828"/>
+          <w:sz w:val="15"/>
+        </w:rPr>
+        <w:t xml:space="preserve">            var item = document.createElement('div');</w:t>
+        <w:br/>
+        <w:t xml:space="preserve">            item.className = 'path-item';</w:t>
+        <w:br/>
+        <w:t xml:space="preserve">            var name = document.createElement('span');</w:t>
+        <w:br/>
+        <w:t xml:space="preserve">            name.className = 'path-name';</w:t>
+        <w:br/>
+        <w:t xml:space="preserve">            name.textContent = p.split(/[\/\\]/).pop() || p;</w:t>
+        <w:br/>
+        <w:t xml:space="preserve">            name.title = p;</w:t>
+        <w:br/>
+        <w:t xml:space="preserve">            name.addEventListener('click', function() {</w:t>
+        <w:br/>
+        <w:t xml:space="preserve">                if (matched) {</w:t>
+        <w:br/>
+        <w:t xml:space="preserve">                    currentPort = matched.port;</w:t>
+        <w:br/>
+        <w:t xml:space="preserve">                    currentWorkspace = matched.workspace;</w:t>
+        <w:br/>
+        <w:t xml:space="preserve">                    chrome.storage.local.set({ serverPort: matched.port });</w:t>
+        <w:br/>
+        <w:t xml:space="preserve">                    chrome.tabs.query({ active: true, currentWindow: true }, function(tabs) {</w:t>
+        <w:br/>
+        <w:t xml:space="preserve">                        if (tabs[0]) chrome.tabs.sendMessage(tabs[0].id, { type: 'reconnect-ws', port: matched.port });</w:t>
+        <w:br/>
+        <w:t xml:space="preserve">                    });</w:t>
+        <w:br/>
+        <w:t xml:space="preserve">                    showResult('\u2705 \u5df2\u5207\u6362', true);</w:t>
+        <w:br/>
+        <w:t xml:space="preserve">                    checkConnection();</w:t>
+        <w:br/>
+        <w:t xml:space="preserve">                } else {</w:t>
+        <w:br/>
+        <w:t xml:space="preserve">                    fetch('http://127.0.0.1:' + currentPort + '/open-folder-new-window', {</w:t>
+        <w:br/>
+        <w:t xml:space="preserve">                        method: 'POST',</w:t>
+        <w:br/>
+        <w:t xml:space="preserve">                        headers: { 'Content-Type': 'application/json' },</w:t>
+        <w:br/>
+        <w:t xml:space="preserve">                        body: JSON.stringify({ path: p })</w:t>
+        <w:br/>
+        <w:t xml:space="preserve">                    }).then(function(r) { return r.json(); }).then(function(d) {</w:t>
+        <w:br/>
+        <w:t xml:space="preserve">                        showResult(d.success ? '\u2705 \u5df2\u6253\u5f00' : '\u274c ' + d.message, d.success);</w:t>
+        <w:br/>
+        <w:t xml:space="preserve">                        setTimeout(checkConnection, 3000);</w:t>
+        <w:br/>
+        <w:t xml:space="preserve">                    }).catch(function() { showResult('\u274c \u65e0\u6cd5\u8fde\u63a5', false); });</w:t>
+        <w:br/>
+        <w:t xml:space="preserve">                }</w:t>
+        <w:br/>
+        <w:t xml:space="preserve">            });</w:t>
+        <w:br/>
+        <w:t xml:space="preserve">            item.appendChild(name);</w:t>
+        <w:br/>
+        <w:t xml:space="preserve">            if (matched) {</w:t>
+        <w:br/>
+        <w:t xml:space="preserve">                var badge = document.createElement('span');</w:t>
+      </w:r>
+    </w:p>
+    <w:p>
+      <w:pPr>
+        <w:spacing w:after="0" w:before="0"/>
+      </w:pPr>
+      <w:r>
+        <w:rPr>
+          <w:rFonts w:ascii="Consolas" w:hAnsi="Consolas"/>
+          <w:color w:val="282828"/>
+          <w:sz w:val="15"/>
+        </w:rPr>
+        <w:t xml:space="preserve">                badge.className = 'path-badge';</w:t>
+        <w:br/>
+        <w:t xml:space="preserve">                badge.textContent = '\u5728\u7ebf :' + matched.port;</w:t>
+        <w:br/>
+        <w:t xml:space="preserve">                item.appendChild(badge);</w:t>
+        <w:br/>
+        <w:t xml:space="preserve">            }</w:t>
+        <w:br/>
+        <w:t xml:space="preserve">            var del = document.createElement('span');</w:t>
+        <w:br/>
+        <w:t xml:space="preserve">            del.className = 'path-del';</w:t>
+        <w:br/>
+        <w:t xml:space="preserve">            del.textContent = '\u00d7';</w:t>
+        <w:br/>
+        <w:t xml:space="preserve">            del.addEventListener('click', function(e) {</w:t>
+        <w:br/>
+        <w:t xml:space="preserve">                e.stopPropagation();</w:t>
+        <w:br/>
+        <w:t xml:space="preserve">                getSaved(function(list) { list.splice(i, 1); savePaths(list); renderProjectList(list); });</w:t>
+        <w:br/>
+        <w:t xml:space="preserve">            });</w:t>
+        <w:br/>
+        <w:t xml:space="preserve">            item.appendChild(del);</w:t>
+        <w:br/>
+        <w:t xml:space="preserve">            projectListEl.appendChild(item);</w:t>
+        <w:br/>
+        <w:t xml:space="preserve">        });</w:t>
+        <w:br/>
+        <w:t xml:space="preserve">    }</w:t>
+        <w:br/>
+        <w:br/>
+        <w:t xml:space="preserve">    addPathBtn.addEventListener('click', function() {</w:t>
+        <w:br/>
+        <w:t xml:space="preserve">        var p = pathInput.value.trim();</w:t>
+        <w:br/>
+        <w:t xml:space="preserve">        if (!p) { showResult('\u8bf7\u8f93\u5165\u8def\u5f84', false); return; }</w:t>
+        <w:br/>
+        <w:t xml:space="preserve">        getSaved(function(list) {</w:t>
+        <w:br/>
+        <w:t xml:space="preserve">            if (list.includes(p)) { showResult('\u5df2\u5b58\u5728', false); return; }</w:t>
+        <w:br/>
+        <w:t xml:space="preserve">            list.push(p); savePaths(list); renderProjectList(list); pathInput.value = '';</w:t>
+        <w:br/>
+        <w:t xml:space="preserve">            showResult('\u5df2\u6dfb\u52a0', true);</w:t>
+        <w:br/>
+        <w:t xml:space="preserve">        });</w:t>
+        <w:br/>
+        <w:t xml:space="preserve">    });</w:t>
+        <w:br/>
+        <w:t xml:space="preserve">    pathInput.addEventListener('keydown', function(e) { if (e.key === 'Enter') addPathBtn.click(); });</w:t>
+        <w:br/>
+        <w:br/>
+        <w:t xml:space="preserve">    function loadHistory() {</w:t>
+        <w:br/>
+        <w:t xml:space="preserve">        chrome.runtime.sendMessage({ type: 'get-history' }, function(resp) {</w:t>
+        <w:br/>
+        <w:t xml:space="preserve">            if (resp &amp;&amp; resp.history) renderRecent(resp.history);</w:t>
+      </w:r>
+    </w:p>
+    <w:p>
+      <w:pPr>
+        <w:spacing w:after="0" w:before="0"/>
+      </w:pPr>
+      <w:r>
+        <w:rPr>
+          <w:rFonts w:ascii="Consolas" w:hAnsi="Consolas"/>
+          <w:color w:val="282828"/>
+          <w:sz w:val="15"/>
+        </w:rPr>
+        <w:t xml:space="preserve">        });</w:t>
+        <w:br/>
+        <w:t xml:space="preserve">    }</w:t>
+        <w:br/>
+        <w:t xml:space="preserve">    function renderRecent(items) {</w:t>
+        <w:br/>
+        <w:t xml:space="preserve">        if (!items || items.length === 0) {</w:t>
+        <w:br/>
+        <w:t xml:space="preserve">            recentList.innerHTML = '&lt;div style="color:#6c7086;font-size:11px;"&gt;\u6682\u65e0\u8bb0\u5f55&lt;/div&gt;';</w:t>
+        <w:br/>
+        <w:t xml:space="preserve">            return;</w:t>
+        <w:br/>
+        <w:t xml:space="preserve">        }</w:t>
+        <w:br/>
+        <w:t xml:space="preserve">        recentList.innerHTML = items.slice(0, 5).map(function(item) {</w:t>
+        <w:br/>
+        <w:t xml:space="preserve">            var icon = item.accepted ? '\u2705' : '\u274c';</w:t>
+        <w:br/>
+        <w:t xml:space="preserve">            var colors = { write: '#89b4fa', patch: '#fab387', delete: '#f38ba8', create: '#a6e3a1' };</w:t>
+        <w:br/>
+        <w:t xml:space="preserve">            var c = colors[item.action] || '#cdd6f4';</w:t>
+        <w:br/>
+        <w:t xml:space="preserve">            var t = (item.timeStr || '').split(' ')[1] || '';</w:t>
+        <w:br/>
+        <w:t xml:space="preserve">            return '&lt;div class="recent-item"&gt;' +</w:t>
+        <w:br/>
+        <w:t xml:space="preserve">                '&lt;span&gt;' + icon + '&lt;/span&gt;' +</w:t>
+        <w:br/>
+        <w:t xml:space="preserve">                '&lt;span style="color:' + c + ';font-size:10px;flex-shrink:0;"&gt;' + item.action + '&lt;/span&gt;' +</w:t>
+        <w:br/>
+        <w:t xml:space="preserve">                '&lt;span class="recent-file"&gt;' + item.file + '&lt;/span&gt;' +</w:t>
+        <w:br/>
+        <w:t xml:space="preserve">                '&lt;span class="recent-time"&gt;' + t + '&lt;/span&gt;&lt;/div&gt;';</w:t>
         <w:br/>
         <w:t xml:space="preserve">        }).join('');</w:t>
         <w:br/>
         <w:t xml:space="preserve">    }</w:t>
         <w:br/>
-        <w:br/>
-        <w:t xml:space="preserve">    chrome.runtime.sendMessage({ type: 'get-history' }, function(resp) {</w:t>
-        <w:br/>
-        <w:t xml:space="preserve">        if (resp &amp;&amp; resp.history) renderHistory(resp.history);</w:t>
+        <w:t xml:space="preserve">    chrome.runtime.onMessage.addListener(function(msg) {</w:t>
+        <w:br/>
+        <w:t xml:space="preserve">        if (msg.type === 'history-updated') renderRecent(msg.history);</w:t>
         <w:br/>
         <w:t xml:space="preserve">    });</w:t>
         <w:br/>
         <w:br/>
-        <w:t xml:space="preserve">    if (clearHistoryBtn) {</w:t>
-        <w:br/>
-        <w:t xml:space="preserve">        clearHistoryBtn.addEventListener('click', function() {</w:t>
-        <w:br/>
-        <w:t xml:space="preserve">            chrome.runtime.sendMessage({ type: 'clear-history' }, function() {</w:t>
-        <w:br/>
-        <w:t xml:space="preserve">                renderHistory([]);</w:t>
-        <w:br/>
-        <w:t xml:space="preserve">                showResult('\u5386\u53f2\u5df2\u6e05\u7a7a', true);</w:t>
-        <w:br/>
-        <w:t xml:space="preserve">            });</w:t>
-        <w:br/>
-        <w:t xml:space="preserve">        });</w:t>
+        <w:t xml:space="preserve">    function showResult(msg, success) {</w:t>
+        <w:br/>
+        <w:t xml:space="preserve">        resultDiv.textContent = msg;</w:t>
+        <w:br/>
+        <w:t xml:space="preserve">        resultDiv.className = success ? 'result result-success' : 'result result-error';</w:t>
+        <w:br/>
+        <w:t xml:space="preserve">        clearTimeout(resultDiv._t);</w:t>
+        <w:br/>
+        <w:t xml:space="preserve">        resultDiv._t = setTimeout(function() { resultDiv.className = 'result'; }, 4000);</w:t>
         <w:br/>
         <w:t xml:space="preserve">    }</w:t>
         <w:br/>
-        <w:br/>
-        <w:t xml:space="preserve">    chrome.runtime.onMessage.addListener(function(msg) {</w:t>
-        <w:br/>
-        <w:t xml:space="preserve">        if (msg.type === 'history-updated') renderHistory(msg.history);</w:t>
-        <w:br/>
-        <w:t xml:space="preserve">    });</w:t>
-        <w:br/>
-        <w:br/>
         <w:t>});</w:t>
-        <w:br/>
+      </w:r>
+    </w:p>
+    <w:p>
+      <w:pPr>
+        <w:spacing w:after="0" w:before="0"/>
+      </w:pPr>
+      <w:r>
+        <w:rPr>
+          <w:rFonts w:ascii="Consolas" w:hAnsi="Consolas"/>
+          <w:color w:val="282828"/>
+          <w:sz w:val="15"/>
+        </w:rPr>
       </w:r>
     </w:p>
     <w:p>
@@ -16326,7 +16032,7 @@
         <w:rPr>
           <w:sz w:val="20"/>
         </w:rPr>
-        <w:t>Total lines: 8,620</w:t>
+        <w:t>Total lines: 8,497</w:t>
       </w:r>
     </w:p>
     <w:p>
@@ -16334,7 +16040,7 @@
         <w:rPr>
           <w:sz w:val="20"/>
         </w:rPr>
-        <w:t>Export time: 2026-03-26 13:22:35</w:t>
+        <w:t>Export time: 2026-03-26 16:22:27</w:t>
       </w:r>
     </w:p>
     <w:sectPr>

</xml_diff>